<commit_message>
alteração: remoção do parágrafo 2 do resumo + atualização do modelo conceitual
</commit_message>
<xml_diff>
--- a/entrega4/docs/DOCS-ACADEMIA-UA.docx
+++ b/entrega4/docs/DOCS-ACADEMIA-UA.docx
@@ -1,6 +1,6 @@
 
 <file path=word/document.xml><?xml version="1.0" encoding="utf-8"?>
-<w:document xmlns:wpc="http://schemas.microsoft.com/office/word/2010/wordprocessingCanvas" xmlns:cx="http://schemas.microsoft.com/office/drawing/2014/chartex" xmlns:cx1="http://schemas.microsoft.com/office/drawing/2015/9/8/chartex" xmlns:cx2="http://schemas.microsoft.com/office/drawing/2015/10/21/chartex" xmlns:cx3="http://schemas.microsoft.com/office/drawing/2016/5/9/chartex" xmlns:cx4="http://schemas.microsoft.com/office/drawing/2016/5/10/chartex" xmlns:cx5="http://schemas.microsoft.com/office/drawing/2016/5/11/chartex" xmlns:cx6="http://schemas.microsoft.com/office/drawing/2016/5/12/chartex" xmlns:cx7="http://schemas.microsoft.com/office/drawing/2016/5/13/chartex" xmlns:cx8="http://schemas.microsoft.com/office/drawing/2016/5/14/chartex" xmlns:mc="http://schemas.openxmlformats.org/markup-compatibility/2006" xmlns:aink="http://schemas.microsoft.com/office/drawing/2016/ink" xmlns:am3d="http://schemas.microsoft.com/office/drawing/2017/model3d" xmlns:o="urn:schemas-microsoft-com:office:office" xmlns:r="http://schemas.openxmlformats.org/officeDocument/2006/relationships" xmlns:m="http://schemas.openxmlformats.org/officeDocument/2006/math" xmlns:v="urn:schemas-microsoft-com:vml" xmlns:wp14="http://schemas.microsoft.com/office/word/2010/wordprocessingDrawing" xmlns:wp="http://schemas.openxmlformats.org/drawingml/2006/wordprocessingDrawing" xmlns:w10="urn:schemas-microsoft-com:office:word" xmlns:w="http://schemas.openxmlformats.org/wordprocessingml/2006/main" xmlns:w14="http://schemas.microsoft.com/office/word/2010/wordml" xmlns:w15="http://schemas.microsoft.com/office/word/2012/wordml" xmlns:w16cex="http://schemas.microsoft.com/office/word/2018/wordml/cex" xmlns:w16cid="http://schemas.microsoft.com/office/word/2016/wordml/cid" xmlns:w16="http://schemas.microsoft.com/office/word/2018/wordml" xmlns:w16sdtdh="http://schemas.microsoft.com/office/word/2020/wordml/sdtdatahash" xmlns:w16se="http://schemas.microsoft.com/office/word/2015/wordml/symex" xmlns:wpg="http://schemas.microsoft.com/office/word/2010/wordprocessingGroup" xmlns:wpi="http://schemas.microsoft.com/office/word/2010/wordprocessingInk" xmlns:wne="http://schemas.microsoft.com/office/word/2006/wordml" xmlns:wps="http://schemas.microsoft.com/office/word/2010/wordprocessingShape" mc:Ignorable="w14 w15 w16se w16cid w16 w16cex w16sdtdh wp14">
+<w:document xmlns:wpc="http://schemas.microsoft.com/office/word/2010/wordprocessingCanvas" xmlns:cx="http://schemas.microsoft.com/office/drawing/2014/chartex" xmlns:cx1="http://schemas.microsoft.com/office/drawing/2015/9/8/chartex" xmlns:cx2="http://schemas.microsoft.com/office/drawing/2015/10/21/chartex" xmlns:cx3="http://schemas.microsoft.com/office/drawing/2016/5/9/chartex" xmlns:cx4="http://schemas.microsoft.com/office/drawing/2016/5/10/chartex" xmlns:cx5="http://schemas.microsoft.com/office/drawing/2016/5/11/chartex" xmlns:cx6="http://schemas.microsoft.com/office/drawing/2016/5/12/chartex" xmlns:cx7="http://schemas.microsoft.com/office/drawing/2016/5/13/chartex" xmlns:cx8="http://schemas.microsoft.com/office/drawing/2016/5/14/chartex" xmlns:mc="http://schemas.openxmlformats.org/markup-compatibility/2006" xmlns:aink="http://schemas.microsoft.com/office/drawing/2016/ink" xmlns:am3d="http://schemas.microsoft.com/office/drawing/2017/model3d" xmlns:o="urn:schemas-microsoft-com:office:office" xmlns:oel="http://schemas.microsoft.com/office/2019/extlst" xmlns:r="http://schemas.openxmlformats.org/officeDocument/2006/relationships" xmlns:m="http://schemas.openxmlformats.org/officeDocument/2006/math" xmlns:v="urn:schemas-microsoft-com:vml" xmlns:wp14="http://schemas.microsoft.com/office/word/2010/wordprocessingDrawing" xmlns:wp="http://schemas.openxmlformats.org/drawingml/2006/wordprocessingDrawing" xmlns:w10="urn:schemas-microsoft-com:office:word" xmlns:w="http://schemas.openxmlformats.org/wordprocessingml/2006/main" xmlns:w14="http://schemas.microsoft.com/office/word/2010/wordml" xmlns:w15="http://schemas.microsoft.com/office/word/2012/wordml" xmlns:w16cex="http://schemas.microsoft.com/office/word/2018/wordml/cex" xmlns:w16cid="http://schemas.microsoft.com/office/word/2016/wordml/cid" xmlns:w16="http://schemas.microsoft.com/office/word/2018/wordml" xmlns:w16du="http://schemas.microsoft.com/office/word/2023/wordml/word16du" xmlns:w16sdtdh="http://schemas.microsoft.com/office/word/2020/wordml/sdtdatahash" xmlns:w16sdtfl="http://schemas.microsoft.com/office/word/2024/wordml/sdtformatlock" xmlns:w16se="http://schemas.microsoft.com/office/word/2015/wordml/symex" xmlns:wpg="http://schemas.microsoft.com/office/word/2010/wordprocessingGroup" xmlns:wpi="http://schemas.microsoft.com/office/word/2010/wordprocessingInk" xmlns:wne="http://schemas.microsoft.com/office/word/2006/wordml" xmlns:wps="http://schemas.microsoft.com/office/word/2010/wordprocessingShape" mc:Ignorable="w14 w15 w16se w16cid w16 w16cex w16sdtdh w16sdtfl w16du wp14">
   <w:body>
     <w:p>
       <w:pPr>
@@ -120,7 +120,6 @@
           <w:docPartUnique/>
         </w:docPartObj>
       </w:sdtPr>
-      <w:sdtEndPr/>
       <w:sdtContent>
         <w:p>
           <w:pPr>
@@ -894,20 +893,6 @@
         <w:rPr>
           <w:rFonts w:ascii="Arial" w:hAnsi="Arial" w:cs="Arial"/>
         </w:rPr>
-        <w:t>Para isso, o banco de dados foi estruturado considerando as relações existentes entre alunos, planos, aulas e instrutores. Cada aluno pode estar vinculado a um plano de assinatura e participar de diferentes aulas, enquanto os instrutores são associados às atividades que ministram. Como uma mesma aula pode receber vários alunos, foi necessário estabelecer uma relação que permitisse registrar essas inscrições individualmente. Dessa forma, o sistema consegue representar não apenas os cadastros, mas também a maneira como essas informações se relacionam dentro da academia.</w:t>
-      </w:r>
-    </w:p>
-    <w:p>
-      <w:pPr>
-        <w:pStyle w:val="NormalWeb"/>
-        <w:rPr>
-          <w:rFonts w:ascii="Arial" w:hAnsi="Arial" w:cs="Arial"/>
-        </w:rPr>
-      </w:pPr>
-      <w:r>
-        <w:rPr>
-          <w:rFonts w:ascii="Arial" w:hAnsi="Arial" w:cs="Arial"/>
-        </w:rPr>
         <w:t>Outro aspecto considerado no desenvolvimento foi o acompanhamento da frequência dos alunos, permitindo registrar a data e o horário de suas entradas na academia. A organização dessas informações em tabelas relacionadas busca garantir maior consistência aos dados armazenados, utilizando identificadores únicos e referências entre os registros. Assim, o projeto procura construir uma base para o gerenciamento das atividades da academia, permitindo que, futuramente, novas funcionalidades possam ser desenvolvidas a partir da estrutura já estabelecida.</w:t>
       </w:r>
     </w:p>
@@ -961,10 +946,10 @@
           <w:noProof/>
         </w:rPr>
         <w:drawing>
-          <wp:inline distT="0" distB="0" distL="0" distR="0" wp14:anchorId="1E469D63" wp14:editId="4BC8CA1F">
-            <wp:extent cx="5400675" cy="2981325"/>
-            <wp:effectExtent l="0" t="0" r="9525" b="9525"/>
-            <wp:docPr id="4" name="Imagem 4"/>
+          <wp:inline distT="0" distB="0" distL="0" distR="0" wp14:anchorId="00020582" wp14:editId="77A00B30">
+            <wp:extent cx="5400040" cy="2978150"/>
+            <wp:effectExtent l="0" t="0" r="0" b="0"/>
+            <wp:docPr id="163658730" name="Imagem 1"/>
             <wp:cNvGraphicFramePr>
               <a:graphicFrameLocks xmlns:a="http://schemas.openxmlformats.org/drawingml/2006/main" noChangeAspect="1"/>
             </wp:cNvGraphicFramePr>
@@ -972,10 +957,8 @@
               <a:graphicData uri="http://schemas.openxmlformats.org/drawingml/2006/picture">
                 <pic:pic xmlns:pic="http://schemas.openxmlformats.org/drawingml/2006/picture">
                   <pic:nvPicPr>
-                    <pic:cNvPr id="0" name="Picture 4"/>
-                    <pic:cNvPicPr>
-                      <a:picLocks noChangeAspect="1" noChangeArrowheads="1"/>
-                    </pic:cNvPicPr>
+                    <pic:cNvPr id="163658730" name="Imagem 163658730"/>
+                    <pic:cNvPicPr/>
                   </pic:nvPicPr>
                   <pic:blipFill>
                     <a:blip r:embed="rId6">
@@ -985,23 +968,18 @@
                         </a:ext>
                       </a:extLst>
                     </a:blip>
-                    <a:srcRect/>
                     <a:stretch>
                       <a:fillRect/>
                     </a:stretch>
                   </pic:blipFill>
-                  <pic:spPr bwMode="auto">
+                  <pic:spPr>
                     <a:xfrm>
                       <a:off x="0" y="0"/>
-                      <a:ext cx="5400675" cy="2981325"/>
+                      <a:ext cx="5400040" cy="2978150"/>
                     </a:xfrm>
                     <a:prstGeom prst="rect">
                       <a:avLst/>
                     </a:prstGeom>
-                    <a:noFill/>
-                    <a:ln>
-                      <a:noFill/>
-                    </a:ln>
                   </pic:spPr>
                 </pic:pic>
               </a:graphicData>
@@ -1472,9 +1450,19 @@
           <w:sz w:val="24"/>
           <w:szCs w:val="24"/>
         </w:rPr>
-        <w:t>dt_matricula</w:t>
+        <w:t>dt_</w:t>
+      </w:r>
+      <w:proofErr w:type="gramStart"/>
+      <w:r>
+        <w:rPr>
+          <w:rFonts w:ascii="Arial" w:eastAsia="Times New Roman" w:hAnsi="Arial" w:cs="Arial"/>
+          <w:sz w:val="24"/>
+          <w:szCs w:val="24"/>
+        </w:rPr>
+        <w:t>matricula</w:t>
       </w:r>
       <w:proofErr w:type="spellEnd"/>
+      <w:proofErr w:type="gramEnd"/>
       <w:r>
         <w:rPr>
           <w:rFonts w:ascii="Arial" w:eastAsia="Times New Roman" w:hAnsi="Arial" w:cs="Arial"/>
@@ -2009,87 +1997,16 @@
               <w:spacing w:after="40"/>
               <w:rPr>
                 <w:rFonts w:ascii="Arial" w:hAnsi="Arial" w:cs="Arial"/>
-              </w:rPr>
-            </w:pPr>
-            <w:proofErr w:type="spellStart"/>
-            <w:r>
-              <w:rPr>
-                <w:rFonts w:ascii="Arial" w:hAnsi="Arial" w:cs="Arial"/>
-                <w:sz w:val="16"/>
-              </w:rPr>
-              <w:t>Identificador</w:t>
-            </w:r>
-            <w:proofErr w:type="spellEnd"/>
-            <w:r>
-              <w:rPr>
-                <w:rFonts w:ascii="Arial" w:hAnsi="Arial" w:cs="Arial"/>
-                <w:sz w:val="16"/>
-              </w:rPr>
-              <w:t xml:space="preserve"> </w:t>
-            </w:r>
-            <w:proofErr w:type="spellStart"/>
-            <w:r>
-              <w:rPr>
-                <w:rFonts w:ascii="Arial" w:hAnsi="Arial" w:cs="Arial"/>
-                <w:sz w:val="16"/>
-              </w:rPr>
-              <w:t>único</w:t>
-            </w:r>
-            <w:proofErr w:type="spellEnd"/>
-            <w:r>
-              <w:rPr>
-                <w:rFonts w:ascii="Arial" w:hAnsi="Arial" w:cs="Arial"/>
-                <w:sz w:val="16"/>
-              </w:rPr>
-              <w:t xml:space="preserve"> do </w:t>
-            </w:r>
-            <w:proofErr w:type="spellStart"/>
-            <w:r>
-              <w:rPr>
-                <w:rFonts w:ascii="Arial" w:hAnsi="Arial" w:cs="Arial"/>
-                <w:sz w:val="16"/>
-              </w:rPr>
-              <w:t>instrutor</w:t>
-            </w:r>
-            <w:proofErr w:type="spellEnd"/>
-            <w:r>
-              <w:rPr>
-                <w:rFonts w:ascii="Arial" w:hAnsi="Arial" w:cs="Arial"/>
-                <w:sz w:val="16"/>
-              </w:rPr>
-              <w:t xml:space="preserve">, </w:t>
-            </w:r>
-            <w:proofErr w:type="spellStart"/>
-            <w:r>
-              <w:rPr>
-                <w:rFonts w:ascii="Arial" w:hAnsi="Arial" w:cs="Arial"/>
-                <w:sz w:val="16"/>
-              </w:rPr>
-              <w:t>gerado</w:t>
-            </w:r>
-            <w:proofErr w:type="spellEnd"/>
-            <w:r>
-              <w:rPr>
-                <w:rFonts w:ascii="Arial" w:hAnsi="Arial" w:cs="Arial"/>
-                <w:sz w:val="16"/>
-              </w:rPr>
-              <w:t xml:space="preserve"> </w:t>
-            </w:r>
-            <w:proofErr w:type="spellStart"/>
-            <w:r>
-              <w:rPr>
-                <w:rFonts w:ascii="Arial" w:hAnsi="Arial" w:cs="Arial"/>
-                <w:sz w:val="16"/>
-              </w:rPr>
-              <w:t>automaticamente</w:t>
-            </w:r>
-            <w:proofErr w:type="spellEnd"/>
-            <w:r>
-              <w:rPr>
-                <w:rFonts w:ascii="Arial" w:hAnsi="Arial" w:cs="Arial"/>
-                <w:sz w:val="16"/>
-              </w:rPr>
-              <w:t>.</w:t>
+                <w:lang w:val="pt-BR"/>
+              </w:rPr>
+            </w:pPr>
+            <w:r>
+              <w:rPr>
+                <w:rFonts w:ascii="Arial" w:hAnsi="Arial" w:cs="Arial"/>
+                <w:sz w:val="16"/>
+                <w:lang w:val="pt-BR"/>
+              </w:rPr>
+              <w:t>Identificador único do instrutor, gerado automaticamente.</w:t>
             </w:r>
           </w:p>
         </w:tc>
@@ -2346,62 +2263,16 @@
               <w:spacing w:after="40"/>
               <w:rPr>
                 <w:rFonts w:ascii="Arial" w:hAnsi="Arial" w:cs="Arial"/>
-              </w:rPr>
-            </w:pPr>
-            <w:r>
-              <w:rPr>
-                <w:rFonts w:ascii="Arial" w:hAnsi="Arial" w:cs="Arial"/>
-                <w:sz w:val="16"/>
-              </w:rPr>
-              <w:t xml:space="preserve">CPF do </w:t>
-            </w:r>
-            <w:proofErr w:type="spellStart"/>
-            <w:r>
-              <w:rPr>
-                <w:rFonts w:ascii="Arial" w:hAnsi="Arial" w:cs="Arial"/>
-                <w:sz w:val="16"/>
-              </w:rPr>
-              <w:t>instrutor</w:t>
-            </w:r>
-            <w:proofErr w:type="spellEnd"/>
-            <w:r>
-              <w:rPr>
-                <w:rFonts w:ascii="Arial" w:hAnsi="Arial" w:cs="Arial"/>
-                <w:sz w:val="16"/>
-              </w:rPr>
-              <w:t xml:space="preserve">, </w:t>
-            </w:r>
-            <w:proofErr w:type="spellStart"/>
-            <w:r>
-              <w:rPr>
-                <w:rFonts w:ascii="Arial" w:hAnsi="Arial" w:cs="Arial"/>
-                <w:sz w:val="16"/>
-              </w:rPr>
-              <w:t>sem</w:t>
-            </w:r>
-            <w:proofErr w:type="spellEnd"/>
-            <w:r>
-              <w:rPr>
-                <w:rFonts w:ascii="Arial" w:hAnsi="Arial" w:cs="Arial"/>
-                <w:sz w:val="16"/>
-              </w:rPr>
-              <w:t xml:space="preserve"> </w:t>
-            </w:r>
-            <w:proofErr w:type="spellStart"/>
-            <w:r>
-              <w:rPr>
-                <w:rFonts w:ascii="Arial" w:hAnsi="Arial" w:cs="Arial"/>
-                <w:sz w:val="16"/>
-              </w:rPr>
-              <w:t>pontuação</w:t>
-            </w:r>
-            <w:proofErr w:type="spellEnd"/>
-            <w:r>
-              <w:rPr>
-                <w:rFonts w:ascii="Arial" w:hAnsi="Arial" w:cs="Arial"/>
-                <w:sz w:val="16"/>
-              </w:rPr>
-              <w:t>.</w:t>
+                <w:lang w:val="pt-BR"/>
+              </w:rPr>
+            </w:pPr>
+            <w:r>
+              <w:rPr>
+                <w:rFonts w:ascii="Arial" w:hAnsi="Arial" w:cs="Arial"/>
+                <w:sz w:val="16"/>
+                <w:lang w:val="pt-BR"/>
+              </w:rPr>
+              <w:t>CPF do instrutor, sem pontuação.</w:t>
             </w:r>
           </w:p>
         </w:tc>
@@ -2518,71 +2389,16 @@
               <w:spacing w:after="40"/>
               <w:rPr>
                 <w:rFonts w:ascii="Arial" w:hAnsi="Arial" w:cs="Arial"/>
-              </w:rPr>
-            </w:pPr>
-            <w:proofErr w:type="spellStart"/>
-            <w:r>
-              <w:rPr>
-                <w:rFonts w:ascii="Arial" w:hAnsi="Arial" w:cs="Arial"/>
-                <w:sz w:val="16"/>
-              </w:rPr>
-              <w:t>Telefone</w:t>
-            </w:r>
-            <w:proofErr w:type="spellEnd"/>
-            <w:r>
-              <w:rPr>
-                <w:rFonts w:ascii="Arial" w:hAnsi="Arial" w:cs="Arial"/>
-                <w:sz w:val="16"/>
-              </w:rPr>
-              <w:t xml:space="preserve"> de </w:t>
-            </w:r>
-            <w:proofErr w:type="spellStart"/>
-            <w:r>
-              <w:rPr>
-                <w:rFonts w:ascii="Arial" w:hAnsi="Arial" w:cs="Arial"/>
-                <w:sz w:val="16"/>
-              </w:rPr>
-              <w:t>contato</w:t>
-            </w:r>
-            <w:proofErr w:type="spellEnd"/>
-            <w:r>
-              <w:rPr>
-                <w:rFonts w:ascii="Arial" w:hAnsi="Arial" w:cs="Arial"/>
-                <w:sz w:val="16"/>
-              </w:rPr>
-              <w:t xml:space="preserve">, </w:t>
-            </w:r>
-            <w:proofErr w:type="spellStart"/>
-            <w:r>
-              <w:rPr>
-                <w:rFonts w:ascii="Arial" w:hAnsi="Arial" w:cs="Arial"/>
-                <w:sz w:val="16"/>
-              </w:rPr>
-              <w:t>sem</w:t>
-            </w:r>
-            <w:proofErr w:type="spellEnd"/>
-            <w:r>
-              <w:rPr>
-                <w:rFonts w:ascii="Arial" w:hAnsi="Arial" w:cs="Arial"/>
-                <w:sz w:val="16"/>
-              </w:rPr>
-              <w:t xml:space="preserve"> </w:t>
-            </w:r>
-            <w:proofErr w:type="spellStart"/>
-            <w:r>
-              <w:rPr>
-                <w:rFonts w:ascii="Arial" w:hAnsi="Arial" w:cs="Arial"/>
-                <w:sz w:val="16"/>
-              </w:rPr>
-              <w:t>formatação</w:t>
-            </w:r>
-            <w:proofErr w:type="spellEnd"/>
-            <w:r>
-              <w:rPr>
-                <w:rFonts w:ascii="Arial" w:hAnsi="Arial" w:cs="Arial"/>
-                <w:sz w:val="16"/>
-              </w:rPr>
-              <w:t>.</w:t>
+                <w:lang w:val="pt-BR"/>
+              </w:rPr>
+            </w:pPr>
+            <w:r>
+              <w:rPr>
+                <w:rFonts w:ascii="Arial" w:hAnsi="Arial" w:cs="Arial"/>
+                <w:sz w:val="16"/>
+                <w:lang w:val="pt-BR"/>
+              </w:rPr>
+              <w:t>Telefone de contato, sem formatação.</w:t>
             </w:r>
           </w:p>
         </w:tc>
@@ -2855,71 +2671,16 @@
               <w:spacing w:after="40"/>
               <w:rPr>
                 <w:rFonts w:ascii="Arial" w:hAnsi="Arial" w:cs="Arial"/>
-              </w:rPr>
-            </w:pPr>
-            <w:proofErr w:type="spellStart"/>
-            <w:r>
-              <w:rPr>
-                <w:rFonts w:ascii="Arial" w:hAnsi="Arial" w:cs="Arial"/>
-                <w:sz w:val="16"/>
-              </w:rPr>
-              <w:t>Horário</w:t>
-            </w:r>
-            <w:proofErr w:type="spellEnd"/>
-            <w:r>
-              <w:rPr>
-                <w:rFonts w:ascii="Arial" w:hAnsi="Arial" w:cs="Arial"/>
-                <w:sz w:val="16"/>
-              </w:rPr>
-              <w:t xml:space="preserve"> de </w:t>
-            </w:r>
-            <w:proofErr w:type="spellStart"/>
-            <w:r>
-              <w:rPr>
-                <w:rFonts w:ascii="Arial" w:hAnsi="Arial" w:cs="Arial"/>
-                <w:sz w:val="16"/>
-              </w:rPr>
-              <w:t>trabalho</w:t>
-            </w:r>
-            <w:proofErr w:type="spellEnd"/>
-            <w:r>
-              <w:rPr>
-                <w:rFonts w:ascii="Arial" w:hAnsi="Arial" w:cs="Arial"/>
-                <w:sz w:val="16"/>
-              </w:rPr>
-              <w:t xml:space="preserve"> </w:t>
-            </w:r>
-            <w:proofErr w:type="spellStart"/>
-            <w:r>
-              <w:rPr>
-                <w:rFonts w:ascii="Arial" w:hAnsi="Arial" w:cs="Arial"/>
-                <w:sz w:val="16"/>
-              </w:rPr>
-              <w:t>registrado</w:t>
-            </w:r>
-            <w:proofErr w:type="spellEnd"/>
-            <w:r>
-              <w:rPr>
-                <w:rFonts w:ascii="Arial" w:hAnsi="Arial" w:cs="Arial"/>
-                <w:sz w:val="16"/>
-              </w:rPr>
-              <w:t xml:space="preserve"> para o </w:t>
-            </w:r>
-            <w:proofErr w:type="spellStart"/>
-            <w:r>
-              <w:rPr>
-                <w:rFonts w:ascii="Arial" w:hAnsi="Arial" w:cs="Arial"/>
-                <w:sz w:val="16"/>
-              </w:rPr>
-              <w:t>instrutor</w:t>
-            </w:r>
-            <w:proofErr w:type="spellEnd"/>
-            <w:r>
-              <w:rPr>
-                <w:rFonts w:ascii="Arial" w:hAnsi="Arial" w:cs="Arial"/>
-                <w:sz w:val="16"/>
-              </w:rPr>
-              <w:t>.</w:t>
+                <w:lang w:val="pt-BR"/>
+              </w:rPr>
+            </w:pPr>
+            <w:r>
+              <w:rPr>
+                <w:rFonts w:ascii="Arial" w:hAnsi="Arial" w:cs="Arial"/>
+                <w:sz w:val="16"/>
+                <w:lang w:val="pt-BR"/>
+              </w:rPr>
+              <w:t>Horário de trabalho registrado para o instrutor.</w:t>
             </w:r>
           </w:p>
         </w:tc>
@@ -3218,87 +2979,16 @@
               <w:spacing w:after="40"/>
               <w:rPr>
                 <w:rFonts w:ascii="Arial" w:hAnsi="Arial" w:cs="Arial"/>
-              </w:rPr>
-            </w:pPr>
-            <w:proofErr w:type="spellStart"/>
-            <w:r>
-              <w:rPr>
-                <w:rFonts w:ascii="Arial" w:hAnsi="Arial" w:cs="Arial"/>
-                <w:sz w:val="16"/>
-              </w:rPr>
-              <w:t>Identificador</w:t>
-            </w:r>
-            <w:proofErr w:type="spellEnd"/>
-            <w:r>
-              <w:rPr>
-                <w:rFonts w:ascii="Arial" w:hAnsi="Arial" w:cs="Arial"/>
-                <w:sz w:val="16"/>
-              </w:rPr>
-              <w:t xml:space="preserve"> </w:t>
-            </w:r>
-            <w:proofErr w:type="spellStart"/>
-            <w:r>
-              <w:rPr>
-                <w:rFonts w:ascii="Arial" w:hAnsi="Arial" w:cs="Arial"/>
-                <w:sz w:val="16"/>
-              </w:rPr>
-              <w:t>único</w:t>
-            </w:r>
-            <w:proofErr w:type="spellEnd"/>
-            <w:r>
-              <w:rPr>
-                <w:rFonts w:ascii="Arial" w:hAnsi="Arial" w:cs="Arial"/>
-                <w:sz w:val="16"/>
-              </w:rPr>
-              <w:t xml:space="preserve"> do </w:t>
-            </w:r>
-            <w:proofErr w:type="spellStart"/>
-            <w:r>
-              <w:rPr>
-                <w:rFonts w:ascii="Arial" w:hAnsi="Arial" w:cs="Arial"/>
-                <w:sz w:val="16"/>
-              </w:rPr>
-              <w:t>plano</w:t>
-            </w:r>
-            <w:proofErr w:type="spellEnd"/>
-            <w:r>
-              <w:rPr>
-                <w:rFonts w:ascii="Arial" w:hAnsi="Arial" w:cs="Arial"/>
-                <w:sz w:val="16"/>
-              </w:rPr>
-              <w:t xml:space="preserve">, </w:t>
-            </w:r>
-            <w:proofErr w:type="spellStart"/>
-            <w:r>
-              <w:rPr>
-                <w:rFonts w:ascii="Arial" w:hAnsi="Arial" w:cs="Arial"/>
-                <w:sz w:val="16"/>
-              </w:rPr>
-              <w:t>gerado</w:t>
-            </w:r>
-            <w:proofErr w:type="spellEnd"/>
-            <w:r>
-              <w:rPr>
-                <w:rFonts w:ascii="Arial" w:hAnsi="Arial" w:cs="Arial"/>
-                <w:sz w:val="16"/>
-              </w:rPr>
-              <w:t xml:space="preserve"> </w:t>
-            </w:r>
-            <w:proofErr w:type="spellStart"/>
-            <w:r>
-              <w:rPr>
-                <w:rFonts w:ascii="Arial" w:hAnsi="Arial" w:cs="Arial"/>
-                <w:sz w:val="16"/>
-              </w:rPr>
-              <w:t>automaticamente</w:t>
-            </w:r>
-            <w:proofErr w:type="spellEnd"/>
-            <w:r>
-              <w:rPr>
-                <w:rFonts w:ascii="Arial" w:hAnsi="Arial" w:cs="Arial"/>
-                <w:sz w:val="16"/>
-              </w:rPr>
-              <w:t>.</w:t>
+                <w:lang w:val="pt-BR"/>
+              </w:rPr>
+            </w:pPr>
+            <w:r>
+              <w:rPr>
+                <w:rFonts w:ascii="Arial" w:hAnsi="Arial" w:cs="Arial"/>
+                <w:sz w:val="16"/>
+                <w:lang w:val="pt-BR"/>
+              </w:rPr>
+              <w:t>Identificador único do plano, gerado automaticamente.</w:t>
             </w:r>
           </w:p>
         </w:tc>
@@ -3422,23 +3112,7 @@
                 <w:rFonts w:ascii="Arial" w:hAnsi="Arial" w:cs="Arial"/>
                 <w:sz w:val="16"/>
               </w:rPr>
-              <w:t xml:space="preserve">Nome do </w:t>
-            </w:r>
-            <w:proofErr w:type="spellStart"/>
-            <w:r>
-              <w:rPr>
-                <w:rFonts w:ascii="Arial" w:hAnsi="Arial" w:cs="Arial"/>
-                <w:sz w:val="16"/>
-              </w:rPr>
-              <w:t>plano</w:t>
-            </w:r>
-            <w:proofErr w:type="spellEnd"/>
-            <w:r>
-              <w:rPr>
-                <w:rFonts w:ascii="Arial" w:hAnsi="Arial" w:cs="Arial"/>
-                <w:sz w:val="16"/>
-              </w:rPr>
-              <w:t>.</w:t>
+              <w:t>Nome do plano.</w:t>
             </w:r>
           </w:p>
         </w:tc>
@@ -3571,23 +3245,7 @@
                 <w:rFonts w:ascii="Arial" w:hAnsi="Arial" w:cs="Arial"/>
                 <w:sz w:val="16"/>
               </w:rPr>
-              <w:t xml:space="preserve"> do </w:t>
-            </w:r>
-            <w:proofErr w:type="spellStart"/>
-            <w:r>
-              <w:rPr>
-                <w:rFonts w:ascii="Arial" w:hAnsi="Arial" w:cs="Arial"/>
-                <w:sz w:val="16"/>
-              </w:rPr>
-              <w:t>plano</w:t>
-            </w:r>
-            <w:proofErr w:type="spellEnd"/>
-            <w:r>
-              <w:rPr>
-                <w:rFonts w:ascii="Arial" w:hAnsi="Arial" w:cs="Arial"/>
-                <w:sz w:val="16"/>
-              </w:rPr>
-              <w:t>.</w:t>
+              <w:t xml:space="preserve"> do plano.</w:t>
             </w:r>
           </w:p>
         </w:tc>
@@ -3704,62 +3362,16 @@
               <w:spacing w:after="40"/>
               <w:rPr>
                 <w:rFonts w:ascii="Arial" w:hAnsi="Arial" w:cs="Arial"/>
-              </w:rPr>
-            </w:pPr>
-            <w:r>
-              <w:rPr>
-                <w:rFonts w:ascii="Arial" w:hAnsi="Arial" w:cs="Arial"/>
-                <w:sz w:val="16"/>
-              </w:rPr>
-              <w:t xml:space="preserve">Valor mensal </w:t>
-            </w:r>
-            <w:proofErr w:type="spellStart"/>
-            <w:r>
-              <w:rPr>
-                <w:rFonts w:ascii="Arial" w:hAnsi="Arial" w:cs="Arial"/>
-                <w:sz w:val="16"/>
-              </w:rPr>
-              <w:t>cobrado</w:t>
-            </w:r>
-            <w:proofErr w:type="spellEnd"/>
-            <w:r>
-              <w:rPr>
-                <w:rFonts w:ascii="Arial" w:hAnsi="Arial" w:cs="Arial"/>
-                <w:sz w:val="16"/>
-              </w:rPr>
-              <w:t xml:space="preserve"> </w:t>
-            </w:r>
-            <w:proofErr w:type="spellStart"/>
-            <w:r>
-              <w:rPr>
-                <w:rFonts w:ascii="Arial" w:hAnsi="Arial" w:cs="Arial"/>
-                <w:sz w:val="16"/>
-              </w:rPr>
-              <w:t>pelo</w:t>
-            </w:r>
-            <w:proofErr w:type="spellEnd"/>
-            <w:r>
-              <w:rPr>
-                <w:rFonts w:ascii="Arial" w:hAnsi="Arial" w:cs="Arial"/>
-                <w:sz w:val="16"/>
-              </w:rPr>
-              <w:t xml:space="preserve"> </w:t>
-            </w:r>
-            <w:proofErr w:type="spellStart"/>
-            <w:r>
-              <w:rPr>
-                <w:rFonts w:ascii="Arial" w:hAnsi="Arial" w:cs="Arial"/>
-                <w:sz w:val="16"/>
-              </w:rPr>
-              <w:t>plano</w:t>
-            </w:r>
-            <w:proofErr w:type="spellEnd"/>
-            <w:r>
-              <w:rPr>
-                <w:rFonts w:ascii="Arial" w:hAnsi="Arial" w:cs="Arial"/>
-                <w:sz w:val="16"/>
-              </w:rPr>
-              <w:t>.</w:t>
+                <w:lang w:val="pt-BR"/>
+              </w:rPr>
+            </w:pPr>
+            <w:r>
+              <w:rPr>
+                <w:rFonts w:ascii="Arial" w:hAnsi="Arial" w:cs="Arial"/>
+                <w:sz w:val="16"/>
+                <w:lang w:val="pt-BR"/>
+              </w:rPr>
+              <w:t>Valor mensal cobrado pelo plano.</w:t>
             </w:r>
           </w:p>
         </w:tc>
@@ -3876,71 +3488,16 @@
               <w:spacing w:after="40"/>
               <w:rPr>
                 <w:rFonts w:ascii="Arial" w:hAnsi="Arial" w:cs="Arial"/>
-              </w:rPr>
-            </w:pPr>
-            <w:proofErr w:type="spellStart"/>
-            <w:r>
-              <w:rPr>
-                <w:rFonts w:ascii="Arial" w:hAnsi="Arial" w:cs="Arial"/>
-                <w:sz w:val="16"/>
-              </w:rPr>
-              <w:t>Duração</w:t>
-            </w:r>
-            <w:proofErr w:type="spellEnd"/>
-            <w:r>
-              <w:rPr>
-                <w:rFonts w:ascii="Arial" w:hAnsi="Arial" w:cs="Arial"/>
-                <w:sz w:val="16"/>
-              </w:rPr>
-              <w:t xml:space="preserve"> do </w:t>
-            </w:r>
-            <w:proofErr w:type="spellStart"/>
-            <w:r>
-              <w:rPr>
-                <w:rFonts w:ascii="Arial" w:hAnsi="Arial" w:cs="Arial"/>
-                <w:sz w:val="16"/>
-              </w:rPr>
-              <w:t>plano</w:t>
-            </w:r>
-            <w:proofErr w:type="spellEnd"/>
-            <w:r>
-              <w:rPr>
-                <w:rFonts w:ascii="Arial" w:hAnsi="Arial" w:cs="Arial"/>
-                <w:sz w:val="16"/>
-              </w:rPr>
-              <w:t xml:space="preserve">, </w:t>
-            </w:r>
-            <w:proofErr w:type="spellStart"/>
-            <w:r>
-              <w:rPr>
-                <w:rFonts w:ascii="Arial" w:hAnsi="Arial" w:cs="Arial"/>
-                <w:sz w:val="16"/>
-              </w:rPr>
-              <w:t>conforme</w:t>
-            </w:r>
-            <w:proofErr w:type="spellEnd"/>
-            <w:r>
-              <w:rPr>
-                <w:rFonts w:ascii="Arial" w:hAnsi="Arial" w:cs="Arial"/>
-                <w:sz w:val="16"/>
-              </w:rPr>
-              <w:t xml:space="preserve"> </w:t>
-            </w:r>
-            <w:proofErr w:type="spellStart"/>
-            <w:r>
-              <w:rPr>
-                <w:rFonts w:ascii="Arial" w:hAnsi="Arial" w:cs="Arial"/>
-                <w:sz w:val="16"/>
-              </w:rPr>
-              <w:t>cadastro</w:t>
-            </w:r>
-            <w:proofErr w:type="spellEnd"/>
-            <w:r>
-              <w:rPr>
-                <w:rFonts w:ascii="Arial" w:hAnsi="Arial" w:cs="Arial"/>
-                <w:sz w:val="16"/>
-              </w:rPr>
-              <w:t>.</w:t>
+                <w:lang w:val="pt-BR"/>
+              </w:rPr>
+            </w:pPr>
+            <w:r>
+              <w:rPr>
+                <w:rFonts w:ascii="Arial" w:hAnsi="Arial" w:cs="Arial"/>
+                <w:sz w:val="16"/>
+                <w:lang w:val="pt-BR"/>
+              </w:rPr>
+              <w:t>Duração do plano, conforme cadastro.</w:t>
             </w:r>
           </w:p>
         </w:tc>
@@ -4105,23 +3662,7 @@
                 <w:rFonts w:ascii="Arial" w:hAnsi="Arial" w:cs="Arial"/>
                 <w:sz w:val="16"/>
               </w:rPr>
-              <w:t xml:space="preserve"> </w:t>
-            </w:r>
-            <w:proofErr w:type="spellStart"/>
-            <w:r>
-              <w:rPr>
-                <w:rFonts w:ascii="Arial" w:hAnsi="Arial" w:cs="Arial"/>
-                <w:sz w:val="16"/>
-              </w:rPr>
-              <w:t>plano</w:t>
-            </w:r>
-            <w:proofErr w:type="spellEnd"/>
-            <w:r>
-              <w:rPr>
-                <w:rFonts w:ascii="Arial" w:hAnsi="Arial" w:cs="Arial"/>
-                <w:sz w:val="16"/>
-              </w:rPr>
-              <w:t>.</w:t>
+              <w:t xml:space="preserve"> plano.</w:t>
             </w:r>
           </w:p>
         </w:tc>
@@ -4428,71 +3969,16 @@
               <w:spacing w:after="40"/>
               <w:rPr>
                 <w:rFonts w:ascii="Arial" w:hAnsi="Arial" w:cs="Arial"/>
-              </w:rPr>
-            </w:pPr>
-            <w:proofErr w:type="spellStart"/>
-            <w:r>
-              <w:rPr>
-                <w:rFonts w:ascii="Arial" w:hAnsi="Arial" w:cs="Arial"/>
-                <w:sz w:val="16"/>
-              </w:rPr>
-              <w:t>Identificador</w:t>
-            </w:r>
-            <w:proofErr w:type="spellEnd"/>
-            <w:r>
-              <w:rPr>
-                <w:rFonts w:ascii="Arial" w:hAnsi="Arial" w:cs="Arial"/>
-                <w:sz w:val="16"/>
-              </w:rPr>
-              <w:t xml:space="preserve"> </w:t>
-            </w:r>
-            <w:proofErr w:type="spellStart"/>
-            <w:r>
-              <w:rPr>
-                <w:rFonts w:ascii="Arial" w:hAnsi="Arial" w:cs="Arial"/>
-                <w:sz w:val="16"/>
-              </w:rPr>
-              <w:t>único</w:t>
-            </w:r>
-            <w:proofErr w:type="spellEnd"/>
-            <w:r>
-              <w:rPr>
-                <w:rFonts w:ascii="Arial" w:hAnsi="Arial" w:cs="Arial"/>
-                <w:sz w:val="16"/>
-              </w:rPr>
-              <w:t xml:space="preserve"> da aula, </w:t>
-            </w:r>
-            <w:proofErr w:type="spellStart"/>
-            <w:r>
-              <w:rPr>
-                <w:rFonts w:ascii="Arial" w:hAnsi="Arial" w:cs="Arial"/>
-                <w:sz w:val="16"/>
-              </w:rPr>
-              <w:t>gerado</w:t>
-            </w:r>
-            <w:proofErr w:type="spellEnd"/>
-            <w:r>
-              <w:rPr>
-                <w:rFonts w:ascii="Arial" w:hAnsi="Arial" w:cs="Arial"/>
-                <w:sz w:val="16"/>
-              </w:rPr>
-              <w:t xml:space="preserve"> </w:t>
-            </w:r>
-            <w:proofErr w:type="spellStart"/>
-            <w:r>
-              <w:rPr>
-                <w:rFonts w:ascii="Arial" w:hAnsi="Arial" w:cs="Arial"/>
-                <w:sz w:val="16"/>
-              </w:rPr>
-              <w:t>automaticamente</w:t>
-            </w:r>
-            <w:proofErr w:type="spellEnd"/>
-            <w:r>
-              <w:rPr>
-                <w:rFonts w:ascii="Arial" w:hAnsi="Arial" w:cs="Arial"/>
-                <w:sz w:val="16"/>
-              </w:rPr>
-              <w:t>.</w:t>
+                <w:lang w:val="pt-BR"/>
+              </w:rPr>
+            </w:pPr>
+            <w:r>
+              <w:rPr>
+                <w:rFonts w:ascii="Arial" w:hAnsi="Arial" w:cs="Arial"/>
+                <w:sz w:val="16"/>
+                <w:lang w:val="pt-BR"/>
+              </w:rPr>
+              <w:t>Identificador único da aula, gerado automaticamente.</w:t>
             </w:r>
           </w:p>
         </w:tc>
@@ -4857,71 +4343,16 @@
               <w:spacing w:after="40"/>
               <w:rPr>
                 <w:rFonts w:ascii="Arial" w:hAnsi="Arial" w:cs="Arial"/>
-              </w:rPr>
-            </w:pPr>
-            <w:proofErr w:type="spellStart"/>
-            <w:r>
-              <w:rPr>
-                <w:rFonts w:ascii="Arial" w:hAnsi="Arial" w:cs="Arial"/>
-                <w:sz w:val="16"/>
-              </w:rPr>
-              <w:t>Capacidade</w:t>
-            </w:r>
-            <w:proofErr w:type="spellEnd"/>
-            <w:r>
-              <w:rPr>
-                <w:rFonts w:ascii="Arial" w:hAnsi="Arial" w:cs="Arial"/>
-                <w:sz w:val="16"/>
-              </w:rPr>
-              <w:t xml:space="preserve"> </w:t>
-            </w:r>
-            <w:proofErr w:type="spellStart"/>
-            <w:r>
-              <w:rPr>
-                <w:rFonts w:ascii="Arial" w:hAnsi="Arial" w:cs="Arial"/>
-                <w:sz w:val="16"/>
-              </w:rPr>
-              <w:t>máxima</w:t>
-            </w:r>
-            <w:proofErr w:type="spellEnd"/>
-            <w:r>
-              <w:rPr>
-                <w:rFonts w:ascii="Arial" w:hAnsi="Arial" w:cs="Arial"/>
-                <w:sz w:val="16"/>
-              </w:rPr>
-              <w:t xml:space="preserve"> </w:t>
-            </w:r>
-            <w:proofErr w:type="spellStart"/>
-            <w:r>
-              <w:rPr>
-                <w:rFonts w:ascii="Arial" w:hAnsi="Arial" w:cs="Arial"/>
-                <w:sz w:val="16"/>
-              </w:rPr>
-              <w:t>cadastrada</w:t>
-            </w:r>
-            <w:proofErr w:type="spellEnd"/>
-            <w:r>
-              <w:rPr>
-                <w:rFonts w:ascii="Arial" w:hAnsi="Arial" w:cs="Arial"/>
-                <w:sz w:val="16"/>
-              </w:rPr>
-              <w:t xml:space="preserve"> para </w:t>
-            </w:r>
-            <w:proofErr w:type="gramStart"/>
-            <w:r>
-              <w:rPr>
-                <w:rFonts w:ascii="Arial" w:hAnsi="Arial" w:cs="Arial"/>
-                <w:sz w:val="16"/>
-              </w:rPr>
-              <w:t>a</w:t>
-            </w:r>
-            <w:proofErr w:type="gramEnd"/>
-            <w:r>
-              <w:rPr>
-                <w:rFonts w:ascii="Arial" w:hAnsi="Arial" w:cs="Arial"/>
-                <w:sz w:val="16"/>
-              </w:rPr>
-              <w:t xml:space="preserve"> aula.</w:t>
+                <w:lang w:val="pt-BR"/>
+              </w:rPr>
+            </w:pPr>
+            <w:r>
+              <w:rPr>
+                <w:rFonts w:ascii="Arial" w:hAnsi="Arial" w:cs="Arial"/>
+                <w:sz w:val="16"/>
+                <w:lang w:val="pt-BR"/>
+              </w:rPr>
+              <w:t>Capacidade máxima cadastrada para a aula.</w:t>
             </w:r>
           </w:p>
         </w:tc>
@@ -5185,55 +4616,16 @@
               <w:spacing w:after="40"/>
               <w:rPr>
                 <w:rFonts w:ascii="Arial" w:hAnsi="Arial" w:cs="Arial"/>
-              </w:rPr>
-            </w:pPr>
-            <w:proofErr w:type="spellStart"/>
-            <w:r>
-              <w:rPr>
-                <w:rFonts w:ascii="Arial" w:hAnsi="Arial" w:cs="Arial"/>
-                <w:sz w:val="16"/>
-              </w:rPr>
-              <w:t>Identifica</w:t>
-            </w:r>
-            <w:proofErr w:type="spellEnd"/>
-            <w:r>
-              <w:rPr>
-                <w:rFonts w:ascii="Arial" w:hAnsi="Arial" w:cs="Arial"/>
-                <w:sz w:val="16"/>
-              </w:rPr>
-              <w:t xml:space="preserve"> o </w:t>
-            </w:r>
-            <w:proofErr w:type="spellStart"/>
-            <w:r>
-              <w:rPr>
-                <w:rFonts w:ascii="Arial" w:hAnsi="Arial" w:cs="Arial"/>
-                <w:sz w:val="16"/>
-              </w:rPr>
-              <w:t>instrutor</w:t>
-            </w:r>
-            <w:proofErr w:type="spellEnd"/>
-            <w:r>
-              <w:rPr>
-                <w:rFonts w:ascii="Arial" w:hAnsi="Arial" w:cs="Arial"/>
-                <w:sz w:val="16"/>
-              </w:rPr>
-              <w:t xml:space="preserve"> </w:t>
-            </w:r>
-            <w:proofErr w:type="spellStart"/>
-            <w:r>
-              <w:rPr>
-                <w:rFonts w:ascii="Arial" w:hAnsi="Arial" w:cs="Arial"/>
-                <w:sz w:val="16"/>
-              </w:rPr>
-              <w:t>associado</w:t>
-            </w:r>
-            <w:proofErr w:type="spellEnd"/>
-            <w:r>
-              <w:rPr>
-                <w:rFonts w:ascii="Arial" w:hAnsi="Arial" w:cs="Arial"/>
-                <w:sz w:val="16"/>
-              </w:rPr>
-              <w:t xml:space="preserve"> à aula.</w:t>
+                <w:lang w:val="pt-BR"/>
+              </w:rPr>
+            </w:pPr>
+            <w:r>
+              <w:rPr>
+                <w:rFonts w:ascii="Arial" w:hAnsi="Arial" w:cs="Arial"/>
+                <w:sz w:val="16"/>
+                <w:lang w:val="pt-BR"/>
+              </w:rPr>
+              <w:t>Identifica o instrutor associado à aula.</w:t>
             </w:r>
           </w:p>
         </w:tc>
@@ -5530,87 +4922,16 @@
               <w:spacing w:after="40"/>
               <w:rPr>
                 <w:rFonts w:ascii="Arial" w:hAnsi="Arial" w:cs="Arial"/>
-              </w:rPr>
-            </w:pPr>
-            <w:proofErr w:type="spellStart"/>
-            <w:r>
-              <w:rPr>
-                <w:rFonts w:ascii="Arial" w:hAnsi="Arial" w:cs="Arial"/>
-                <w:sz w:val="16"/>
-              </w:rPr>
-              <w:t>Identificador</w:t>
-            </w:r>
-            <w:proofErr w:type="spellEnd"/>
-            <w:r>
-              <w:rPr>
-                <w:rFonts w:ascii="Arial" w:hAnsi="Arial" w:cs="Arial"/>
-                <w:sz w:val="16"/>
-              </w:rPr>
-              <w:t xml:space="preserve"> </w:t>
-            </w:r>
-            <w:proofErr w:type="spellStart"/>
-            <w:r>
-              <w:rPr>
-                <w:rFonts w:ascii="Arial" w:hAnsi="Arial" w:cs="Arial"/>
-                <w:sz w:val="16"/>
-              </w:rPr>
-              <w:t>único</w:t>
-            </w:r>
-            <w:proofErr w:type="spellEnd"/>
-            <w:r>
-              <w:rPr>
-                <w:rFonts w:ascii="Arial" w:hAnsi="Arial" w:cs="Arial"/>
-                <w:sz w:val="16"/>
-              </w:rPr>
-              <w:t xml:space="preserve"> do </w:t>
-            </w:r>
-            <w:proofErr w:type="spellStart"/>
-            <w:r>
-              <w:rPr>
-                <w:rFonts w:ascii="Arial" w:hAnsi="Arial" w:cs="Arial"/>
-                <w:sz w:val="16"/>
-              </w:rPr>
-              <w:t>aluno</w:t>
-            </w:r>
-            <w:proofErr w:type="spellEnd"/>
-            <w:r>
-              <w:rPr>
-                <w:rFonts w:ascii="Arial" w:hAnsi="Arial" w:cs="Arial"/>
-                <w:sz w:val="16"/>
-              </w:rPr>
-              <w:t xml:space="preserve">, </w:t>
-            </w:r>
-            <w:proofErr w:type="spellStart"/>
-            <w:r>
-              <w:rPr>
-                <w:rFonts w:ascii="Arial" w:hAnsi="Arial" w:cs="Arial"/>
-                <w:sz w:val="16"/>
-              </w:rPr>
-              <w:t>gerado</w:t>
-            </w:r>
-            <w:proofErr w:type="spellEnd"/>
-            <w:r>
-              <w:rPr>
-                <w:rFonts w:ascii="Arial" w:hAnsi="Arial" w:cs="Arial"/>
-                <w:sz w:val="16"/>
-              </w:rPr>
-              <w:t xml:space="preserve"> </w:t>
-            </w:r>
-            <w:proofErr w:type="spellStart"/>
-            <w:r>
-              <w:rPr>
-                <w:rFonts w:ascii="Arial" w:hAnsi="Arial" w:cs="Arial"/>
-                <w:sz w:val="16"/>
-              </w:rPr>
-              <w:t>automaticamente</w:t>
-            </w:r>
-            <w:proofErr w:type="spellEnd"/>
-            <w:r>
-              <w:rPr>
-                <w:rFonts w:ascii="Arial" w:hAnsi="Arial" w:cs="Arial"/>
-                <w:sz w:val="16"/>
-              </w:rPr>
-              <w:t>.</w:t>
+                <w:lang w:val="pt-BR"/>
+              </w:rPr>
+            </w:pPr>
+            <w:r>
+              <w:rPr>
+                <w:rFonts w:ascii="Arial" w:hAnsi="Arial" w:cs="Arial"/>
+                <w:sz w:val="16"/>
+                <w:lang w:val="pt-BR"/>
+              </w:rPr>
+              <w:t>Identificador único do aluno, gerado automaticamente.</w:t>
             </w:r>
           </w:p>
         </w:tc>
@@ -5867,62 +5188,16 @@
               <w:spacing w:after="40"/>
               <w:rPr>
                 <w:rFonts w:ascii="Arial" w:hAnsi="Arial" w:cs="Arial"/>
-              </w:rPr>
-            </w:pPr>
-            <w:r>
-              <w:rPr>
-                <w:rFonts w:ascii="Arial" w:hAnsi="Arial" w:cs="Arial"/>
-                <w:sz w:val="16"/>
-              </w:rPr>
-              <w:t xml:space="preserve">CPF do </w:t>
-            </w:r>
-            <w:proofErr w:type="spellStart"/>
-            <w:r>
-              <w:rPr>
-                <w:rFonts w:ascii="Arial" w:hAnsi="Arial" w:cs="Arial"/>
-                <w:sz w:val="16"/>
-              </w:rPr>
-              <w:t>aluno</w:t>
-            </w:r>
-            <w:proofErr w:type="spellEnd"/>
-            <w:r>
-              <w:rPr>
-                <w:rFonts w:ascii="Arial" w:hAnsi="Arial" w:cs="Arial"/>
-                <w:sz w:val="16"/>
-              </w:rPr>
-              <w:t xml:space="preserve">, </w:t>
-            </w:r>
-            <w:proofErr w:type="spellStart"/>
-            <w:r>
-              <w:rPr>
-                <w:rFonts w:ascii="Arial" w:hAnsi="Arial" w:cs="Arial"/>
-                <w:sz w:val="16"/>
-              </w:rPr>
-              <w:t>sem</w:t>
-            </w:r>
-            <w:proofErr w:type="spellEnd"/>
-            <w:r>
-              <w:rPr>
-                <w:rFonts w:ascii="Arial" w:hAnsi="Arial" w:cs="Arial"/>
-                <w:sz w:val="16"/>
-              </w:rPr>
-              <w:t xml:space="preserve"> </w:t>
-            </w:r>
-            <w:proofErr w:type="spellStart"/>
-            <w:r>
-              <w:rPr>
-                <w:rFonts w:ascii="Arial" w:hAnsi="Arial" w:cs="Arial"/>
-                <w:sz w:val="16"/>
-              </w:rPr>
-              <w:t>pontuação</w:t>
-            </w:r>
-            <w:proofErr w:type="spellEnd"/>
-            <w:r>
-              <w:rPr>
-                <w:rFonts w:ascii="Arial" w:hAnsi="Arial" w:cs="Arial"/>
-                <w:sz w:val="16"/>
-              </w:rPr>
-              <w:t>.</w:t>
+                <w:lang w:val="pt-BR"/>
+              </w:rPr>
+            </w:pPr>
+            <w:r>
+              <w:rPr>
+                <w:rFonts w:ascii="Arial" w:hAnsi="Arial" w:cs="Arial"/>
+                <w:sz w:val="16"/>
+                <w:lang w:val="pt-BR"/>
+              </w:rPr>
+              <w:t>CPF do aluno, sem pontuação.</w:t>
             </w:r>
           </w:p>
         </w:tc>
@@ -6030,46 +5305,16 @@
               <w:spacing w:after="40"/>
               <w:rPr>
                 <w:rFonts w:ascii="Arial" w:hAnsi="Arial" w:cs="Arial"/>
-              </w:rPr>
-            </w:pPr>
-            <w:r>
-              <w:rPr>
-                <w:rFonts w:ascii="Arial" w:hAnsi="Arial" w:cs="Arial"/>
-                <w:sz w:val="16"/>
-              </w:rPr>
-              <w:t xml:space="preserve">Data de </w:t>
-            </w:r>
-            <w:proofErr w:type="spellStart"/>
-            <w:r>
-              <w:rPr>
-                <w:rFonts w:ascii="Arial" w:hAnsi="Arial" w:cs="Arial"/>
-                <w:sz w:val="16"/>
-              </w:rPr>
-              <w:t>nascimento</w:t>
-            </w:r>
-            <w:proofErr w:type="spellEnd"/>
-            <w:r>
-              <w:rPr>
-                <w:rFonts w:ascii="Arial" w:hAnsi="Arial" w:cs="Arial"/>
-                <w:sz w:val="16"/>
-              </w:rPr>
-              <w:t xml:space="preserve"> do </w:t>
-            </w:r>
-            <w:proofErr w:type="spellStart"/>
-            <w:r>
-              <w:rPr>
-                <w:rFonts w:ascii="Arial" w:hAnsi="Arial" w:cs="Arial"/>
-                <w:sz w:val="16"/>
-              </w:rPr>
-              <w:t>aluno</w:t>
-            </w:r>
-            <w:proofErr w:type="spellEnd"/>
-            <w:r>
-              <w:rPr>
-                <w:rFonts w:ascii="Arial" w:hAnsi="Arial" w:cs="Arial"/>
-                <w:sz w:val="16"/>
-              </w:rPr>
-              <w:t>.</w:t>
+                <w:lang w:val="pt-BR"/>
+              </w:rPr>
+            </w:pPr>
+            <w:r>
+              <w:rPr>
+                <w:rFonts w:ascii="Arial" w:hAnsi="Arial" w:cs="Arial"/>
+                <w:sz w:val="16"/>
+                <w:lang w:val="pt-BR"/>
+              </w:rPr>
+              <w:t>Data de nascimento do aluno.</w:t>
             </w:r>
           </w:p>
         </w:tc>
@@ -6186,71 +5431,16 @@
               <w:spacing w:after="40"/>
               <w:rPr>
                 <w:rFonts w:ascii="Arial" w:hAnsi="Arial" w:cs="Arial"/>
-              </w:rPr>
-            </w:pPr>
-            <w:proofErr w:type="spellStart"/>
-            <w:r>
-              <w:rPr>
-                <w:rFonts w:ascii="Arial" w:hAnsi="Arial" w:cs="Arial"/>
-                <w:sz w:val="16"/>
-              </w:rPr>
-              <w:t>Telefone</w:t>
-            </w:r>
-            <w:proofErr w:type="spellEnd"/>
-            <w:r>
-              <w:rPr>
-                <w:rFonts w:ascii="Arial" w:hAnsi="Arial" w:cs="Arial"/>
-                <w:sz w:val="16"/>
-              </w:rPr>
-              <w:t xml:space="preserve"> de </w:t>
-            </w:r>
-            <w:proofErr w:type="spellStart"/>
-            <w:r>
-              <w:rPr>
-                <w:rFonts w:ascii="Arial" w:hAnsi="Arial" w:cs="Arial"/>
-                <w:sz w:val="16"/>
-              </w:rPr>
-              <w:t>contato</w:t>
-            </w:r>
-            <w:proofErr w:type="spellEnd"/>
-            <w:r>
-              <w:rPr>
-                <w:rFonts w:ascii="Arial" w:hAnsi="Arial" w:cs="Arial"/>
-                <w:sz w:val="16"/>
-              </w:rPr>
-              <w:t xml:space="preserve">, </w:t>
-            </w:r>
-            <w:proofErr w:type="spellStart"/>
-            <w:r>
-              <w:rPr>
-                <w:rFonts w:ascii="Arial" w:hAnsi="Arial" w:cs="Arial"/>
-                <w:sz w:val="16"/>
-              </w:rPr>
-              <w:t>sem</w:t>
-            </w:r>
-            <w:proofErr w:type="spellEnd"/>
-            <w:r>
-              <w:rPr>
-                <w:rFonts w:ascii="Arial" w:hAnsi="Arial" w:cs="Arial"/>
-                <w:sz w:val="16"/>
-              </w:rPr>
-              <w:t xml:space="preserve"> </w:t>
-            </w:r>
-            <w:proofErr w:type="spellStart"/>
-            <w:r>
-              <w:rPr>
-                <w:rFonts w:ascii="Arial" w:hAnsi="Arial" w:cs="Arial"/>
-                <w:sz w:val="16"/>
-              </w:rPr>
-              <w:t>formatação</w:t>
-            </w:r>
-            <w:proofErr w:type="spellEnd"/>
-            <w:r>
-              <w:rPr>
-                <w:rFonts w:ascii="Arial" w:hAnsi="Arial" w:cs="Arial"/>
-                <w:sz w:val="16"/>
-              </w:rPr>
-              <w:t>.</w:t>
+                <w:lang w:val="pt-BR"/>
+              </w:rPr>
+            </w:pPr>
+            <w:r>
+              <w:rPr>
+                <w:rFonts w:ascii="Arial" w:hAnsi="Arial" w:cs="Arial"/>
+                <w:sz w:val="16"/>
+                <w:lang w:val="pt-BR"/>
+              </w:rPr>
+              <w:t>Telefone de contato, sem formatação.</w:t>
             </w:r>
           </w:p>
         </w:tc>
@@ -6365,55 +5555,16 @@
               <w:spacing w:after="40"/>
               <w:rPr>
                 <w:rFonts w:ascii="Arial" w:hAnsi="Arial" w:cs="Arial"/>
-              </w:rPr>
-            </w:pPr>
-            <w:proofErr w:type="spellStart"/>
-            <w:r>
-              <w:rPr>
-                <w:rFonts w:ascii="Arial" w:hAnsi="Arial" w:cs="Arial"/>
-                <w:sz w:val="16"/>
-              </w:rPr>
-              <w:t>Endereço</w:t>
-            </w:r>
-            <w:proofErr w:type="spellEnd"/>
-            <w:r>
-              <w:rPr>
-                <w:rFonts w:ascii="Arial" w:hAnsi="Arial" w:cs="Arial"/>
-                <w:sz w:val="16"/>
-              </w:rPr>
-              <w:t xml:space="preserve"> de e-mail </w:t>
-            </w:r>
-            <w:proofErr w:type="gramStart"/>
-            <w:r>
-              <w:rPr>
-                <w:rFonts w:ascii="Arial" w:hAnsi="Arial" w:cs="Arial"/>
-                <w:sz w:val="16"/>
-              </w:rPr>
-              <w:t>do</w:t>
-            </w:r>
-            <w:proofErr w:type="gramEnd"/>
-            <w:r>
-              <w:rPr>
-                <w:rFonts w:ascii="Arial" w:hAnsi="Arial" w:cs="Arial"/>
-                <w:sz w:val="16"/>
-              </w:rPr>
-              <w:t xml:space="preserve"> </w:t>
-            </w:r>
-            <w:proofErr w:type="spellStart"/>
-            <w:r>
-              <w:rPr>
-                <w:rFonts w:ascii="Arial" w:hAnsi="Arial" w:cs="Arial"/>
-                <w:sz w:val="16"/>
-              </w:rPr>
-              <w:t>aluno</w:t>
-            </w:r>
-            <w:proofErr w:type="spellEnd"/>
-            <w:r>
-              <w:rPr>
-                <w:rFonts w:ascii="Arial" w:hAnsi="Arial" w:cs="Arial"/>
-                <w:sz w:val="16"/>
-              </w:rPr>
-              <w:t>.</w:t>
+                <w:lang w:val="pt-BR"/>
+              </w:rPr>
+            </w:pPr>
+            <w:r>
+              <w:rPr>
+                <w:rFonts w:ascii="Arial" w:hAnsi="Arial" w:cs="Arial"/>
+                <w:sz w:val="16"/>
+                <w:lang w:val="pt-BR"/>
+              </w:rPr>
+              <w:t>Endereço de e-mail do aluno.</w:t>
             </w:r>
           </w:p>
         </w:tc>
@@ -6521,46 +5672,16 @@
               <w:spacing w:after="40"/>
               <w:rPr>
                 <w:rFonts w:ascii="Arial" w:hAnsi="Arial" w:cs="Arial"/>
-              </w:rPr>
-            </w:pPr>
-            <w:r>
-              <w:rPr>
-                <w:rFonts w:ascii="Arial" w:hAnsi="Arial" w:cs="Arial"/>
-                <w:sz w:val="16"/>
-              </w:rPr>
-              <w:t xml:space="preserve">Data de </w:t>
-            </w:r>
-            <w:proofErr w:type="spellStart"/>
-            <w:r>
-              <w:rPr>
-                <w:rFonts w:ascii="Arial" w:hAnsi="Arial" w:cs="Arial"/>
-                <w:sz w:val="16"/>
-              </w:rPr>
-              <w:t>matrícula</w:t>
-            </w:r>
-            <w:proofErr w:type="spellEnd"/>
-            <w:r>
-              <w:rPr>
-                <w:rFonts w:ascii="Arial" w:hAnsi="Arial" w:cs="Arial"/>
-                <w:sz w:val="16"/>
-              </w:rPr>
-              <w:t xml:space="preserve"> do </w:t>
-            </w:r>
-            <w:proofErr w:type="spellStart"/>
-            <w:r>
-              <w:rPr>
-                <w:rFonts w:ascii="Arial" w:hAnsi="Arial" w:cs="Arial"/>
-                <w:sz w:val="16"/>
-              </w:rPr>
-              <w:t>aluno</w:t>
-            </w:r>
-            <w:proofErr w:type="spellEnd"/>
-            <w:r>
-              <w:rPr>
-                <w:rFonts w:ascii="Arial" w:hAnsi="Arial" w:cs="Arial"/>
-                <w:sz w:val="16"/>
-              </w:rPr>
-              <w:t>.</w:t>
+                <w:lang w:val="pt-BR"/>
+              </w:rPr>
+            </w:pPr>
+            <w:r>
+              <w:rPr>
+                <w:rFonts w:ascii="Arial" w:hAnsi="Arial" w:cs="Arial"/>
+                <w:sz w:val="16"/>
+                <w:lang w:val="pt-BR"/>
+              </w:rPr>
+              <w:t>Data de matrícula do aluno.</w:t>
             </w:r>
           </w:p>
         </w:tc>
@@ -6684,87 +5805,16 @@
               <w:spacing w:after="40"/>
               <w:rPr>
                 <w:rFonts w:ascii="Arial" w:hAnsi="Arial" w:cs="Arial"/>
-              </w:rPr>
-            </w:pPr>
-            <w:proofErr w:type="spellStart"/>
-            <w:r>
-              <w:rPr>
-                <w:rFonts w:ascii="Arial" w:hAnsi="Arial" w:cs="Arial"/>
-                <w:sz w:val="16"/>
-              </w:rPr>
-              <w:t>Identifica</w:t>
-            </w:r>
-            <w:proofErr w:type="spellEnd"/>
-            <w:r>
-              <w:rPr>
-                <w:rFonts w:ascii="Arial" w:hAnsi="Arial" w:cs="Arial"/>
-                <w:sz w:val="16"/>
-              </w:rPr>
-              <w:t xml:space="preserve"> o </w:t>
-            </w:r>
-            <w:proofErr w:type="spellStart"/>
-            <w:r>
-              <w:rPr>
-                <w:rFonts w:ascii="Arial" w:hAnsi="Arial" w:cs="Arial"/>
-                <w:sz w:val="16"/>
-              </w:rPr>
-              <w:t>plano</w:t>
-            </w:r>
-            <w:proofErr w:type="spellEnd"/>
-            <w:r>
-              <w:rPr>
-                <w:rFonts w:ascii="Arial" w:hAnsi="Arial" w:cs="Arial"/>
-                <w:sz w:val="16"/>
-              </w:rPr>
-              <w:t xml:space="preserve"> </w:t>
-            </w:r>
-            <w:proofErr w:type="spellStart"/>
-            <w:r>
-              <w:rPr>
-                <w:rFonts w:ascii="Arial" w:hAnsi="Arial" w:cs="Arial"/>
-                <w:sz w:val="16"/>
-              </w:rPr>
-              <w:t>associado</w:t>
-            </w:r>
-            <w:proofErr w:type="spellEnd"/>
-            <w:r>
-              <w:rPr>
-                <w:rFonts w:ascii="Arial" w:hAnsi="Arial" w:cs="Arial"/>
-                <w:sz w:val="16"/>
-              </w:rPr>
-              <w:t xml:space="preserve"> </w:t>
-            </w:r>
-            <w:proofErr w:type="spellStart"/>
-            <w:r>
-              <w:rPr>
-                <w:rFonts w:ascii="Arial" w:hAnsi="Arial" w:cs="Arial"/>
-                <w:sz w:val="16"/>
-              </w:rPr>
-              <w:t>ao</w:t>
-            </w:r>
-            <w:proofErr w:type="spellEnd"/>
-            <w:r>
-              <w:rPr>
-                <w:rFonts w:ascii="Arial" w:hAnsi="Arial" w:cs="Arial"/>
-                <w:sz w:val="16"/>
-              </w:rPr>
-              <w:t xml:space="preserve"> </w:t>
-            </w:r>
-            <w:proofErr w:type="spellStart"/>
-            <w:r>
-              <w:rPr>
-                <w:rFonts w:ascii="Arial" w:hAnsi="Arial" w:cs="Arial"/>
-                <w:sz w:val="16"/>
-              </w:rPr>
-              <w:t>aluno</w:t>
-            </w:r>
-            <w:proofErr w:type="spellEnd"/>
-            <w:r>
-              <w:rPr>
-                <w:rFonts w:ascii="Arial" w:hAnsi="Arial" w:cs="Arial"/>
-                <w:sz w:val="16"/>
-              </w:rPr>
-              <w:t>.</w:t>
+                <w:lang w:val="pt-BR"/>
+              </w:rPr>
+            </w:pPr>
+            <w:r>
+              <w:rPr>
+                <w:rFonts w:ascii="Arial" w:hAnsi="Arial" w:cs="Arial"/>
+                <w:sz w:val="16"/>
+                <w:lang w:val="pt-BR"/>
+              </w:rPr>
+              <w:t>Identifica o plano associado ao aluno.</w:t>
             </w:r>
           </w:p>
         </w:tc>
@@ -7073,71 +6123,16 @@
               <w:spacing w:after="40"/>
               <w:rPr>
                 <w:rFonts w:ascii="Arial" w:hAnsi="Arial" w:cs="Arial"/>
-              </w:rPr>
-            </w:pPr>
-            <w:proofErr w:type="spellStart"/>
-            <w:r>
-              <w:rPr>
-                <w:rFonts w:ascii="Arial" w:hAnsi="Arial" w:cs="Arial"/>
-                <w:sz w:val="16"/>
-              </w:rPr>
-              <w:t>Identificador</w:t>
-            </w:r>
-            <w:proofErr w:type="spellEnd"/>
-            <w:r>
-              <w:rPr>
-                <w:rFonts w:ascii="Arial" w:hAnsi="Arial" w:cs="Arial"/>
-                <w:sz w:val="16"/>
-              </w:rPr>
-              <w:t xml:space="preserve"> </w:t>
-            </w:r>
-            <w:proofErr w:type="spellStart"/>
-            <w:r>
-              <w:rPr>
-                <w:rFonts w:ascii="Arial" w:hAnsi="Arial" w:cs="Arial"/>
-                <w:sz w:val="16"/>
-              </w:rPr>
-              <w:t>único</w:t>
-            </w:r>
-            <w:proofErr w:type="spellEnd"/>
-            <w:r>
-              <w:rPr>
-                <w:rFonts w:ascii="Arial" w:hAnsi="Arial" w:cs="Arial"/>
-                <w:sz w:val="16"/>
-              </w:rPr>
-              <w:t xml:space="preserve"> do </w:t>
-            </w:r>
-            <w:proofErr w:type="spellStart"/>
-            <w:r>
-              <w:rPr>
-                <w:rFonts w:ascii="Arial" w:hAnsi="Arial" w:cs="Arial"/>
-                <w:sz w:val="16"/>
-              </w:rPr>
-              <w:t>registro</w:t>
-            </w:r>
-            <w:proofErr w:type="spellEnd"/>
-            <w:r>
-              <w:rPr>
-                <w:rFonts w:ascii="Arial" w:hAnsi="Arial" w:cs="Arial"/>
-                <w:sz w:val="16"/>
-              </w:rPr>
-              <w:t xml:space="preserve"> de </w:t>
-            </w:r>
-            <w:proofErr w:type="spellStart"/>
-            <w:r>
-              <w:rPr>
-                <w:rFonts w:ascii="Arial" w:hAnsi="Arial" w:cs="Arial"/>
-                <w:sz w:val="16"/>
-              </w:rPr>
-              <w:t>frequência</w:t>
-            </w:r>
-            <w:proofErr w:type="spellEnd"/>
-            <w:r>
-              <w:rPr>
-                <w:rFonts w:ascii="Arial" w:hAnsi="Arial" w:cs="Arial"/>
-                <w:sz w:val="16"/>
-              </w:rPr>
-              <w:t>.</w:t>
+                <w:lang w:val="pt-BR"/>
+              </w:rPr>
+            </w:pPr>
+            <w:r>
+              <w:rPr>
+                <w:rFonts w:ascii="Arial" w:hAnsi="Arial" w:cs="Arial"/>
+                <w:sz w:val="16"/>
+                <w:lang w:val="pt-BR"/>
+              </w:rPr>
+              <w:t>Identificador único do registro de frequência.</w:t>
             </w:r>
           </w:p>
         </w:tc>
@@ -7548,87 +6543,16 @@
               <w:spacing w:after="40"/>
               <w:rPr>
                 <w:rFonts w:ascii="Arial" w:hAnsi="Arial" w:cs="Arial"/>
-              </w:rPr>
-            </w:pPr>
-            <w:proofErr w:type="spellStart"/>
-            <w:r>
-              <w:rPr>
-                <w:rFonts w:ascii="Arial" w:hAnsi="Arial" w:cs="Arial"/>
-                <w:sz w:val="16"/>
-              </w:rPr>
-              <w:t>Identifica</w:t>
-            </w:r>
-            <w:proofErr w:type="spellEnd"/>
-            <w:r>
-              <w:rPr>
-                <w:rFonts w:ascii="Arial" w:hAnsi="Arial" w:cs="Arial"/>
-                <w:sz w:val="16"/>
-              </w:rPr>
-              <w:t xml:space="preserve"> o </w:t>
-            </w:r>
-            <w:proofErr w:type="spellStart"/>
-            <w:r>
-              <w:rPr>
-                <w:rFonts w:ascii="Arial" w:hAnsi="Arial" w:cs="Arial"/>
-                <w:sz w:val="16"/>
-              </w:rPr>
-              <w:t>aluno</w:t>
-            </w:r>
-            <w:proofErr w:type="spellEnd"/>
-            <w:r>
-              <w:rPr>
-                <w:rFonts w:ascii="Arial" w:hAnsi="Arial" w:cs="Arial"/>
-                <w:sz w:val="16"/>
-              </w:rPr>
-              <w:t xml:space="preserve"> </w:t>
-            </w:r>
-            <w:proofErr w:type="spellStart"/>
-            <w:r>
-              <w:rPr>
-                <w:rFonts w:ascii="Arial" w:hAnsi="Arial" w:cs="Arial"/>
-                <w:sz w:val="16"/>
-              </w:rPr>
-              <w:t>ao</w:t>
-            </w:r>
-            <w:proofErr w:type="spellEnd"/>
-            <w:r>
-              <w:rPr>
-                <w:rFonts w:ascii="Arial" w:hAnsi="Arial" w:cs="Arial"/>
-                <w:sz w:val="16"/>
-              </w:rPr>
-              <w:t xml:space="preserve"> qual </w:t>
-            </w:r>
-            <w:proofErr w:type="spellStart"/>
-            <w:r>
-              <w:rPr>
-                <w:rFonts w:ascii="Arial" w:hAnsi="Arial" w:cs="Arial"/>
-                <w:sz w:val="16"/>
-              </w:rPr>
-              <w:t>pertence</w:t>
-            </w:r>
-            <w:proofErr w:type="spellEnd"/>
-            <w:r>
-              <w:rPr>
-                <w:rFonts w:ascii="Arial" w:hAnsi="Arial" w:cs="Arial"/>
-                <w:sz w:val="16"/>
-              </w:rPr>
-              <w:t xml:space="preserve"> o </w:t>
-            </w:r>
-            <w:proofErr w:type="spellStart"/>
-            <w:r>
-              <w:rPr>
-                <w:rFonts w:ascii="Arial" w:hAnsi="Arial" w:cs="Arial"/>
-                <w:sz w:val="16"/>
-              </w:rPr>
-              <w:t>registro</w:t>
-            </w:r>
-            <w:proofErr w:type="spellEnd"/>
-            <w:r>
-              <w:rPr>
-                <w:rFonts w:ascii="Arial" w:hAnsi="Arial" w:cs="Arial"/>
-                <w:sz w:val="16"/>
-              </w:rPr>
-              <w:t>.</w:t>
+                <w:lang w:val="pt-BR"/>
+              </w:rPr>
+            </w:pPr>
+            <w:r>
+              <w:rPr>
+                <w:rFonts w:ascii="Arial" w:hAnsi="Arial" w:cs="Arial"/>
+                <w:sz w:val="16"/>
+                <w:lang w:val="pt-BR"/>
+              </w:rPr>
+              <w:t>Identifica o aluno ao qual pertence o registro.</w:t>
             </w:r>
           </w:p>
         </w:tc>
@@ -8306,71 +7230,16 @@
               <w:spacing w:after="40"/>
               <w:rPr>
                 <w:rFonts w:ascii="Arial" w:hAnsi="Arial" w:cs="Arial"/>
-              </w:rPr>
-            </w:pPr>
-            <w:proofErr w:type="spellStart"/>
-            <w:r>
-              <w:rPr>
-                <w:rFonts w:ascii="Arial" w:hAnsi="Arial" w:cs="Arial"/>
-                <w:sz w:val="16"/>
-              </w:rPr>
-              <w:t>Identifica</w:t>
-            </w:r>
-            <w:proofErr w:type="spellEnd"/>
-            <w:r>
-              <w:rPr>
-                <w:rFonts w:ascii="Arial" w:hAnsi="Arial" w:cs="Arial"/>
-                <w:sz w:val="16"/>
-              </w:rPr>
-              <w:t xml:space="preserve"> a aula </w:t>
-            </w:r>
-            <w:proofErr w:type="spellStart"/>
-            <w:r>
-              <w:rPr>
-                <w:rFonts w:ascii="Arial" w:hAnsi="Arial" w:cs="Arial"/>
-                <w:sz w:val="16"/>
-              </w:rPr>
-              <w:t>na</w:t>
-            </w:r>
-            <w:proofErr w:type="spellEnd"/>
-            <w:r>
-              <w:rPr>
-                <w:rFonts w:ascii="Arial" w:hAnsi="Arial" w:cs="Arial"/>
-                <w:sz w:val="16"/>
-              </w:rPr>
-              <w:t xml:space="preserve"> qual o </w:t>
-            </w:r>
-            <w:proofErr w:type="spellStart"/>
-            <w:r>
-              <w:rPr>
-                <w:rFonts w:ascii="Arial" w:hAnsi="Arial" w:cs="Arial"/>
-                <w:sz w:val="16"/>
-              </w:rPr>
-              <w:t>aluno</w:t>
-            </w:r>
-            <w:proofErr w:type="spellEnd"/>
-            <w:r>
-              <w:rPr>
-                <w:rFonts w:ascii="Arial" w:hAnsi="Arial" w:cs="Arial"/>
-                <w:sz w:val="16"/>
-              </w:rPr>
-              <w:t xml:space="preserve"> se </w:t>
-            </w:r>
-            <w:proofErr w:type="spellStart"/>
-            <w:r>
-              <w:rPr>
-                <w:rFonts w:ascii="Arial" w:hAnsi="Arial" w:cs="Arial"/>
-                <w:sz w:val="16"/>
-              </w:rPr>
-              <w:t>inscreveu</w:t>
-            </w:r>
-            <w:proofErr w:type="spellEnd"/>
-            <w:r>
-              <w:rPr>
-                <w:rFonts w:ascii="Arial" w:hAnsi="Arial" w:cs="Arial"/>
-                <w:sz w:val="16"/>
-              </w:rPr>
-              <w:t>.</w:t>
+                <w:lang w:val="pt-BR"/>
+              </w:rPr>
+            </w:pPr>
+            <w:r>
+              <w:rPr>
+                <w:rFonts w:ascii="Arial" w:hAnsi="Arial" w:cs="Arial"/>
+                <w:sz w:val="16"/>
+                <w:lang w:val="pt-BR"/>
+              </w:rPr>
+              <w:t>Identifica a aula na qual o aluno se inscreveu.</w:t>
             </w:r>
           </w:p>
         </w:tc>
@@ -9202,30 +8071,23 @@
           <w:ilvl w:val="1"/>
           <w:numId w:val="1"/>
         </w:numPr>
+        <w:rPr>
+          <w:lang w:val="en-US"/>
+        </w:rPr>
       </w:pPr>
       <w:bookmarkStart w:id="6" w:name="_heading=h.5ynsbq1b28r4" w:colFirst="0" w:colLast="0"/>
       <w:bookmarkEnd w:id="6"/>
       <w:r>
-        <w:t xml:space="preserve">Triggers, </w:t>
+        <w:rPr>
+          <w:lang w:val="en-US"/>
+        </w:rPr>
+        <w:t xml:space="preserve">Triggers, Stored Procedures e Functions de </w:t>
       </w:r>
       <w:proofErr w:type="spellStart"/>
       <w:r>
-        <w:t>Stored</w:t>
-      </w:r>
-      <w:proofErr w:type="spellEnd"/>
-      <w:r>
-        <w:t xml:space="preserve"> Procedures e </w:t>
-      </w:r>
-      <w:proofErr w:type="spellStart"/>
-      <w:r>
-        <w:t>Functions</w:t>
-      </w:r>
-      <w:proofErr w:type="spellEnd"/>
-      <w:r>
-        <w:t xml:space="preserve"> de </w:t>
-      </w:r>
-      <w:proofErr w:type="spellStart"/>
-      <w:r>
+        <w:rPr>
+          <w:lang w:val="en-US"/>
+        </w:rPr>
         <w:t>Historimanto</w:t>
       </w:r>
       <w:proofErr w:type="spellEnd"/>
@@ -9316,27 +8178,17 @@
           <w:ilvl w:val="1"/>
           <w:numId w:val="1"/>
         </w:numPr>
+        <w:rPr>
+          <w:lang w:val="en-US"/>
+        </w:rPr>
       </w:pPr>
       <w:bookmarkStart w:id="9" w:name="_heading=h.hhsoxlb7dv1w" w:colFirst="0" w:colLast="0"/>
       <w:bookmarkEnd w:id="9"/>
       <w:r>
-        <w:t xml:space="preserve">Triggers, </w:t>
-      </w:r>
-      <w:proofErr w:type="spellStart"/>
-      <w:r>
-        <w:t>Stored</w:t>
-      </w:r>
-      <w:proofErr w:type="spellEnd"/>
-      <w:r>
-        <w:t xml:space="preserve"> Procedures e </w:t>
-      </w:r>
-      <w:proofErr w:type="spellStart"/>
-      <w:r>
-        <w:t>Functions</w:t>
-      </w:r>
-      <w:proofErr w:type="spellEnd"/>
-      <w:r>
-        <w:t xml:space="preserve"> de Auditoria</w:t>
+        <w:rPr>
+          <w:lang w:val="en-US"/>
+        </w:rPr>
+        <w:t>Triggers, Stored Procedures e Functions de Auditoria</w:t>
       </w:r>
     </w:p>
     <w:p>
@@ -10916,7 +9768,7 @@
 </file>
 
 <file path=word/numbering.xml><?xml version="1.0" encoding="utf-8"?>
-<w:numbering xmlns:wpc="http://schemas.microsoft.com/office/word/2010/wordprocessingCanvas" xmlns:cx="http://schemas.microsoft.com/office/drawing/2014/chartex" xmlns:cx1="http://schemas.microsoft.com/office/drawing/2015/9/8/chartex" xmlns:cx2="http://schemas.microsoft.com/office/drawing/2015/10/21/chartex" xmlns:cx3="http://schemas.microsoft.com/office/drawing/2016/5/9/chartex" xmlns:cx4="http://schemas.microsoft.com/office/drawing/2016/5/10/chartex" xmlns:cx5="http://schemas.microsoft.com/office/drawing/2016/5/11/chartex" xmlns:cx6="http://schemas.microsoft.com/office/drawing/2016/5/12/chartex" xmlns:cx7="http://schemas.microsoft.com/office/drawing/2016/5/13/chartex" xmlns:cx8="http://schemas.microsoft.com/office/drawing/2016/5/14/chartex" xmlns:mc="http://schemas.openxmlformats.org/markup-compatibility/2006" xmlns:aink="http://schemas.microsoft.com/office/drawing/2016/ink" xmlns:am3d="http://schemas.microsoft.com/office/drawing/2017/model3d" xmlns:o="urn:schemas-microsoft-com:office:office" xmlns:r="http://schemas.openxmlformats.org/officeDocument/2006/relationships" xmlns:m="http://schemas.openxmlformats.org/officeDocument/2006/math" xmlns:v="urn:schemas-microsoft-com:vml" xmlns:wp14="http://schemas.microsoft.com/office/word/2010/wordprocessingDrawing" xmlns:wp="http://schemas.openxmlformats.org/drawingml/2006/wordprocessingDrawing" xmlns:w10="urn:schemas-microsoft-com:office:word" xmlns:w="http://schemas.openxmlformats.org/wordprocessingml/2006/main" xmlns:w14="http://schemas.microsoft.com/office/word/2010/wordml" xmlns:w15="http://schemas.microsoft.com/office/word/2012/wordml" xmlns:w16cex="http://schemas.microsoft.com/office/word/2018/wordml/cex" xmlns:w16cid="http://schemas.microsoft.com/office/word/2016/wordml/cid" xmlns:w16="http://schemas.microsoft.com/office/word/2018/wordml" xmlns:w16sdtdh="http://schemas.microsoft.com/office/word/2020/wordml/sdtdatahash" xmlns:w16se="http://schemas.microsoft.com/office/word/2015/wordml/symex" xmlns:wpg="http://schemas.microsoft.com/office/word/2010/wordprocessingGroup" xmlns:wpi="http://schemas.microsoft.com/office/word/2010/wordprocessingInk" xmlns:wne="http://schemas.microsoft.com/office/word/2006/wordml" xmlns:wps="http://schemas.microsoft.com/office/word/2010/wordprocessingShape" mc:Ignorable="w14 w15 w16se w16cid w16 w16cex w16sdtdh wp14">
+<w:numbering xmlns:wpc="http://schemas.microsoft.com/office/word/2010/wordprocessingCanvas" xmlns:cx="http://schemas.microsoft.com/office/drawing/2014/chartex" xmlns:cx1="http://schemas.microsoft.com/office/drawing/2015/9/8/chartex" xmlns:cx2="http://schemas.microsoft.com/office/drawing/2015/10/21/chartex" xmlns:cx3="http://schemas.microsoft.com/office/drawing/2016/5/9/chartex" xmlns:cx4="http://schemas.microsoft.com/office/drawing/2016/5/10/chartex" xmlns:cx5="http://schemas.microsoft.com/office/drawing/2016/5/11/chartex" xmlns:cx6="http://schemas.microsoft.com/office/drawing/2016/5/12/chartex" xmlns:cx7="http://schemas.microsoft.com/office/drawing/2016/5/13/chartex" xmlns:cx8="http://schemas.microsoft.com/office/drawing/2016/5/14/chartex" xmlns:mc="http://schemas.openxmlformats.org/markup-compatibility/2006" xmlns:aink="http://schemas.microsoft.com/office/drawing/2016/ink" xmlns:am3d="http://schemas.microsoft.com/office/drawing/2017/model3d" xmlns:o="urn:schemas-microsoft-com:office:office" xmlns:oel="http://schemas.microsoft.com/office/2019/extlst" xmlns:r="http://schemas.openxmlformats.org/officeDocument/2006/relationships" xmlns:m="http://schemas.openxmlformats.org/officeDocument/2006/math" xmlns:v="urn:schemas-microsoft-com:vml" xmlns:wp14="http://schemas.microsoft.com/office/word/2010/wordprocessingDrawing" xmlns:wp="http://schemas.openxmlformats.org/drawingml/2006/wordprocessingDrawing" xmlns:w10="urn:schemas-microsoft-com:office:word" xmlns:w="http://schemas.openxmlformats.org/wordprocessingml/2006/main" xmlns:w14="http://schemas.microsoft.com/office/word/2010/wordml" xmlns:w15="http://schemas.microsoft.com/office/word/2012/wordml" xmlns:w16cex="http://schemas.microsoft.com/office/word/2018/wordml/cex" xmlns:w16cid="http://schemas.microsoft.com/office/word/2016/wordml/cid" xmlns:w16="http://schemas.microsoft.com/office/word/2018/wordml" xmlns:w16du="http://schemas.microsoft.com/office/word/2023/wordml/word16du" xmlns:w16sdtdh="http://schemas.microsoft.com/office/word/2020/wordml/sdtdatahash" xmlns:w16sdtfl="http://schemas.microsoft.com/office/word/2024/wordml/sdtformatlock" xmlns:w16se="http://schemas.microsoft.com/office/word/2015/wordml/symex" xmlns:wpg="http://schemas.microsoft.com/office/word/2010/wordprocessingGroup" xmlns:wpi="http://schemas.microsoft.com/office/word/2010/wordprocessingInk" xmlns:wne="http://schemas.microsoft.com/office/word/2006/wordml" xmlns:wps="http://schemas.microsoft.com/office/word/2010/wordprocessingShape" mc:Ignorable="w14 w15 w16se w16cid w16 w16cex w16sdtdh w16sdtfl w16du wp14">
   <w:abstractNum w:abstractNumId="0" w15:restartNumberingAfterBreak="0">
     <w:nsid w:val="0C9739C5"/>
     <w:multiLevelType w:val="multilevel"/>
@@ -11354,23 +10206,23 @@
       </w:pPr>
     </w:lvl>
   </w:abstractNum>
-  <w:num w:numId="1">
+  <w:num w:numId="1" w16cid:durableId="666058209">
     <w:abstractNumId w:val="3"/>
   </w:num>
-  <w:num w:numId="2">
+  <w:num w:numId="2" w16cid:durableId="361787144">
     <w:abstractNumId w:val="0"/>
   </w:num>
-  <w:num w:numId="3">
+  <w:num w:numId="3" w16cid:durableId="1742869402">
     <w:abstractNumId w:val="2"/>
   </w:num>
-  <w:num w:numId="4">
+  <w:num w:numId="4" w16cid:durableId="532839161">
     <w:abstractNumId w:val="1"/>
   </w:num>
 </w:numbering>
 </file>
 
 <file path=word/styles.xml><?xml version="1.0" encoding="utf-8"?>
-<w:styles xmlns:mc="http://schemas.openxmlformats.org/markup-compatibility/2006" xmlns:r="http://schemas.openxmlformats.org/officeDocument/2006/relationships" xmlns:w="http://schemas.openxmlformats.org/wordprocessingml/2006/main" xmlns:w14="http://schemas.microsoft.com/office/word/2010/wordml" xmlns:w15="http://schemas.microsoft.com/office/word/2012/wordml" xmlns:w16cex="http://schemas.microsoft.com/office/word/2018/wordml/cex" xmlns:w16cid="http://schemas.microsoft.com/office/word/2016/wordml/cid" xmlns:w16="http://schemas.microsoft.com/office/word/2018/wordml" xmlns:w16sdtdh="http://schemas.microsoft.com/office/word/2020/wordml/sdtdatahash" xmlns:w16se="http://schemas.microsoft.com/office/word/2015/wordml/symex" mc:Ignorable="w14 w15 w16se w16cid w16 w16cex w16sdtdh">
+<w:styles xmlns:mc="http://schemas.openxmlformats.org/markup-compatibility/2006" xmlns:r="http://schemas.openxmlformats.org/officeDocument/2006/relationships" xmlns:w="http://schemas.openxmlformats.org/wordprocessingml/2006/main" xmlns:w14="http://schemas.microsoft.com/office/word/2010/wordml" xmlns:w15="http://schemas.microsoft.com/office/word/2012/wordml" xmlns:w16cex="http://schemas.microsoft.com/office/word/2018/wordml/cex" xmlns:w16cid="http://schemas.microsoft.com/office/word/2016/wordml/cid" xmlns:w16="http://schemas.microsoft.com/office/word/2018/wordml" xmlns:w16du="http://schemas.microsoft.com/office/word/2023/wordml/word16du" xmlns:w16sdtdh="http://schemas.microsoft.com/office/word/2020/wordml/sdtdatahash" xmlns:w16sdtfl="http://schemas.microsoft.com/office/word/2024/wordml/sdtformatlock" xmlns:w16se="http://schemas.microsoft.com/office/word/2015/wordml/symex" mc:Ignorable="w14 w15 w16se w16cid w16 w16cex w16sdtdh w16sdtfl w16du">
   <w:docDefaults>
     <w:rPrDefault>
       <w:rPr>

</xml_diff>

<commit_message>
inclusão do modelo relacional e alteração nos atributos do conceitual
</commit_message>
<xml_diff>
--- a/entrega4/docs/DOCS-ACADEMIA-UA.docx
+++ b/entrega4/docs/DOCS-ACADEMIA-UA.docx
@@ -946,10 +946,10 @@
           <w:noProof/>
         </w:rPr>
         <w:drawing>
-          <wp:inline distT="0" distB="0" distL="0" distR="0" wp14:anchorId="00020582" wp14:editId="77A00B30">
-            <wp:extent cx="5400040" cy="2978150"/>
+          <wp:inline distT="0" distB="0" distL="0" distR="0" wp14:anchorId="5F51CAED" wp14:editId="44709C2C">
+            <wp:extent cx="5398770" cy="2977515"/>
             <wp:effectExtent l="0" t="0" r="0" b="0"/>
-            <wp:docPr id="163658730" name="Imagem 1"/>
+            <wp:docPr id="876482587" name="Imagem 3"/>
             <wp:cNvGraphicFramePr>
               <a:graphicFrameLocks xmlns:a="http://schemas.openxmlformats.org/drawingml/2006/main" noChangeAspect="1"/>
             </wp:cNvGraphicFramePr>
@@ -957,11 +957,125 @@
               <a:graphicData uri="http://schemas.openxmlformats.org/drawingml/2006/picture">
                 <pic:pic xmlns:pic="http://schemas.openxmlformats.org/drawingml/2006/picture">
                   <pic:nvPicPr>
-                    <pic:cNvPr id="163658730" name="Imagem 163658730"/>
+                    <pic:cNvPr id="0" name="Picture 1"/>
+                    <pic:cNvPicPr>
+                      <a:picLocks noChangeAspect="1" noChangeArrowheads="1"/>
+                    </pic:cNvPicPr>
+                  </pic:nvPicPr>
+                  <pic:blipFill>
+                    <a:blip r:embed="rId6">
+                      <a:extLst>
+                        <a:ext uri="{28A0092B-C50C-407E-A947-70E740481C1C}">
+                          <a14:useLocalDpi xmlns:a14="http://schemas.microsoft.com/office/drawing/2010/main" val="0"/>
+                        </a:ext>
+                      </a:extLst>
+                    </a:blip>
+                    <a:srcRect/>
+                    <a:stretch>
+                      <a:fillRect/>
+                    </a:stretch>
+                  </pic:blipFill>
+                  <pic:spPr bwMode="auto">
+                    <a:xfrm>
+                      <a:off x="0" y="0"/>
+                      <a:ext cx="5398770" cy="2977515"/>
+                    </a:xfrm>
+                    <a:prstGeom prst="rect">
+                      <a:avLst/>
+                    </a:prstGeom>
+                    <a:noFill/>
+                    <a:ln>
+                      <a:noFill/>
+                    </a:ln>
+                  </pic:spPr>
+                </pic:pic>
+              </a:graphicData>
+            </a:graphic>
+          </wp:inline>
+        </w:drawing>
+      </w:r>
+      <w:r>
+        <w:br w:type="page"/>
+      </w:r>
+    </w:p>
+    <w:p>
+      <w:pPr>
+        <w:pStyle w:val="Ttulo1"/>
+        <w:numPr>
+          <w:ilvl w:val="0"/>
+          <w:numId w:val="1"/>
+        </w:numPr>
+        <w:rPr>
+          <w:sz w:val="32"/>
+          <w:szCs w:val="32"/>
+        </w:rPr>
+      </w:pPr>
+      <w:bookmarkStart w:id="2" w:name="_heading=h.f7wfml2ywhnx" w:colFirst="0" w:colLast="0"/>
+      <w:bookmarkEnd w:id="2"/>
+      <w:r>
+        <w:rPr>
+          <w:sz w:val="32"/>
+          <w:szCs w:val="32"/>
+        </w:rPr>
+        <w:lastRenderedPageBreak/>
+        <w:t xml:space="preserve">Modelagem Lógica do Banco de Dados </w:t>
+      </w:r>
+    </w:p>
+    <w:p>
+      <w:pPr>
+        <w:spacing w:before="100" w:beforeAutospacing="1" w:after="100" w:afterAutospacing="1" w:line="240" w:lineRule="auto"/>
+        <w:rPr>
+          <w:rFonts w:ascii="Arial" w:eastAsia="Times New Roman" w:hAnsi="Arial" w:cs="Arial"/>
+          <w:b/>
+          <w:bCs/>
+          <w:sz w:val="24"/>
+          <w:szCs w:val="24"/>
+        </w:rPr>
+      </w:pPr>
+      <w:r>
+        <w:rPr>
+          <w:rFonts w:ascii="Arial" w:eastAsia="Times New Roman" w:hAnsi="Arial" w:cs="Arial"/>
+          <w:b/>
+          <w:bCs/>
+          <w:sz w:val="24"/>
+          <w:szCs w:val="24"/>
+        </w:rPr>
+        <w:t>MODELO LÓGICO:</w:t>
+      </w:r>
+    </w:p>
+    <w:p>
+      <w:pPr>
+        <w:spacing w:before="100" w:beforeAutospacing="1" w:after="100" w:afterAutospacing="1" w:line="240" w:lineRule="auto"/>
+        <w:rPr>
+          <w:rFonts w:ascii="Arial" w:eastAsia="Times New Roman" w:hAnsi="Arial" w:cs="Arial"/>
+          <w:sz w:val="24"/>
+          <w:szCs w:val="24"/>
+        </w:rPr>
+      </w:pPr>
+      <w:r>
+        <w:rPr>
+          <w:rFonts w:ascii="Arial" w:eastAsia="Times New Roman" w:hAnsi="Arial" w:cs="Arial"/>
+          <w:noProof/>
+          <w:sz w:val="24"/>
+          <w:szCs w:val="24"/>
+        </w:rPr>
+        <w:drawing>
+          <wp:inline distT="0" distB="0" distL="0" distR="0" wp14:anchorId="6055006F" wp14:editId="3C3AA1D7">
+            <wp:extent cx="5400040" cy="2792095"/>
+            <wp:effectExtent l="0" t="0" r="0" b="8255"/>
+            <wp:docPr id="604633785" name="Imagem 2"/>
+            <wp:cNvGraphicFramePr>
+              <a:graphicFrameLocks xmlns:a="http://schemas.openxmlformats.org/drawingml/2006/main" noChangeAspect="1"/>
+            </wp:cNvGraphicFramePr>
+            <a:graphic xmlns:a="http://schemas.openxmlformats.org/drawingml/2006/main">
+              <a:graphicData uri="http://schemas.openxmlformats.org/drawingml/2006/picture">
+                <pic:pic xmlns:pic="http://schemas.openxmlformats.org/drawingml/2006/picture">
+                  <pic:nvPicPr>
+                    <pic:cNvPr id="604633785" name="Imagem 604633785"/>
                     <pic:cNvPicPr/>
                   </pic:nvPicPr>
                   <pic:blipFill>
-                    <a:blip r:embed="rId6">
+                    <a:blip r:embed="rId7">
                       <a:extLst>
                         <a:ext uri="{28A0092B-C50C-407E-A947-70E740481C1C}">
                           <a14:useLocalDpi xmlns:a14="http://schemas.microsoft.com/office/drawing/2010/main" val="0"/>
@@ -975,7 +1089,7 @@
                   <pic:spPr>
                     <a:xfrm>
                       <a:off x="0" y="0"/>
-                      <a:ext cx="5400040" cy="2978150"/>
+                      <a:ext cx="5400040" cy="2792095"/>
                     </a:xfrm>
                     <a:prstGeom prst="rect">
                       <a:avLst/>
@@ -987,8 +1101,263 @@
           </wp:inline>
         </w:drawing>
       </w:r>
-      <w:r>
-        <w:br w:type="page"/>
+    </w:p>
+    <w:p>
+      <w:pPr>
+        <w:numPr>
+          <w:ilvl w:val="0"/>
+          <w:numId w:val="4"/>
+        </w:numPr>
+        <w:spacing w:before="100" w:beforeAutospacing="1" w:after="100" w:afterAutospacing="1" w:line="240" w:lineRule="auto"/>
+        <w:rPr>
+          <w:rFonts w:ascii="Arial" w:eastAsia="Times New Roman" w:hAnsi="Arial" w:cs="Arial"/>
+          <w:sz w:val="24"/>
+          <w:szCs w:val="24"/>
+        </w:rPr>
+      </w:pPr>
+      <w:r>
+        <w:rPr>
+          <w:rFonts w:ascii="Arial" w:eastAsia="Times New Roman" w:hAnsi="Arial" w:cs="Arial"/>
+          <w:sz w:val="24"/>
+          <w:szCs w:val="24"/>
+        </w:rPr>
+        <w:t>Instrutor(</w:t>
+      </w:r>
+      <w:r>
+        <w:rPr>
+          <w:rFonts w:ascii="Arial" w:eastAsia="Times New Roman" w:hAnsi="Arial" w:cs="Arial"/>
+          <w:b/>
+          <w:bCs/>
+          <w:sz w:val="24"/>
+          <w:szCs w:val="24"/>
+        </w:rPr>
+        <w:t>id_instrutor</w:t>
+      </w:r>
+      <w:r>
+        <w:rPr>
+          <w:rFonts w:ascii="Arial" w:eastAsia="Times New Roman" w:hAnsi="Arial" w:cs="Arial"/>
+          <w:sz w:val="24"/>
+          <w:szCs w:val="24"/>
+        </w:rPr>
+        <w:t>, nome, cpf, telefone, especialidade, horario_trabalho)</w:t>
+      </w:r>
+    </w:p>
+    <w:p>
+      <w:pPr>
+        <w:numPr>
+          <w:ilvl w:val="0"/>
+          <w:numId w:val="4"/>
+        </w:numPr>
+        <w:spacing w:before="100" w:beforeAutospacing="1" w:after="100" w:afterAutospacing="1" w:line="240" w:lineRule="auto"/>
+        <w:rPr>
+          <w:rFonts w:ascii="Arial" w:eastAsia="Times New Roman" w:hAnsi="Arial" w:cs="Arial"/>
+          <w:sz w:val="24"/>
+          <w:szCs w:val="24"/>
+        </w:rPr>
+      </w:pPr>
+      <w:r>
+        <w:rPr>
+          <w:rFonts w:ascii="Arial" w:eastAsia="Times New Roman" w:hAnsi="Arial" w:cs="Arial"/>
+          <w:sz w:val="24"/>
+          <w:szCs w:val="24"/>
+        </w:rPr>
+        <w:t>Plano(</w:t>
+      </w:r>
+      <w:r>
+        <w:rPr>
+          <w:rFonts w:ascii="Arial" w:eastAsia="Times New Roman" w:hAnsi="Arial" w:cs="Arial"/>
+          <w:b/>
+          <w:bCs/>
+          <w:sz w:val="24"/>
+          <w:szCs w:val="24"/>
+        </w:rPr>
+        <w:t>id_plano</w:t>
+      </w:r>
+      <w:r>
+        <w:rPr>
+          <w:rFonts w:ascii="Arial" w:eastAsia="Times New Roman" w:hAnsi="Arial" w:cs="Arial"/>
+          <w:sz w:val="24"/>
+          <w:szCs w:val="24"/>
+        </w:rPr>
+        <w:t>, nome, descricao, valor_mensal, duracao, beneficios)</w:t>
+      </w:r>
+    </w:p>
+    <w:p>
+      <w:pPr>
+        <w:numPr>
+          <w:ilvl w:val="0"/>
+          <w:numId w:val="4"/>
+        </w:numPr>
+        <w:spacing w:before="100" w:beforeAutospacing="1" w:after="100" w:afterAutospacing="1" w:line="240" w:lineRule="auto"/>
+        <w:rPr>
+          <w:rFonts w:ascii="Arial" w:eastAsia="Times New Roman" w:hAnsi="Arial" w:cs="Arial"/>
+          <w:sz w:val="24"/>
+          <w:szCs w:val="24"/>
+        </w:rPr>
+      </w:pPr>
+      <w:r>
+        <w:rPr>
+          <w:rFonts w:ascii="Arial" w:eastAsia="Times New Roman" w:hAnsi="Arial" w:cs="Arial"/>
+          <w:sz w:val="24"/>
+          <w:szCs w:val="24"/>
+        </w:rPr>
+        <w:t>Aula(</w:t>
+      </w:r>
+      <w:r>
+        <w:rPr>
+          <w:rFonts w:ascii="Arial" w:eastAsia="Times New Roman" w:hAnsi="Arial" w:cs="Arial"/>
+          <w:b/>
+          <w:bCs/>
+          <w:sz w:val="24"/>
+          <w:szCs w:val="24"/>
+        </w:rPr>
+        <w:t>id_aula</w:t>
+      </w:r>
+      <w:r>
+        <w:rPr>
+          <w:rFonts w:ascii="Arial" w:eastAsia="Times New Roman" w:hAnsi="Arial" w:cs="Arial"/>
+          <w:sz w:val="24"/>
+          <w:szCs w:val="24"/>
+        </w:rPr>
+        <w:t>, nome, descricao, capacidade_max, horario, codigo_instrutor)</w:t>
+      </w:r>
+    </w:p>
+    <w:p>
+      <w:pPr>
+        <w:numPr>
+          <w:ilvl w:val="0"/>
+          <w:numId w:val="4"/>
+        </w:numPr>
+        <w:spacing w:before="100" w:beforeAutospacing="1" w:after="100" w:afterAutospacing="1" w:line="240" w:lineRule="auto"/>
+        <w:rPr>
+          <w:rFonts w:ascii="Arial" w:eastAsia="Times New Roman" w:hAnsi="Arial" w:cs="Arial"/>
+          <w:sz w:val="24"/>
+          <w:szCs w:val="24"/>
+        </w:rPr>
+      </w:pPr>
+      <w:r>
+        <w:rPr>
+          <w:rFonts w:ascii="Arial" w:eastAsia="Times New Roman" w:hAnsi="Arial" w:cs="Arial"/>
+          <w:sz w:val="24"/>
+          <w:szCs w:val="24"/>
+        </w:rPr>
+        <w:t>Aluno(</w:t>
+      </w:r>
+      <w:r>
+        <w:rPr>
+          <w:rFonts w:ascii="Arial" w:eastAsia="Times New Roman" w:hAnsi="Arial" w:cs="Arial"/>
+          <w:b/>
+          <w:bCs/>
+          <w:sz w:val="24"/>
+          <w:szCs w:val="24"/>
+        </w:rPr>
+        <w:t>id_aluno</w:t>
+      </w:r>
+      <w:r>
+        <w:rPr>
+          <w:rFonts w:ascii="Arial" w:eastAsia="Times New Roman" w:hAnsi="Arial" w:cs="Arial"/>
+          <w:sz w:val="24"/>
+          <w:szCs w:val="24"/>
+        </w:rPr>
+        <w:t>, nome, cpf, dt_nascimento, telefone, email, dt_matricula, codigo_plano)</w:t>
+      </w:r>
+    </w:p>
+    <w:p>
+      <w:pPr>
+        <w:numPr>
+          <w:ilvl w:val="0"/>
+          <w:numId w:val="4"/>
+        </w:numPr>
+        <w:spacing w:before="100" w:beforeAutospacing="1" w:after="100" w:afterAutospacing="1" w:line="240" w:lineRule="auto"/>
+        <w:rPr>
+          <w:rFonts w:ascii="Arial" w:eastAsia="Times New Roman" w:hAnsi="Arial" w:cs="Arial"/>
+          <w:sz w:val="24"/>
+          <w:szCs w:val="24"/>
+        </w:rPr>
+      </w:pPr>
+      <w:r>
+        <w:rPr>
+          <w:rFonts w:ascii="Arial" w:eastAsia="Times New Roman" w:hAnsi="Arial" w:cs="Arial"/>
+          <w:sz w:val="24"/>
+          <w:szCs w:val="24"/>
+        </w:rPr>
+        <w:t>Frequencia(</w:t>
+      </w:r>
+      <w:r>
+        <w:rPr>
+          <w:rFonts w:ascii="Arial" w:eastAsia="Times New Roman" w:hAnsi="Arial" w:cs="Arial"/>
+          <w:b/>
+          <w:bCs/>
+          <w:sz w:val="24"/>
+          <w:szCs w:val="24"/>
+        </w:rPr>
+        <w:t>id_frequencia</w:t>
+      </w:r>
+      <w:r>
+        <w:rPr>
+          <w:rFonts w:ascii="Arial" w:eastAsia="Times New Roman" w:hAnsi="Arial" w:cs="Arial"/>
+          <w:sz w:val="24"/>
+          <w:szCs w:val="24"/>
+        </w:rPr>
+        <w:t>, data_entrada, hora_entrada, codigo_aluno)</w:t>
+      </w:r>
+    </w:p>
+    <w:p>
+      <w:pPr>
+        <w:numPr>
+          <w:ilvl w:val="0"/>
+          <w:numId w:val="4"/>
+        </w:numPr>
+        <w:spacing w:before="100" w:beforeAutospacing="1" w:after="100" w:afterAutospacing="1" w:line="240" w:lineRule="auto"/>
+        <w:rPr>
+          <w:rFonts w:ascii="Arial" w:eastAsia="Times New Roman" w:hAnsi="Arial" w:cs="Arial"/>
+          <w:sz w:val="24"/>
+          <w:szCs w:val="24"/>
+        </w:rPr>
+      </w:pPr>
+      <w:r>
+        <w:rPr>
+          <w:rFonts w:ascii="Arial" w:eastAsia="Times New Roman" w:hAnsi="Arial" w:cs="Arial"/>
+          <w:sz w:val="24"/>
+          <w:szCs w:val="24"/>
+        </w:rPr>
+        <w:t>Matricula</w:t>
+      </w:r>
+      <w:r>
+        <w:rPr>
+          <w:rFonts w:ascii="Arial" w:eastAsia="Times New Roman" w:hAnsi="Arial" w:cs="Arial"/>
+          <w:sz w:val="24"/>
+          <w:szCs w:val="24"/>
+        </w:rPr>
+        <w:t>(</w:t>
+      </w:r>
+      <w:r>
+        <w:rPr>
+          <w:rFonts w:ascii="Arial" w:eastAsia="Times New Roman" w:hAnsi="Arial" w:cs="Arial"/>
+          <w:b/>
+          <w:bCs/>
+          <w:sz w:val="24"/>
+          <w:szCs w:val="24"/>
+        </w:rPr>
+        <w:t>id_</w:t>
+      </w:r>
+      <w:r>
+        <w:rPr>
+          <w:rFonts w:ascii="Arial" w:eastAsia="Times New Roman" w:hAnsi="Arial" w:cs="Arial"/>
+          <w:b/>
+          <w:bCs/>
+          <w:sz w:val="24"/>
+          <w:szCs w:val="24"/>
+        </w:rPr>
+        <w:t>matricula</w:t>
+      </w:r>
+      <w:r>
+        <w:rPr>
+          <w:rFonts w:ascii="Arial" w:eastAsia="Times New Roman" w:hAnsi="Arial" w:cs="Arial"/>
+          <w:sz w:val="24"/>
+          <w:szCs w:val="24"/>
+        </w:rPr>
+        <w:t>, codigo_aluno, codigo_aula)</w:t>
       </w:r>
     </w:p>
     <w:p>
@@ -1003,693 +1372,6 @@
           <w:szCs w:val="32"/>
         </w:rPr>
       </w:pPr>
-      <w:bookmarkStart w:id="2" w:name="_heading=h.f7wfml2ywhnx" w:colFirst="0" w:colLast="0"/>
-      <w:bookmarkEnd w:id="2"/>
-      <w:r>
-        <w:rPr>
-          <w:sz w:val="32"/>
-          <w:szCs w:val="32"/>
-        </w:rPr>
-        <w:lastRenderedPageBreak/>
-        <w:t xml:space="preserve">Modelagem Lógica do Banco de Dados </w:t>
-      </w:r>
-    </w:p>
-    <w:p>
-      <w:pPr>
-        <w:spacing w:before="100" w:beforeAutospacing="1" w:after="100" w:afterAutospacing="1" w:line="240" w:lineRule="auto"/>
-        <w:rPr>
-          <w:rFonts w:ascii="Arial" w:eastAsia="Times New Roman" w:hAnsi="Arial" w:cs="Arial"/>
-          <w:sz w:val="24"/>
-          <w:szCs w:val="24"/>
-        </w:rPr>
-      </w:pPr>
-      <w:r>
-        <w:rPr>
-          <w:rFonts w:ascii="Arial" w:eastAsia="Times New Roman" w:hAnsi="Arial" w:cs="Arial"/>
-          <w:b/>
-          <w:bCs/>
-          <w:sz w:val="24"/>
-          <w:szCs w:val="24"/>
-        </w:rPr>
-        <w:t>MODELO LÓGICO:</w:t>
-      </w:r>
-    </w:p>
-    <w:p>
-      <w:pPr>
-        <w:numPr>
-          <w:ilvl w:val="0"/>
-          <w:numId w:val="4"/>
-        </w:numPr>
-        <w:spacing w:before="100" w:beforeAutospacing="1" w:after="100" w:afterAutospacing="1" w:line="240" w:lineRule="auto"/>
-        <w:rPr>
-          <w:rFonts w:ascii="Arial" w:eastAsia="Times New Roman" w:hAnsi="Arial" w:cs="Arial"/>
-          <w:sz w:val="24"/>
-          <w:szCs w:val="24"/>
-        </w:rPr>
-      </w:pPr>
-      <w:proofErr w:type="gramStart"/>
-      <w:r>
-        <w:rPr>
-          <w:rFonts w:ascii="Arial" w:eastAsia="Times New Roman" w:hAnsi="Arial" w:cs="Arial"/>
-          <w:sz w:val="24"/>
-          <w:szCs w:val="24"/>
-        </w:rPr>
-        <w:t>Instrutor(</w:t>
-      </w:r>
-      <w:proofErr w:type="spellStart"/>
-      <w:proofErr w:type="gramEnd"/>
-      <w:r>
-        <w:rPr>
-          <w:rFonts w:ascii="Arial" w:eastAsia="Times New Roman" w:hAnsi="Arial" w:cs="Arial"/>
-          <w:b/>
-          <w:bCs/>
-          <w:sz w:val="24"/>
-          <w:szCs w:val="24"/>
-        </w:rPr>
-        <w:t>id_instrutor</w:t>
-      </w:r>
-      <w:proofErr w:type="spellEnd"/>
-      <w:r>
-        <w:rPr>
-          <w:rFonts w:ascii="Arial" w:eastAsia="Times New Roman" w:hAnsi="Arial" w:cs="Arial"/>
-          <w:sz w:val="24"/>
-          <w:szCs w:val="24"/>
-        </w:rPr>
-        <w:t xml:space="preserve">, nome, </w:t>
-      </w:r>
-      <w:proofErr w:type="spellStart"/>
-      <w:r>
-        <w:rPr>
-          <w:rFonts w:ascii="Arial" w:eastAsia="Times New Roman" w:hAnsi="Arial" w:cs="Arial"/>
-          <w:sz w:val="24"/>
-          <w:szCs w:val="24"/>
-        </w:rPr>
-        <w:t>cpf</w:t>
-      </w:r>
-      <w:proofErr w:type="spellEnd"/>
-      <w:r>
-        <w:rPr>
-          <w:rFonts w:ascii="Arial" w:eastAsia="Times New Roman" w:hAnsi="Arial" w:cs="Arial"/>
-          <w:sz w:val="24"/>
-          <w:szCs w:val="24"/>
-        </w:rPr>
-        <w:t xml:space="preserve">, telefone, especialidade, </w:t>
-      </w:r>
-      <w:proofErr w:type="spellStart"/>
-      <w:r>
-        <w:rPr>
-          <w:rFonts w:ascii="Arial" w:eastAsia="Times New Roman" w:hAnsi="Arial" w:cs="Arial"/>
-          <w:sz w:val="24"/>
-          <w:szCs w:val="24"/>
-        </w:rPr>
-        <w:t>horario_trabalho</w:t>
-      </w:r>
-      <w:proofErr w:type="spellEnd"/>
-      <w:r>
-        <w:rPr>
-          <w:rFonts w:ascii="Arial" w:eastAsia="Times New Roman" w:hAnsi="Arial" w:cs="Arial"/>
-          <w:sz w:val="24"/>
-          <w:szCs w:val="24"/>
-        </w:rPr>
-        <w:t>)</w:t>
-      </w:r>
-    </w:p>
-    <w:p>
-      <w:pPr>
-        <w:numPr>
-          <w:ilvl w:val="0"/>
-          <w:numId w:val="4"/>
-        </w:numPr>
-        <w:spacing w:before="100" w:beforeAutospacing="1" w:after="100" w:afterAutospacing="1" w:line="240" w:lineRule="auto"/>
-        <w:rPr>
-          <w:rFonts w:ascii="Arial" w:eastAsia="Times New Roman" w:hAnsi="Arial" w:cs="Arial"/>
-          <w:sz w:val="24"/>
-          <w:szCs w:val="24"/>
-        </w:rPr>
-      </w:pPr>
-      <w:proofErr w:type="gramStart"/>
-      <w:r>
-        <w:rPr>
-          <w:rFonts w:ascii="Arial" w:eastAsia="Times New Roman" w:hAnsi="Arial" w:cs="Arial"/>
-          <w:sz w:val="24"/>
-          <w:szCs w:val="24"/>
-        </w:rPr>
-        <w:t>Plano(</w:t>
-      </w:r>
-      <w:proofErr w:type="spellStart"/>
-      <w:proofErr w:type="gramEnd"/>
-      <w:r>
-        <w:rPr>
-          <w:rFonts w:ascii="Arial" w:eastAsia="Times New Roman" w:hAnsi="Arial" w:cs="Arial"/>
-          <w:b/>
-          <w:bCs/>
-          <w:sz w:val="24"/>
-          <w:szCs w:val="24"/>
-        </w:rPr>
-        <w:t>id_plano</w:t>
-      </w:r>
-      <w:proofErr w:type="spellEnd"/>
-      <w:r>
-        <w:rPr>
-          <w:rFonts w:ascii="Arial" w:eastAsia="Times New Roman" w:hAnsi="Arial" w:cs="Arial"/>
-          <w:sz w:val="24"/>
-          <w:szCs w:val="24"/>
-        </w:rPr>
-        <w:t xml:space="preserve">, nome, </w:t>
-      </w:r>
-      <w:proofErr w:type="spellStart"/>
-      <w:r>
-        <w:rPr>
-          <w:rFonts w:ascii="Arial" w:eastAsia="Times New Roman" w:hAnsi="Arial" w:cs="Arial"/>
-          <w:sz w:val="24"/>
-          <w:szCs w:val="24"/>
-        </w:rPr>
-        <w:t>descricao</w:t>
-      </w:r>
-      <w:proofErr w:type="spellEnd"/>
-      <w:r>
-        <w:rPr>
-          <w:rFonts w:ascii="Arial" w:eastAsia="Times New Roman" w:hAnsi="Arial" w:cs="Arial"/>
-          <w:sz w:val="24"/>
-          <w:szCs w:val="24"/>
-        </w:rPr>
-        <w:t xml:space="preserve">, </w:t>
-      </w:r>
-      <w:proofErr w:type="spellStart"/>
-      <w:r>
-        <w:rPr>
-          <w:rFonts w:ascii="Arial" w:eastAsia="Times New Roman" w:hAnsi="Arial" w:cs="Arial"/>
-          <w:sz w:val="24"/>
-          <w:szCs w:val="24"/>
-        </w:rPr>
-        <w:t>valor_mensal</w:t>
-      </w:r>
-      <w:proofErr w:type="spellEnd"/>
-      <w:r>
-        <w:rPr>
-          <w:rFonts w:ascii="Arial" w:eastAsia="Times New Roman" w:hAnsi="Arial" w:cs="Arial"/>
-          <w:sz w:val="24"/>
-          <w:szCs w:val="24"/>
-        </w:rPr>
-        <w:t xml:space="preserve">, </w:t>
-      </w:r>
-      <w:proofErr w:type="spellStart"/>
-      <w:r>
-        <w:rPr>
-          <w:rFonts w:ascii="Arial" w:eastAsia="Times New Roman" w:hAnsi="Arial" w:cs="Arial"/>
-          <w:sz w:val="24"/>
-          <w:szCs w:val="24"/>
-        </w:rPr>
-        <w:t>duracao</w:t>
-      </w:r>
-      <w:proofErr w:type="spellEnd"/>
-      <w:r>
-        <w:rPr>
-          <w:rFonts w:ascii="Arial" w:eastAsia="Times New Roman" w:hAnsi="Arial" w:cs="Arial"/>
-          <w:sz w:val="24"/>
-          <w:szCs w:val="24"/>
-        </w:rPr>
-        <w:t xml:space="preserve">, </w:t>
-      </w:r>
-      <w:proofErr w:type="spellStart"/>
-      <w:r>
-        <w:rPr>
-          <w:rFonts w:ascii="Arial" w:eastAsia="Times New Roman" w:hAnsi="Arial" w:cs="Arial"/>
-          <w:sz w:val="24"/>
-          <w:szCs w:val="24"/>
-        </w:rPr>
-        <w:t>beneficios</w:t>
-      </w:r>
-      <w:proofErr w:type="spellEnd"/>
-      <w:r>
-        <w:rPr>
-          <w:rFonts w:ascii="Arial" w:eastAsia="Times New Roman" w:hAnsi="Arial" w:cs="Arial"/>
-          <w:sz w:val="24"/>
-          <w:szCs w:val="24"/>
-        </w:rPr>
-        <w:t>)</w:t>
-      </w:r>
-    </w:p>
-    <w:p>
-      <w:pPr>
-        <w:numPr>
-          <w:ilvl w:val="0"/>
-          <w:numId w:val="4"/>
-        </w:numPr>
-        <w:spacing w:before="100" w:beforeAutospacing="1" w:after="100" w:afterAutospacing="1" w:line="240" w:lineRule="auto"/>
-        <w:rPr>
-          <w:rFonts w:ascii="Arial" w:eastAsia="Times New Roman" w:hAnsi="Arial" w:cs="Arial"/>
-          <w:sz w:val="24"/>
-          <w:szCs w:val="24"/>
-        </w:rPr>
-      </w:pPr>
-      <w:proofErr w:type="gramStart"/>
-      <w:r>
-        <w:rPr>
-          <w:rFonts w:ascii="Arial" w:eastAsia="Times New Roman" w:hAnsi="Arial" w:cs="Arial"/>
-          <w:sz w:val="24"/>
-          <w:szCs w:val="24"/>
-        </w:rPr>
-        <w:t>Aula(</w:t>
-      </w:r>
-      <w:proofErr w:type="spellStart"/>
-      <w:proofErr w:type="gramEnd"/>
-      <w:r>
-        <w:rPr>
-          <w:rFonts w:ascii="Arial" w:eastAsia="Times New Roman" w:hAnsi="Arial" w:cs="Arial"/>
-          <w:b/>
-          <w:bCs/>
-          <w:sz w:val="24"/>
-          <w:szCs w:val="24"/>
-        </w:rPr>
-        <w:t>id_aula</w:t>
-      </w:r>
-      <w:proofErr w:type="spellEnd"/>
-      <w:r>
-        <w:rPr>
-          <w:rFonts w:ascii="Arial" w:eastAsia="Times New Roman" w:hAnsi="Arial" w:cs="Arial"/>
-          <w:sz w:val="24"/>
-          <w:szCs w:val="24"/>
-        </w:rPr>
-        <w:t xml:space="preserve">, nome, </w:t>
-      </w:r>
-      <w:proofErr w:type="spellStart"/>
-      <w:r>
-        <w:rPr>
-          <w:rFonts w:ascii="Arial" w:eastAsia="Times New Roman" w:hAnsi="Arial" w:cs="Arial"/>
-          <w:sz w:val="24"/>
-          <w:szCs w:val="24"/>
-        </w:rPr>
-        <w:t>descricao</w:t>
-      </w:r>
-      <w:proofErr w:type="spellEnd"/>
-      <w:r>
-        <w:rPr>
-          <w:rFonts w:ascii="Arial" w:eastAsia="Times New Roman" w:hAnsi="Arial" w:cs="Arial"/>
-          <w:sz w:val="24"/>
-          <w:szCs w:val="24"/>
-        </w:rPr>
-        <w:t xml:space="preserve">, </w:t>
-      </w:r>
-      <w:proofErr w:type="spellStart"/>
-      <w:r>
-        <w:rPr>
-          <w:rFonts w:ascii="Arial" w:eastAsia="Times New Roman" w:hAnsi="Arial" w:cs="Arial"/>
-          <w:sz w:val="24"/>
-          <w:szCs w:val="24"/>
-        </w:rPr>
-        <w:t>capacidade_max</w:t>
-      </w:r>
-      <w:proofErr w:type="spellEnd"/>
-      <w:r>
-        <w:rPr>
-          <w:rFonts w:ascii="Arial" w:eastAsia="Times New Roman" w:hAnsi="Arial" w:cs="Arial"/>
-          <w:sz w:val="24"/>
-          <w:szCs w:val="24"/>
-        </w:rPr>
-        <w:t xml:space="preserve">, </w:t>
-      </w:r>
-      <w:proofErr w:type="spellStart"/>
-      <w:r>
-        <w:rPr>
-          <w:rFonts w:ascii="Arial" w:eastAsia="Times New Roman" w:hAnsi="Arial" w:cs="Arial"/>
-          <w:sz w:val="24"/>
-          <w:szCs w:val="24"/>
-        </w:rPr>
-        <w:t>horario</w:t>
-      </w:r>
-      <w:proofErr w:type="spellEnd"/>
-      <w:r>
-        <w:rPr>
-          <w:rFonts w:ascii="Arial" w:eastAsia="Times New Roman" w:hAnsi="Arial" w:cs="Arial"/>
-          <w:sz w:val="24"/>
-          <w:szCs w:val="24"/>
-        </w:rPr>
-        <w:t xml:space="preserve">, </w:t>
-      </w:r>
-      <w:proofErr w:type="spellStart"/>
-      <w:r>
-        <w:rPr>
-          <w:rFonts w:ascii="Arial" w:eastAsia="Times New Roman" w:hAnsi="Arial" w:cs="Arial"/>
-          <w:sz w:val="24"/>
-          <w:szCs w:val="24"/>
-        </w:rPr>
-        <w:t>codigo_instrutor</w:t>
-      </w:r>
-      <w:proofErr w:type="spellEnd"/>
-      <w:r>
-        <w:rPr>
-          <w:rFonts w:ascii="Arial" w:eastAsia="Times New Roman" w:hAnsi="Arial" w:cs="Arial"/>
-          <w:sz w:val="24"/>
-          <w:szCs w:val="24"/>
-        </w:rPr>
-        <w:t>)</w:t>
-      </w:r>
-    </w:p>
-    <w:p>
-      <w:pPr>
-        <w:numPr>
-          <w:ilvl w:val="0"/>
-          <w:numId w:val="4"/>
-        </w:numPr>
-        <w:spacing w:before="100" w:beforeAutospacing="1" w:after="100" w:afterAutospacing="1" w:line="240" w:lineRule="auto"/>
-        <w:rPr>
-          <w:rFonts w:ascii="Arial" w:eastAsia="Times New Roman" w:hAnsi="Arial" w:cs="Arial"/>
-          <w:sz w:val="24"/>
-          <w:szCs w:val="24"/>
-        </w:rPr>
-      </w:pPr>
-      <w:proofErr w:type="gramStart"/>
-      <w:r>
-        <w:rPr>
-          <w:rFonts w:ascii="Arial" w:eastAsia="Times New Roman" w:hAnsi="Arial" w:cs="Arial"/>
-          <w:sz w:val="24"/>
-          <w:szCs w:val="24"/>
-        </w:rPr>
-        <w:t>Aluno(</w:t>
-      </w:r>
-      <w:proofErr w:type="spellStart"/>
-      <w:proofErr w:type="gramEnd"/>
-      <w:r>
-        <w:rPr>
-          <w:rFonts w:ascii="Arial" w:eastAsia="Times New Roman" w:hAnsi="Arial" w:cs="Arial"/>
-          <w:b/>
-          <w:bCs/>
-          <w:sz w:val="24"/>
-          <w:szCs w:val="24"/>
-        </w:rPr>
-        <w:t>id_aluno</w:t>
-      </w:r>
-      <w:proofErr w:type="spellEnd"/>
-      <w:r>
-        <w:rPr>
-          <w:rFonts w:ascii="Arial" w:eastAsia="Times New Roman" w:hAnsi="Arial" w:cs="Arial"/>
-          <w:sz w:val="24"/>
-          <w:szCs w:val="24"/>
-        </w:rPr>
-        <w:t xml:space="preserve">, nome, </w:t>
-      </w:r>
-      <w:proofErr w:type="spellStart"/>
-      <w:r>
-        <w:rPr>
-          <w:rFonts w:ascii="Arial" w:eastAsia="Times New Roman" w:hAnsi="Arial" w:cs="Arial"/>
-          <w:sz w:val="24"/>
-          <w:szCs w:val="24"/>
-        </w:rPr>
-        <w:t>cpf</w:t>
-      </w:r>
-      <w:proofErr w:type="spellEnd"/>
-      <w:r>
-        <w:rPr>
-          <w:rFonts w:ascii="Arial" w:eastAsia="Times New Roman" w:hAnsi="Arial" w:cs="Arial"/>
-          <w:sz w:val="24"/>
-          <w:szCs w:val="24"/>
-        </w:rPr>
-        <w:t xml:space="preserve">, </w:t>
-      </w:r>
-      <w:proofErr w:type="spellStart"/>
-      <w:r>
-        <w:rPr>
-          <w:rFonts w:ascii="Arial" w:eastAsia="Times New Roman" w:hAnsi="Arial" w:cs="Arial"/>
-          <w:sz w:val="24"/>
-          <w:szCs w:val="24"/>
-        </w:rPr>
-        <w:t>dt_nascimento</w:t>
-      </w:r>
-      <w:proofErr w:type="spellEnd"/>
-      <w:r>
-        <w:rPr>
-          <w:rFonts w:ascii="Arial" w:eastAsia="Times New Roman" w:hAnsi="Arial" w:cs="Arial"/>
-          <w:sz w:val="24"/>
-          <w:szCs w:val="24"/>
-        </w:rPr>
-        <w:t xml:space="preserve">, telefone, </w:t>
-      </w:r>
-      <w:proofErr w:type="spellStart"/>
-      <w:r>
-        <w:rPr>
-          <w:rFonts w:ascii="Arial" w:eastAsia="Times New Roman" w:hAnsi="Arial" w:cs="Arial"/>
-          <w:sz w:val="24"/>
-          <w:szCs w:val="24"/>
-        </w:rPr>
-        <w:t>email</w:t>
-      </w:r>
-      <w:proofErr w:type="spellEnd"/>
-      <w:r>
-        <w:rPr>
-          <w:rFonts w:ascii="Arial" w:eastAsia="Times New Roman" w:hAnsi="Arial" w:cs="Arial"/>
-          <w:sz w:val="24"/>
-          <w:szCs w:val="24"/>
-        </w:rPr>
-        <w:t xml:space="preserve">, </w:t>
-      </w:r>
-      <w:proofErr w:type="spellStart"/>
-      <w:r>
-        <w:rPr>
-          <w:rFonts w:ascii="Arial" w:eastAsia="Times New Roman" w:hAnsi="Arial" w:cs="Arial"/>
-          <w:sz w:val="24"/>
-          <w:szCs w:val="24"/>
-        </w:rPr>
-        <w:t>dt_</w:t>
-      </w:r>
-      <w:proofErr w:type="gramStart"/>
-      <w:r>
-        <w:rPr>
-          <w:rFonts w:ascii="Arial" w:eastAsia="Times New Roman" w:hAnsi="Arial" w:cs="Arial"/>
-          <w:sz w:val="24"/>
-          <w:szCs w:val="24"/>
-        </w:rPr>
-        <w:t>matricula</w:t>
-      </w:r>
-      <w:proofErr w:type="spellEnd"/>
-      <w:proofErr w:type="gramEnd"/>
-      <w:r>
-        <w:rPr>
-          <w:rFonts w:ascii="Arial" w:eastAsia="Times New Roman" w:hAnsi="Arial" w:cs="Arial"/>
-          <w:sz w:val="24"/>
-          <w:szCs w:val="24"/>
-        </w:rPr>
-        <w:t xml:space="preserve">, </w:t>
-      </w:r>
-      <w:proofErr w:type="spellStart"/>
-      <w:r>
-        <w:rPr>
-          <w:rFonts w:ascii="Arial" w:eastAsia="Times New Roman" w:hAnsi="Arial" w:cs="Arial"/>
-          <w:sz w:val="24"/>
-          <w:szCs w:val="24"/>
-        </w:rPr>
-        <w:t>codigo_plano</w:t>
-      </w:r>
-      <w:proofErr w:type="spellEnd"/>
-      <w:r>
-        <w:rPr>
-          <w:rFonts w:ascii="Arial" w:eastAsia="Times New Roman" w:hAnsi="Arial" w:cs="Arial"/>
-          <w:sz w:val="24"/>
-          <w:szCs w:val="24"/>
-        </w:rPr>
-        <w:t>)</w:t>
-      </w:r>
-    </w:p>
-    <w:p>
-      <w:pPr>
-        <w:numPr>
-          <w:ilvl w:val="0"/>
-          <w:numId w:val="4"/>
-        </w:numPr>
-        <w:spacing w:before="100" w:beforeAutospacing="1" w:after="100" w:afterAutospacing="1" w:line="240" w:lineRule="auto"/>
-        <w:rPr>
-          <w:rFonts w:ascii="Arial" w:eastAsia="Times New Roman" w:hAnsi="Arial" w:cs="Arial"/>
-          <w:sz w:val="24"/>
-          <w:szCs w:val="24"/>
-        </w:rPr>
-      </w:pPr>
-      <w:proofErr w:type="spellStart"/>
-      <w:proofErr w:type="gramStart"/>
-      <w:r>
-        <w:rPr>
-          <w:rFonts w:ascii="Arial" w:eastAsia="Times New Roman" w:hAnsi="Arial" w:cs="Arial"/>
-          <w:sz w:val="24"/>
-          <w:szCs w:val="24"/>
-        </w:rPr>
-        <w:t>Frequencia</w:t>
-      </w:r>
-      <w:proofErr w:type="spellEnd"/>
-      <w:r>
-        <w:rPr>
-          <w:rFonts w:ascii="Arial" w:eastAsia="Times New Roman" w:hAnsi="Arial" w:cs="Arial"/>
-          <w:sz w:val="24"/>
-          <w:szCs w:val="24"/>
-        </w:rPr>
-        <w:t>(</w:t>
-      </w:r>
-      <w:proofErr w:type="spellStart"/>
-      <w:proofErr w:type="gramEnd"/>
-      <w:r>
-        <w:rPr>
-          <w:rFonts w:ascii="Arial" w:eastAsia="Times New Roman" w:hAnsi="Arial" w:cs="Arial"/>
-          <w:b/>
-          <w:bCs/>
-          <w:sz w:val="24"/>
-          <w:szCs w:val="24"/>
-        </w:rPr>
-        <w:t>id_frequencia</w:t>
-      </w:r>
-      <w:proofErr w:type="spellEnd"/>
-      <w:r>
-        <w:rPr>
-          <w:rFonts w:ascii="Arial" w:eastAsia="Times New Roman" w:hAnsi="Arial" w:cs="Arial"/>
-          <w:sz w:val="24"/>
-          <w:szCs w:val="24"/>
-        </w:rPr>
-        <w:t xml:space="preserve">, </w:t>
-      </w:r>
-      <w:proofErr w:type="spellStart"/>
-      <w:r>
-        <w:rPr>
-          <w:rFonts w:ascii="Arial" w:eastAsia="Times New Roman" w:hAnsi="Arial" w:cs="Arial"/>
-          <w:sz w:val="24"/>
-          <w:szCs w:val="24"/>
-        </w:rPr>
-        <w:t>data_entrada</w:t>
-      </w:r>
-      <w:proofErr w:type="spellEnd"/>
-      <w:r>
-        <w:rPr>
-          <w:rFonts w:ascii="Arial" w:eastAsia="Times New Roman" w:hAnsi="Arial" w:cs="Arial"/>
-          <w:sz w:val="24"/>
-          <w:szCs w:val="24"/>
-        </w:rPr>
-        <w:t xml:space="preserve">, </w:t>
-      </w:r>
-      <w:proofErr w:type="spellStart"/>
-      <w:r>
-        <w:rPr>
-          <w:rFonts w:ascii="Arial" w:eastAsia="Times New Roman" w:hAnsi="Arial" w:cs="Arial"/>
-          <w:sz w:val="24"/>
-          <w:szCs w:val="24"/>
-        </w:rPr>
-        <w:t>hora_entrada</w:t>
-      </w:r>
-      <w:proofErr w:type="spellEnd"/>
-      <w:r>
-        <w:rPr>
-          <w:rFonts w:ascii="Arial" w:eastAsia="Times New Roman" w:hAnsi="Arial" w:cs="Arial"/>
-          <w:sz w:val="24"/>
-          <w:szCs w:val="24"/>
-        </w:rPr>
-        <w:t xml:space="preserve">, </w:t>
-      </w:r>
-      <w:proofErr w:type="spellStart"/>
-      <w:r>
-        <w:rPr>
-          <w:rFonts w:ascii="Arial" w:eastAsia="Times New Roman" w:hAnsi="Arial" w:cs="Arial"/>
-          <w:sz w:val="24"/>
-          <w:szCs w:val="24"/>
-        </w:rPr>
-        <w:t>codigo_aluno</w:t>
-      </w:r>
-      <w:proofErr w:type="spellEnd"/>
-      <w:r>
-        <w:rPr>
-          <w:rFonts w:ascii="Arial" w:eastAsia="Times New Roman" w:hAnsi="Arial" w:cs="Arial"/>
-          <w:sz w:val="24"/>
-          <w:szCs w:val="24"/>
-        </w:rPr>
-        <w:t>)</w:t>
-      </w:r>
-    </w:p>
-    <w:p>
-      <w:pPr>
-        <w:numPr>
-          <w:ilvl w:val="0"/>
-          <w:numId w:val="4"/>
-        </w:numPr>
-        <w:spacing w:before="100" w:beforeAutospacing="1" w:after="100" w:afterAutospacing="1" w:line="240" w:lineRule="auto"/>
-        <w:rPr>
-          <w:rFonts w:ascii="Arial" w:eastAsia="Times New Roman" w:hAnsi="Arial" w:cs="Arial"/>
-          <w:sz w:val="24"/>
-          <w:szCs w:val="24"/>
-        </w:rPr>
-      </w:pPr>
-      <w:proofErr w:type="gramStart"/>
-      <w:r>
-        <w:rPr>
-          <w:rFonts w:ascii="Arial" w:eastAsia="Times New Roman" w:hAnsi="Arial" w:cs="Arial"/>
-          <w:sz w:val="24"/>
-          <w:szCs w:val="24"/>
-        </w:rPr>
-        <w:t>Inscreve(</w:t>
-      </w:r>
-      <w:proofErr w:type="spellStart"/>
-      <w:proofErr w:type="gramEnd"/>
-      <w:r>
-        <w:rPr>
-          <w:rFonts w:ascii="Arial" w:eastAsia="Times New Roman" w:hAnsi="Arial" w:cs="Arial"/>
-          <w:b/>
-          <w:bCs/>
-          <w:sz w:val="24"/>
-          <w:szCs w:val="24"/>
-        </w:rPr>
-        <w:t>id_inscreve</w:t>
-      </w:r>
-      <w:proofErr w:type="spellEnd"/>
-      <w:r>
-        <w:rPr>
-          <w:rFonts w:ascii="Arial" w:eastAsia="Times New Roman" w:hAnsi="Arial" w:cs="Arial"/>
-          <w:sz w:val="24"/>
-          <w:szCs w:val="24"/>
-        </w:rPr>
-        <w:t xml:space="preserve">, </w:t>
-      </w:r>
-      <w:proofErr w:type="spellStart"/>
-      <w:r>
-        <w:rPr>
-          <w:rFonts w:ascii="Arial" w:eastAsia="Times New Roman" w:hAnsi="Arial" w:cs="Arial"/>
-          <w:sz w:val="24"/>
-          <w:szCs w:val="24"/>
-        </w:rPr>
-        <w:t>codigo_aluno</w:t>
-      </w:r>
-      <w:proofErr w:type="spellEnd"/>
-      <w:r>
-        <w:rPr>
-          <w:rFonts w:ascii="Arial" w:eastAsia="Times New Roman" w:hAnsi="Arial" w:cs="Arial"/>
-          <w:sz w:val="24"/>
-          <w:szCs w:val="24"/>
-        </w:rPr>
-        <w:t xml:space="preserve">, </w:t>
-      </w:r>
-      <w:proofErr w:type="spellStart"/>
-      <w:r>
-        <w:rPr>
-          <w:rFonts w:ascii="Arial" w:eastAsia="Times New Roman" w:hAnsi="Arial" w:cs="Arial"/>
-          <w:sz w:val="24"/>
-          <w:szCs w:val="24"/>
-        </w:rPr>
-        <w:t>codigo_aula</w:t>
-      </w:r>
-      <w:proofErr w:type="spellEnd"/>
-      <w:r>
-        <w:rPr>
-          <w:rFonts w:ascii="Arial" w:eastAsia="Times New Roman" w:hAnsi="Arial" w:cs="Arial"/>
-          <w:sz w:val="24"/>
-          <w:szCs w:val="24"/>
-        </w:rPr>
-        <w:t>)</w:t>
-      </w:r>
-    </w:p>
-    <w:p>
-      <w:pPr>
-        <w:pStyle w:val="Ttulo1"/>
-        <w:numPr>
-          <w:ilvl w:val="0"/>
-          <w:numId w:val="1"/>
-        </w:numPr>
-        <w:rPr>
-          <w:sz w:val="32"/>
-          <w:szCs w:val="32"/>
-        </w:rPr>
-      </w:pPr>
       <w:r>
         <w:rPr>
           <w:sz w:val="32"/>
@@ -1706,13 +1388,7 @@
         <w:t xml:space="preserve"> de Dados</w:t>
       </w:r>
     </w:p>
-    <w:p>
-      <w:pPr>
-        <w:rPr>
-          <w:rFonts w:ascii="Arial" w:eastAsia="Arial" w:hAnsi="Arial" w:cs="Arial"/>
-        </w:rPr>
-      </w:pPr>
-    </w:p>
+    <w:p/>
     <w:p>
       <w:pPr>
         <w:rPr>
@@ -1777,7 +1453,6 @@
                 <w:rFonts w:ascii="Arial" w:hAnsi="Arial" w:cs="Arial"/>
               </w:rPr>
             </w:pPr>
-            <w:proofErr w:type="spellStart"/>
             <w:r>
               <w:rPr>
                 <w:rFonts w:ascii="Arial" w:hAnsi="Arial" w:cs="Arial"/>
@@ -1786,7 +1461,6 @@
               </w:rPr>
               <w:t>Coluna</w:t>
             </w:r>
-            <w:proofErr w:type="spellEnd"/>
           </w:p>
         </w:tc>
         <w:tc>
@@ -1813,25 +1487,7 @@
                 <w:b/>
                 <w:sz w:val="16"/>
               </w:rPr>
-              <w:t>Tipo (</w:t>
-            </w:r>
-            <w:proofErr w:type="spellStart"/>
-            <w:r>
-              <w:rPr>
-                <w:rFonts w:ascii="Arial" w:hAnsi="Arial" w:cs="Arial"/>
-                <w:b/>
-                <w:sz w:val="16"/>
-              </w:rPr>
-              <w:t>tamanho</w:t>
-            </w:r>
-            <w:proofErr w:type="spellEnd"/>
-            <w:r>
-              <w:rPr>
-                <w:rFonts w:ascii="Arial" w:hAnsi="Arial" w:cs="Arial"/>
-                <w:b/>
-                <w:sz w:val="16"/>
-              </w:rPr>
-              <w:t>)</w:t>
+              <w:t>Tipo (tamanho)</w:t>
             </w:r>
           </w:p>
         </w:tc>
@@ -1881,7 +1537,6 @@
                 <w:rFonts w:ascii="Arial" w:hAnsi="Arial" w:cs="Arial"/>
               </w:rPr>
             </w:pPr>
-            <w:proofErr w:type="spellStart"/>
             <w:r>
               <w:rPr>
                 <w:rFonts w:ascii="Arial" w:hAnsi="Arial" w:cs="Arial"/>
@@ -1890,7 +1545,6 @@
               </w:rPr>
               <w:t>Descrição</w:t>
             </w:r>
-            <w:proofErr w:type="spellEnd"/>
           </w:p>
         </w:tc>
       </w:tr>
@@ -1916,7 +1570,6 @@
                 <w:rFonts w:ascii="Arial" w:hAnsi="Arial" w:cs="Arial"/>
               </w:rPr>
             </w:pPr>
-            <w:proofErr w:type="spellStart"/>
             <w:r>
               <w:rPr>
                 <w:rFonts w:ascii="Arial" w:hAnsi="Arial" w:cs="Arial"/>
@@ -1924,7 +1577,6 @@
               </w:rPr>
               <w:t>id_instrutor</w:t>
             </w:r>
-            <w:proofErr w:type="spellEnd"/>
           </w:p>
         </w:tc>
         <w:tc>
@@ -2033,7 +1685,6 @@
                 <w:rFonts w:ascii="Arial" w:hAnsi="Arial" w:cs="Arial"/>
               </w:rPr>
             </w:pPr>
-            <w:proofErr w:type="spellStart"/>
             <w:r>
               <w:rPr>
                 <w:rFonts w:ascii="Arial" w:hAnsi="Arial" w:cs="Arial"/>
@@ -2041,7 +1692,6 @@
               </w:rPr>
               <w:t>nome</w:t>
             </w:r>
-            <w:proofErr w:type="spellEnd"/>
           </w:p>
         </w:tc>
         <w:tc>
@@ -2062,21 +1712,12 @@
                 <w:rFonts w:ascii="Arial" w:hAnsi="Arial" w:cs="Arial"/>
               </w:rPr>
             </w:pPr>
-            <w:proofErr w:type="gramStart"/>
-            <w:r>
-              <w:rPr>
-                <w:rFonts w:ascii="Arial" w:hAnsi="Arial" w:cs="Arial"/>
-                <w:sz w:val="16"/>
-              </w:rPr>
-              <w:t>VARCHAR(</w:t>
-            </w:r>
-            <w:proofErr w:type="gramEnd"/>
-            <w:r>
-              <w:rPr>
-                <w:rFonts w:ascii="Arial" w:hAnsi="Arial" w:cs="Arial"/>
-                <w:sz w:val="16"/>
-              </w:rPr>
-              <w:t>30)</w:t>
+            <w:r>
+              <w:rPr>
+                <w:rFonts w:ascii="Arial" w:hAnsi="Arial" w:cs="Arial"/>
+                <w:sz w:val="16"/>
+              </w:rPr>
+              <w:t>VARCHAR(30)</w:t>
             </w:r>
           </w:p>
         </w:tc>
@@ -2130,23 +1771,7 @@
                 <w:rFonts w:ascii="Arial" w:hAnsi="Arial" w:cs="Arial"/>
                 <w:sz w:val="16"/>
               </w:rPr>
-              <w:t xml:space="preserve">Nome do </w:t>
-            </w:r>
-            <w:proofErr w:type="spellStart"/>
-            <w:r>
-              <w:rPr>
-                <w:rFonts w:ascii="Arial" w:hAnsi="Arial" w:cs="Arial"/>
-                <w:sz w:val="16"/>
-              </w:rPr>
-              <w:t>instrutor</w:t>
-            </w:r>
-            <w:proofErr w:type="spellEnd"/>
-            <w:r>
-              <w:rPr>
-                <w:rFonts w:ascii="Arial" w:hAnsi="Arial" w:cs="Arial"/>
-                <w:sz w:val="16"/>
-              </w:rPr>
-              <w:t>.</w:t>
+              <w:t>Nome do instrutor.</w:t>
             </w:r>
           </w:p>
         </w:tc>
@@ -2173,7 +1798,6 @@
                 <w:rFonts w:ascii="Arial" w:hAnsi="Arial" w:cs="Arial"/>
               </w:rPr>
             </w:pPr>
-            <w:proofErr w:type="spellStart"/>
             <w:r>
               <w:rPr>
                 <w:rFonts w:ascii="Arial" w:hAnsi="Arial" w:cs="Arial"/>
@@ -2181,7 +1805,6 @@
               </w:rPr>
               <w:t>cpf</w:t>
             </w:r>
-            <w:proofErr w:type="spellEnd"/>
           </w:p>
         </w:tc>
         <w:tc>
@@ -2202,21 +1825,12 @@
                 <w:rFonts w:ascii="Arial" w:hAnsi="Arial" w:cs="Arial"/>
               </w:rPr>
             </w:pPr>
-            <w:proofErr w:type="gramStart"/>
-            <w:r>
-              <w:rPr>
-                <w:rFonts w:ascii="Arial" w:hAnsi="Arial" w:cs="Arial"/>
-                <w:sz w:val="16"/>
-              </w:rPr>
-              <w:t>VARCHAR(</w:t>
-            </w:r>
-            <w:proofErr w:type="gramEnd"/>
-            <w:r>
-              <w:rPr>
-                <w:rFonts w:ascii="Arial" w:hAnsi="Arial" w:cs="Arial"/>
-                <w:sz w:val="16"/>
-              </w:rPr>
-              <w:t>11)</w:t>
+            <w:r>
+              <w:rPr>
+                <w:rFonts w:ascii="Arial" w:hAnsi="Arial" w:cs="Arial"/>
+                <w:sz w:val="16"/>
+              </w:rPr>
+              <w:t>VARCHAR(11)</w:t>
             </w:r>
           </w:p>
         </w:tc>
@@ -2299,7 +1913,6 @@
                 <w:rFonts w:ascii="Arial" w:hAnsi="Arial" w:cs="Arial"/>
               </w:rPr>
             </w:pPr>
-            <w:proofErr w:type="spellStart"/>
             <w:r>
               <w:rPr>
                 <w:rFonts w:ascii="Arial" w:hAnsi="Arial" w:cs="Arial"/>
@@ -2307,7 +1920,6 @@
               </w:rPr>
               <w:t>telefone</w:t>
             </w:r>
-            <w:proofErr w:type="spellEnd"/>
           </w:p>
         </w:tc>
         <w:tc>
@@ -2328,21 +1940,12 @@
                 <w:rFonts w:ascii="Arial" w:hAnsi="Arial" w:cs="Arial"/>
               </w:rPr>
             </w:pPr>
-            <w:proofErr w:type="gramStart"/>
-            <w:r>
-              <w:rPr>
-                <w:rFonts w:ascii="Arial" w:hAnsi="Arial" w:cs="Arial"/>
-                <w:sz w:val="16"/>
-              </w:rPr>
-              <w:t>VARCHAR(</w:t>
-            </w:r>
-            <w:proofErr w:type="gramEnd"/>
-            <w:r>
-              <w:rPr>
-                <w:rFonts w:ascii="Arial" w:hAnsi="Arial" w:cs="Arial"/>
-                <w:sz w:val="16"/>
-              </w:rPr>
-              <w:t>11)</w:t>
+            <w:r>
+              <w:rPr>
+                <w:rFonts w:ascii="Arial" w:hAnsi="Arial" w:cs="Arial"/>
+                <w:sz w:val="16"/>
+              </w:rPr>
+              <w:t>VARCHAR(11)</w:t>
             </w:r>
           </w:p>
         </w:tc>
@@ -2425,7 +2028,6 @@
                 <w:rFonts w:ascii="Arial" w:hAnsi="Arial" w:cs="Arial"/>
               </w:rPr>
             </w:pPr>
-            <w:proofErr w:type="spellStart"/>
             <w:r>
               <w:rPr>
                 <w:rFonts w:ascii="Arial" w:hAnsi="Arial" w:cs="Arial"/>
@@ -2433,7 +2035,6 @@
               </w:rPr>
               <w:t>especialidade</w:t>
             </w:r>
-            <w:proofErr w:type="spellEnd"/>
           </w:p>
         </w:tc>
         <w:tc>
@@ -2454,21 +2055,12 @@
                 <w:rFonts w:ascii="Arial" w:hAnsi="Arial" w:cs="Arial"/>
               </w:rPr>
             </w:pPr>
-            <w:proofErr w:type="gramStart"/>
-            <w:r>
-              <w:rPr>
-                <w:rFonts w:ascii="Arial" w:hAnsi="Arial" w:cs="Arial"/>
-                <w:sz w:val="16"/>
-              </w:rPr>
-              <w:t>VARCHAR(</w:t>
-            </w:r>
-            <w:proofErr w:type="gramEnd"/>
-            <w:r>
-              <w:rPr>
-                <w:rFonts w:ascii="Arial" w:hAnsi="Arial" w:cs="Arial"/>
-                <w:sz w:val="16"/>
-              </w:rPr>
-              <w:t>50)</w:t>
+            <w:r>
+              <w:rPr>
+                <w:rFonts w:ascii="Arial" w:hAnsi="Arial" w:cs="Arial"/>
+                <w:sz w:val="16"/>
+              </w:rPr>
+              <w:t>VARCHAR(50)</w:t>
             </w:r>
           </w:p>
         </w:tc>
@@ -2517,53 +2109,12 @@
                 <w:rFonts w:ascii="Arial" w:hAnsi="Arial" w:cs="Arial"/>
               </w:rPr>
             </w:pPr>
-            <w:proofErr w:type="spellStart"/>
-            <w:r>
-              <w:rPr>
-                <w:rFonts w:ascii="Arial" w:hAnsi="Arial" w:cs="Arial"/>
-                <w:sz w:val="16"/>
-              </w:rPr>
-              <w:t>Especialidade</w:t>
-            </w:r>
-            <w:proofErr w:type="spellEnd"/>
-            <w:r>
-              <w:rPr>
-                <w:rFonts w:ascii="Arial" w:hAnsi="Arial" w:cs="Arial"/>
-                <w:sz w:val="16"/>
-              </w:rPr>
-              <w:t xml:space="preserve"> </w:t>
-            </w:r>
-            <w:proofErr w:type="spellStart"/>
-            <w:r>
-              <w:rPr>
-                <w:rFonts w:ascii="Arial" w:hAnsi="Arial" w:cs="Arial"/>
-                <w:sz w:val="16"/>
-              </w:rPr>
-              <w:t>profissional</w:t>
-            </w:r>
-            <w:proofErr w:type="spellEnd"/>
-            <w:r>
-              <w:rPr>
-                <w:rFonts w:ascii="Arial" w:hAnsi="Arial" w:cs="Arial"/>
-                <w:sz w:val="16"/>
-              </w:rPr>
-              <w:t xml:space="preserve"> do </w:t>
-            </w:r>
-            <w:proofErr w:type="spellStart"/>
-            <w:r>
-              <w:rPr>
-                <w:rFonts w:ascii="Arial" w:hAnsi="Arial" w:cs="Arial"/>
-                <w:sz w:val="16"/>
-              </w:rPr>
-              <w:t>instrutor</w:t>
-            </w:r>
-            <w:proofErr w:type="spellEnd"/>
-            <w:r>
-              <w:rPr>
-                <w:rFonts w:ascii="Arial" w:hAnsi="Arial" w:cs="Arial"/>
-                <w:sz w:val="16"/>
-              </w:rPr>
-              <w:t>.</w:t>
+            <w:r>
+              <w:rPr>
+                <w:rFonts w:ascii="Arial" w:hAnsi="Arial" w:cs="Arial"/>
+                <w:sz w:val="16"/>
+              </w:rPr>
+              <w:t>Especialidade profissional do instrutor.</w:t>
             </w:r>
           </w:p>
         </w:tc>
@@ -2590,7 +2141,6 @@
                 <w:rFonts w:ascii="Arial" w:hAnsi="Arial" w:cs="Arial"/>
               </w:rPr>
             </w:pPr>
-            <w:proofErr w:type="spellStart"/>
             <w:r>
               <w:rPr>
                 <w:rFonts w:ascii="Arial" w:hAnsi="Arial" w:cs="Arial"/>
@@ -2598,7 +2148,6 @@
               </w:rPr>
               <w:t>horario_trabalho</w:t>
             </w:r>
-            <w:proofErr w:type="spellEnd"/>
           </w:p>
         </w:tc>
         <w:tc>
@@ -2707,6 +2256,7 @@
           <w:b/>
           <w:sz w:val="24"/>
         </w:rPr>
+        <w:lastRenderedPageBreak/>
         <w:t>Tabela B: Plano</w:t>
       </w:r>
     </w:p>
@@ -2759,7 +2309,6 @@
                 <w:rFonts w:ascii="Arial" w:hAnsi="Arial" w:cs="Arial"/>
               </w:rPr>
             </w:pPr>
-            <w:proofErr w:type="spellStart"/>
             <w:r>
               <w:rPr>
                 <w:rFonts w:ascii="Arial" w:hAnsi="Arial" w:cs="Arial"/>
@@ -2768,7 +2317,6 @@
               </w:rPr>
               <w:t>Coluna</w:t>
             </w:r>
-            <w:proofErr w:type="spellEnd"/>
           </w:p>
         </w:tc>
         <w:tc>
@@ -2795,25 +2343,7 @@
                 <w:b/>
                 <w:sz w:val="16"/>
               </w:rPr>
-              <w:t>Tipo (</w:t>
-            </w:r>
-            <w:proofErr w:type="spellStart"/>
-            <w:r>
-              <w:rPr>
-                <w:rFonts w:ascii="Arial" w:hAnsi="Arial" w:cs="Arial"/>
-                <w:b/>
-                <w:sz w:val="16"/>
-              </w:rPr>
-              <w:t>tamanho</w:t>
-            </w:r>
-            <w:proofErr w:type="spellEnd"/>
-            <w:r>
-              <w:rPr>
-                <w:rFonts w:ascii="Arial" w:hAnsi="Arial" w:cs="Arial"/>
-                <w:b/>
-                <w:sz w:val="16"/>
-              </w:rPr>
-              <w:t>)</w:t>
+              <w:t>Tipo (tamanho)</w:t>
             </w:r>
           </w:p>
         </w:tc>
@@ -2863,7 +2393,6 @@
                 <w:rFonts w:ascii="Arial" w:hAnsi="Arial" w:cs="Arial"/>
               </w:rPr>
             </w:pPr>
-            <w:proofErr w:type="spellStart"/>
             <w:r>
               <w:rPr>
                 <w:rFonts w:ascii="Arial" w:hAnsi="Arial" w:cs="Arial"/>
@@ -2872,7 +2401,6 @@
               </w:rPr>
               <w:t>Descrição</w:t>
             </w:r>
-            <w:proofErr w:type="spellEnd"/>
           </w:p>
         </w:tc>
       </w:tr>
@@ -2898,7 +2426,6 @@
                 <w:rFonts w:ascii="Arial" w:hAnsi="Arial" w:cs="Arial"/>
               </w:rPr>
             </w:pPr>
-            <w:proofErr w:type="spellStart"/>
             <w:r>
               <w:rPr>
                 <w:rFonts w:ascii="Arial" w:hAnsi="Arial" w:cs="Arial"/>
@@ -2906,7 +2433,6 @@
               </w:rPr>
               <w:t>id_plano</w:t>
             </w:r>
-            <w:proofErr w:type="spellEnd"/>
           </w:p>
         </w:tc>
         <w:tc>
@@ -3015,7 +2541,6 @@
                 <w:rFonts w:ascii="Arial" w:hAnsi="Arial" w:cs="Arial"/>
               </w:rPr>
             </w:pPr>
-            <w:proofErr w:type="spellStart"/>
             <w:r>
               <w:rPr>
                 <w:rFonts w:ascii="Arial" w:hAnsi="Arial" w:cs="Arial"/>
@@ -3023,7 +2548,6 @@
               </w:rPr>
               <w:t>nome</w:t>
             </w:r>
-            <w:proofErr w:type="spellEnd"/>
           </w:p>
         </w:tc>
         <w:tc>
@@ -3044,21 +2568,12 @@
                 <w:rFonts w:ascii="Arial" w:hAnsi="Arial" w:cs="Arial"/>
               </w:rPr>
             </w:pPr>
-            <w:proofErr w:type="gramStart"/>
-            <w:r>
-              <w:rPr>
-                <w:rFonts w:ascii="Arial" w:hAnsi="Arial" w:cs="Arial"/>
-                <w:sz w:val="16"/>
-              </w:rPr>
-              <w:t>VARCHAR(</w:t>
-            </w:r>
-            <w:proofErr w:type="gramEnd"/>
-            <w:r>
-              <w:rPr>
-                <w:rFonts w:ascii="Arial" w:hAnsi="Arial" w:cs="Arial"/>
-                <w:sz w:val="16"/>
-              </w:rPr>
-              <w:t>30)</w:t>
+            <w:r>
+              <w:rPr>
+                <w:rFonts w:ascii="Arial" w:hAnsi="Arial" w:cs="Arial"/>
+                <w:sz w:val="16"/>
+              </w:rPr>
+              <w:t>VARCHAR(30)</w:t>
             </w:r>
           </w:p>
         </w:tc>
@@ -3139,7 +2654,6 @@
                 <w:rFonts w:ascii="Arial" w:hAnsi="Arial" w:cs="Arial"/>
               </w:rPr>
             </w:pPr>
-            <w:proofErr w:type="spellStart"/>
             <w:r>
               <w:rPr>
                 <w:rFonts w:ascii="Arial" w:hAnsi="Arial" w:cs="Arial"/>
@@ -3147,7 +2661,6 @@
               </w:rPr>
               <w:t>descricao</w:t>
             </w:r>
-            <w:proofErr w:type="spellEnd"/>
           </w:p>
         </w:tc>
         <w:tc>
@@ -3168,21 +2681,12 @@
                 <w:rFonts w:ascii="Arial" w:hAnsi="Arial" w:cs="Arial"/>
               </w:rPr>
             </w:pPr>
-            <w:proofErr w:type="gramStart"/>
-            <w:r>
-              <w:rPr>
-                <w:rFonts w:ascii="Arial" w:hAnsi="Arial" w:cs="Arial"/>
-                <w:sz w:val="16"/>
-              </w:rPr>
-              <w:t>VARCHAR(</w:t>
-            </w:r>
-            <w:proofErr w:type="gramEnd"/>
-            <w:r>
-              <w:rPr>
-                <w:rFonts w:ascii="Arial" w:hAnsi="Arial" w:cs="Arial"/>
-                <w:sz w:val="16"/>
-              </w:rPr>
-              <w:t>100)</w:t>
+            <w:r>
+              <w:rPr>
+                <w:rFonts w:ascii="Arial" w:hAnsi="Arial" w:cs="Arial"/>
+                <w:sz w:val="16"/>
+              </w:rPr>
+              <w:t>VARCHAR(100)</w:t>
             </w:r>
           </w:p>
         </w:tc>
@@ -3231,21 +2735,12 @@
                 <w:rFonts w:ascii="Arial" w:hAnsi="Arial" w:cs="Arial"/>
               </w:rPr>
             </w:pPr>
-            <w:proofErr w:type="spellStart"/>
-            <w:r>
-              <w:rPr>
-                <w:rFonts w:ascii="Arial" w:hAnsi="Arial" w:cs="Arial"/>
-                <w:sz w:val="16"/>
-              </w:rPr>
-              <w:t>Descrição</w:t>
-            </w:r>
-            <w:proofErr w:type="spellEnd"/>
-            <w:r>
-              <w:rPr>
-                <w:rFonts w:ascii="Arial" w:hAnsi="Arial" w:cs="Arial"/>
-                <w:sz w:val="16"/>
-              </w:rPr>
-              <w:t xml:space="preserve"> do plano.</w:t>
+            <w:r>
+              <w:rPr>
+                <w:rFonts w:ascii="Arial" w:hAnsi="Arial" w:cs="Arial"/>
+                <w:sz w:val="16"/>
+              </w:rPr>
+              <w:t>Descrição do plano.</w:t>
             </w:r>
           </w:p>
         </w:tc>
@@ -3272,7 +2767,6 @@
                 <w:rFonts w:ascii="Arial" w:hAnsi="Arial" w:cs="Arial"/>
               </w:rPr>
             </w:pPr>
-            <w:proofErr w:type="spellStart"/>
             <w:r>
               <w:rPr>
                 <w:rFonts w:ascii="Arial" w:hAnsi="Arial" w:cs="Arial"/>
@@ -3280,7 +2774,6 @@
               </w:rPr>
               <w:t>valor_mensal</w:t>
             </w:r>
-            <w:proofErr w:type="spellEnd"/>
           </w:p>
         </w:tc>
         <w:tc>
@@ -3301,21 +2794,12 @@
                 <w:rFonts w:ascii="Arial" w:hAnsi="Arial" w:cs="Arial"/>
               </w:rPr>
             </w:pPr>
-            <w:proofErr w:type="gramStart"/>
-            <w:r>
-              <w:rPr>
-                <w:rFonts w:ascii="Arial" w:hAnsi="Arial" w:cs="Arial"/>
-                <w:sz w:val="16"/>
-              </w:rPr>
-              <w:t>DECIMAL(</w:t>
-            </w:r>
-            <w:proofErr w:type="gramEnd"/>
-            <w:r>
-              <w:rPr>
-                <w:rFonts w:ascii="Arial" w:hAnsi="Arial" w:cs="Arial"/>
-                <w:sz w:val="16"/>
-              </w:rPr>
-              <w:t>10,2)</w:t>
+            <w:r>
+              <w:rPr>
+                <w:rFonts w:ascii="Arial" w:hAnsi="Arial" w:cs="Arial"/>
+                <w:sz w:val="16"/>
+              </w:rPr>
+              <w:t>DECIMAL(10,2)</w:t>
             </w:r>
           </w:p>
         </w:tc>
@@ -3398,7 +2882,6 @@
                 <w:rFonts w:ascii="Arial" w:hAnsi="Arial" w:cs="Arial"/>
               </w:rPr>
             </w:pPr>
-            <w:proofErr w:type="spellStart"/>
             <w:r>
               <w:rPr>
                 <w:rFonts w:ascii="Arial" w:hAnsi="Arial" w:cs="Arial"/>
@@ -3406,7 +2889,6 @@
               </w:rPr>
               <w:t>duracao</w:t>
             </w:r>
-            <w:proofErr w:type="spellEnd"/>
           </w:p>
         </w:tc>
         <w:tc>
@@ -3427,21 +2909,12 @@
                 <w:rFonts w:ascii="Arial" w:hAnsi="Arial" w:cs="Arial"/>
               </w:rPr>
             </w:pPr>
-            <w:proofErr w:type="gramStart"/>
-            <w:r>
-              <w:rPr>
-                <w:rFonts w:ascii="Arial" w:hAnsi="Arial" w:cs="Arial"/>
-                <w:sz w:val="16"/>
-              </w:rPr>
-              <w:t>VARCHAR(</w:t>
-            </w:r>
-            <w:proofErr w:type="gramEnd"/>
-            <w:r>
-              <w:rPr>
-                <w:rFonts w:ascii="Arial" w:hAnsi="Arial" w:cs="Arial"/>
-                <w:sz w:val="16"/>
-              </w:rPr>
-              <w:t>20)</w:t>
+            <w:r>
+              <w:rPr>
+                <w:rFonts w:ascii="Arial" w:hAnsi="Arial" w:cs="Arial"/>
+                <w:sz w:val="16"/>
+              </w:rPr>
+              <w:t>VARCHAR(20)</w:t>
             </w:r>
           </w:p>
         </w:tc>
@@ -3524,7 +2997,6 @@
                 <w:rFonts w:ascii="Arial" w:hAnsi="Arial" w:cs="Arial"/>
               </w:rPr>
             </w:pPr>
-            <w:proofErr w:type="spellStart"/>
             <w:r>
               <w:rPr>
                 <w:rFonts w:ascii="Arial" w:hAnsi="Arial" w:cs="Arial"/>
@@ -3532,7 +3004,6 @@
               </w:rPr>
               <w:t>beneficios</w:t>
             </w:r>
-            <w:proofErr w:type="spellEnd"/>
           </w:p>
         </w:tc>
         <w:tc>
@@ -3553,21 +3024,12 @@
                 <w:rFonts w:ascii="Arial" w:hAnsi="Arial" w:cs="Arial"/>
               </w:rPr>
             </w:pPr>
-            <w:proofErr w:type="gramStart"/>
-            <w:r>
-              <w:rPr>
-                <w:rFonts w:ascii="Arial" w:hAnsi="Arial" w:cs="Arial"/>
-                <w:sz w:val="16"/>
-              </w:rPr>
-              <w:t>VARCHAR(</w:t>
-            </w:r>
-            <w:proofErr w:type="gramEnd"/>
-            <w:r>
-              <w:rPr>
-                <w:rFonts w:ascii="Arial" w:hAnsi="Arial" w:cs="Arial"/>
-                <w:sz w:val="16"/>
-              </w:rPr>
-              <w:t>200)</w:t>
+            <w:r>
+              <w:rPr>
+                <w:rFonts w:ascii="Arial" w:hAnsi="Arial" w:cs="Arial"/>
+                <w:sz w:val="16"/>
+              </w:rPr>
+              <w:t>VARCHAR(200)</w:t>
             </w:r>
           </w:p>
         </w:tc>
@@ -3616,53 +3078,12 @@
                 <w:rFonts w:ascii="Arial" w:hAnsi="Arial" w:cs="Arial"/>
               </w:rPr>
             </w:pPr>
-            <w:proofErr w:type="spellStart"/>
-            <w:r>
-              <w:rPr>
-                <w:rFonts w:ascii="Arial" w:hAnsi="Arial" w:cs="Arial"/>
-                <w:sz w:val="16"/>
-              </w:rPr>
-              <w:t>Benefícios</w:t>
-            </w:r>
-            <w:proofErr w:type="spellEnd"/>
-            <w:r>
-              <w:rPr>
-                <w:rFonts w:ascii="Arial" w:hAnsi="Arial" w:cs="Arial"/>
-                <w:sz w:val="16"/>
-              </w:rPr>
-              <w:t xml:space="preserve"> </w:t>
-            </w:r>
-            <w:proofErr w:type="spellStart"/>
-            <w:r>
-              <w:rPr>
-                <w:rFonts w:ascii="Arial" w:hAnsi="Arial" w:cs="Arial"/>
-                <w:sz w:val="16"/>
-              </w:rPr>
-              <w:t>oferecidos</w:t>
-            </w:r>
-            <w:proofErr w:type="spellEnd"/>
-            <w:r>
-              <w:rPr>
-                <w:rFonts w:ascii="Arial" w:hAnsi="Arial" w:cs="Arial"/>
-                <w:sz w:val="16"/>
-              </w:rPr>
-              <w:t xml:space="preserve"> </w:t>
-            </w:r>
-            <w:proofErr w:type="spellStart"/>
-            <w:r>
-              <w:rPr>
-                <w:rFonts w:ascii="Arial" w:hAnsi="Arial" w:cs="Arial"/>
-                <w:sz w:val="16"/>
-              </w:rPr>
-              <w:t>pelo</w:t>
-            </w:r>
-            <w:proofErr w:type="spellEnd"/>
-            <w:r>
-              <w:rPr>
-                <w:rFonts w:ascii="Arial" w:hAnsi="Arial" w:cs="Arial"/>
-                <w:sz w:val="16"/>
-              </w:rPr>
-              <w:t xml:space="preserve"> plano.</w:t>
+            <w:r>
+              <w:rPr>
+                <w:rFonts w:ascii="Arial" w:hAnsi="Arial" w:cs="Arial"/>
+                <w:sz w:val="16"/>
+              </w:rPr>
+              <w:t>Benefícios oferecidos pelo plano.</w:t>
             </w:r>
           </w:p>
         </w:tc>
@@ -3696,7 +3117,6 @@
           <w:b/>
           <w:sz w:val="24"/>
         </w:rPr>
-        <w:lastRenderedPageBreak/>
         <w:t>Tabela C: Aula</w:t>
       </w:r>
     </w:p>
@@ -3749,7 +3169,6 @@
                 <w:rFonts w:ascii="Arial" w:hAnsi="Arial" w:cs="Arial"/>
               </w:rPr>
             </w:pPr>
-            <w:proofErr w:type="spellStart"/>
             <w:r>
               <w:rPr>
                 <w:rFonts w:ascii="Arial" w:hAnsi="Arial" w:cs="Arial"/>
@@ -3758,7 +3177,6 @@
               </w:rPr>
               <w:t>Coluna</w:t>
             </w:r>
-            <w:proofErr w:type="spellEnd"/>
           </w:p>
         </w:tc>
         <w:tc>
@@ -3785,25 +3203,7 @@
                 <w:b/>
                 <w:sz w:val="16"/>
               </w:rPr>
-              <w:t>Tipo (</w:t>
-            </w:r>
-            <w:proofErr w:type="spellStart"/>
-            <w:r>
-              <w:rPr>
-                <w:rFonts w:ascii="Arial" w:hAnsi="Arial" w:cs="Arial"/>
-                <w:b/>
-                <w:sz w:val="16"/>
-              </w:rPr>
-              <w:t>tamanho</w:t>
-            </w:r>
-            <w:proofErr w:type="spellEnd"/>
-            <w:r>
-              <w:rPr>
-                <w:rFonts w:ascii="Arial" w:hAnsi="Arial" w:cs="Arial"/>
-                <w:b/>
-                <w:sz w:val="16"/>
-              </w:rPr>
-              <w:t>)</w:t>
+              <w:t>Tipo (tamanho)</w:t>
             </w:r>
           </w:p>
         </w:tc>
@@ -3853,7 +3253,6 @@
                 <w:rFonts w:ascii="Arial" w:hAnsi="Arial" w:cs="Arial"/>
               </w:rPr>
             </w:pPr>
-            <w:proofErr w:type="spellStart"/>
             <w:r>
               <w:rPr>
                 <w:rFonts w:ascii="Arial" w:hAnsi="Arial" w:cs="Arial"/>
@@ -3862,7 +3261,6 @@
               </w:rPr>
               <w:t>Descrição</w:t>
             </w:r>
-            <w:proofErr w:type="spellEnd"/>
           </w:p>
         </w:tc>
       </w:tr>
@@ -3888,7 +3286,6 @@
                 <w:rFonts w:ascii="Arial" w:hAnsi="Arial" w:cs="Arial"/>
               </w:rPr>
             </w:pPr>
-            <w:proofErr w:type="spellStart"/>
             <w:r>
               <w:rPr>
                 <w:rFonts w:ascii="Arial" w:hAnsi="Arial" w:cs="Arial"/>
@@ -3896,7 +3293,6 @@
               </w:rPr>
               <w:t>id_aula</w:t>
             </w:r>
-            <w:proofErr w:type="spellEnd"/>
           </w:p>
         </w:tc>
         <w:tc>
@@ -4005,7 +3401,6 @@
                 <w:rFonts w:ascii="Arial" w:hAnsi="Arial" w:cs="Arial"/>
               </w:rPr>
             </w:pPr>
-            <w:proofErr w:type="spellStart"/>
             <w:r>
               <w:rPr>
                 <w:rFonts w:ascii="Arial" w:hAnsi="Arial" w:cs="Arial"/>
@@ -4013,7 +3408,6 @@
               </w:rPr>
               <w:t>nome</w:t>
             </w:r>
-            <w:proofErr w:type="spellEnd"/>
           </w:p>
         </w:tc>
         <w:tc>
@@ -4034,21 +3428,12 @@
                 <w:rFonts w:ascii="Arial" w:hAnsi="Arial" w:cs="Arial"/>
               </w:rPr>
             </w:pPr>
-            <w:proofErr w:type="gramStart"/>
-            <w:r>
-              <w:rPr>
-                <w:rFonts w:ascii="Arial" w:hAnsi="Arial" w:cs="Arial"/>
-                <w:sz w:val="16"/>
-              </w:rPr>
-              <w:t>VARCHAR(</w:t>
-            </w:r>
-            <w:proofErr w:type="gramEnd"/>
-            <w:r>
-              <w:rPr>
-                <w:rFonts w:ascii="Arial" w:hAnsi="Arial" w:cs="Arial"/>
-                <w:sz w:val="16"/>
-              </w:rPr>
-              <w:t>50)</w:t>
+            <w:r>
+              <w:rPr>
+                <w:rFonts w:ascii="Arial" w:hAnsi="Arial" w:cs="Arial"/>
+                <w:sz w:val="16"/>
+              </w:rPr>
+              <w:t>VARCHAR(50)</w:t>
             </w:r>
           </w:p>
         </w:tc>
@@ -4129,7 +3514,6 @@
                 <w:rFonts w:ascii="Arial" w:hAnsi="Arial" w:cs="Arial"/>
               </w:rPr>
             </w:pPr>
-            <w:proofErr w:type="spellStart"/>
             <w:r>
               <w:rPr>
                 <w:rFonts w:ascii="Arial" w:hAnsi="Arial" w:cs="Arial"/>
@@ -4137,7 +3521,6 @@
               </w:rPr>
               <w:t>descricao</w:t>
             </w:r>
-            <w:proofErr w:type="spellEnd"/>
           </w:p>
         </w:tc>
         <w:tc>
@@ -4158,21 +3541,12 @@
                 <w:rFonts w:ascii="Arial" w:hAnsi="Arial" w:cs="Arial"/>
               </w:rPr>
             </w:pPr>
-            <w:proofErr w:type="gramStart"/>
-            <w:r>
-              <w:rPr>
-                <w:rFonts w:ascii="Arial" w:hAnsi="Arial" w:cs="Arial"/>
-                <w:sz w:val="16"/>
-              </w:rPr>
-              <w:t>VARCHAR(</w:t>
-            </w:r>
-            <w:proofErr w:type="gramEnd"/>
-            <w:r>
-              <w:rPr>
-                <w:rFonts w:ascii="Arial" w:hAnsi="Arial" w:cs="Arial"/>
-                <w:sz w:val="16"/>
-              </w:rPr>
-              <w:t>100)</w:t>
+            <w:r>
+              <w:rPr>
+                <w:rFonts w:ascii="Arial" w:hAnsi="Arial" w:cs="Arial"/>
+                <w:sz w:val="16"/>
+              </w:rPr>
+              <w:t>VARCHAR(100)</w:t>
             </w:r>
           </w:p>
         </w:tc>
@@ -4221,21 +3595,12 @@
                 <w:rFonts w:ascii="Arial" w:hAnsi="Arial" w:cs="Arial"/>
               </w:rPr>
             </w:pPr>
-            <w:proofErr w:type="spellStart"/>
-            <w:r>
-              <w:rPr>
-                <w:rFonts w:ascii="Arial" w:hAnsi="Arial" w:cs="Arial"/>
-                <w:sz w:val="16"/>
-              </w:rPr>
-              <w:t>Descrição</w:t>
-            </w:r>
-            <w:proofErr w:type="spellEnd"/>
-            <w:r>
-              <w:rPr>
-                <w:rFonts w:ascii="Arial" w:hAnsi="Arial" w:cs="Arial"/>
-                <w:sz w:val="16"/>
-              </w:rPr>
-              <w:t xml:space="preserve"> da aula.</w:t>
+            <w:r>
+              <w:rPr>
+                <w:rFonts w:ascii="Arial" w:hAnsi="Arial" w:cs="Arial"/>
+                <w:sz w:val="16"/>
+              </w:rPr>
+              <w:t>Descrição da aula.</w:t>
             </w:r>
           </w:p>
         </w:tc>
@@ -4262,7 +3627,6 @@
                 <w:rFonts w:ascii="Arial" w:hAnsi="Arial" w:cs="Arial"/>
               </w:rPr>
             </w:pPr>
-            <w:proofErr w:type="spellStart"/>
             <w:r>
               <w:rPr>
                 <w:rFonts w:ascii="Arial" w:hAnsi="Arial" w:cs="Arial"/>
@@ -4270,7 +3634,6 @@
               </w:rPr>
               <w:t>capacidade_max</w:t>
             </w:r>
-            <w:proofErr w:type="spellEnd"/>
           </w:p>
         </w:tc>
         <w:tc>
@@ -4379,7 +3742,6 @@
                 <w:rFonts w:ascii="Arial" w:hAnsi="Arial" w:cs="Arial"/>
               </w:rPr>
             </w:pPr>
-            <w:proofErr w:type="spellStart"/>
             <w:r>
               <w:rPr>
                 <w:rFonts w:ascii="Arial" w:hAnsi="Arial" w:cs="Arial"/>
@@ -4387,7 +3749,6 @@
               </w:rPr>
               <w:t>horario</w:t>
             </w:r>
-            <w:proofErr w:type="spellEnd"/>
           </w:p>
         </w:tc>
         <w:tc>
@@ -4462,21 +3823,12 @@
                 <w:rFonts w:ascii="Arial" w:hAnsi="Arial" w:cs="Arial"/>
               </w:rPr>
             </w:pPr>
-            <w:proofErr w:type="spellStart"/>
-            <w:r>
-              <w:rPr>
-                <w:rFonts w:ascii="Arial" w:hAnsi="Arial" w:cs="Arial"/>
-                <w:sz w:val="16"/>
-              </w:rPr>
-              <w:t>Horário</w:t>
-            </w:r>
-            <w:proofErr w:type="spellEnd"/>
-            <w:r>
-              <w:rPr>
-                <w:rFonts w:ascii="Arial" w:hAnsi="Arial" w:cs="Arial"/>
-                <w:sz w:val="16"/>
-              </w:rPr>
-              <w:t xml:space="preserve"> da aula.</w:t>
+            <w:r>
+              <w:rPr>
+                <w:rFonts w:ascii="Arial" w:hAnsi="Arial" w:cs="Arial"/>
+                <w:sz w:val="16"/>
+              </w:rPr>
+              <w:t>Horário da aula.</w:t>
             </w:r>
           </w:p>
         </w:tc>
@@ -4503,7 +3855,6 @@
                 <w:rFonts w:ascii="Arial" w:hAnsi="Arial" w:cs="Arial"/>
               </w:rPr>
             </w:pPr>
-            <w:proofErr w:type="spellStart"/>
             <w:r>
               <w:rPr>
                 <w:rFonts w:ascii="Arial" w:hAnsi="Arial" w:cs="Arial"/>
@@ -4511,7 +3862,6 @@
               </w:rPr>
               <w:t>codigo_instrutor</w:t>
             </w:r>
-            <w:proofErr w:type="spellEnd"/>
           </w:p>
         </w:tc>
         <w:tc>
@@ -4564,39 +3914,7 @@
                 <w:rFonts w:ascii="Arial" w:hAnsi="Arial" w:cs="Arial"/>
                 <w:sz w:val="16"/>
               </w:rPr>
-              <w:t xml:space="preserve">FK → </w:t>
-            </w:r>
-            <w:proofErr w:type="spellStart"/>
-            <w:r>
-              <w:rPr>
-                <w:rFonts w:ascii="Arial" w:hAnsi="Arial" w:cs="Arial"/>
-                <w:sz w:val="16"/>
-              </w:rPr>
-              <w:t>Instrutor</w:t>
-            </w:r>
-            <w:proofErr w:type="spellEnd"/>
-            <w:r>
-              <w:rPr>
-                <w:rFonts w:ascii="Arial" w:hAnsi="Arial" w:cs="Arial"/>
-                <w:sz w:val="16"/>
-              </w:rPr>
-              <w:t>(</w:t>
-            </w:r>
-            <w:proofErr w:type="spellStart"/>
-            <w:r>
-              <w:rPr>
-                <w:rFonts w:ascii="Arial" w:hAnsi="Arial" w:cs="Arial"/>
-                <w:sz w:val="16"/>
-              </w:rPr>
-              <w:t>id_instrutor</w:t>
-            </w:r>
-            <w:proofErr w:type="spellEnd"/>
-            <w:r>
-              <w:rPr>
-                <w:rFonts w:ascii="Arial" w:hAnsi="Arial" w:cs="Arial"/>
-                <w:sz w:val="16"/>
-              </w:rPr>
-              <w:t>)</w:t>
+              <w:t>FK → Instrutor(id_instrutor)</w:t>
             </w:r>
           </w:p>
         </w:tc>
@@ -4702,7 +4020,6 @@
                 <w:rFonts w:ascii="Arial" w:hAnsi="Arial" w:cs="Arial"/>
               </w:rPr>
             </w:pPr>
-            <w:proofErr w:type="spellStart"/>
             <w:r>
               <w:rPr>
                 <w:rFonts w:ascii="Arial" w:hAnsi="Arial" w:cs="Arial"/>
@@ -4711,7 +4028,6 @@
               </w:rPr>
               <w:t>Coluna</w:t>
             </w:r>
-            <w:proofErr w:type="spellEnd"/>
           </w:p>
         </w:tc>
         <w:tc>
@@ -4738,25 +4054,7 @@
                 <w:b/>
                 <w:sz w:val="16"/>
               </w:rPr>
-              <w:t>Tipo (</w:t>
-            </w:r>
-            <w:proofErr w:type="spellStart"/>
-            <w:r>
-              <w:rPr>
-                <w:rFonts w:ascii="Arial" w:hAnsi="Arial" w:cs="Arial"/>
-                <w:b/>
-                <w:sz w:val="16"/>
-              </w:rPr>
-              <w:t>tamanho</w:t>
-            </w:r>
-            <w:proofErr w:type="spellEnd"/>
-            <w:r>
-              <w:rPr>
-                <w:rFonts w:ascii="Arial" w:hAnsi="Arial" w:cs="Arial"/>
-                <w:b/>
-                <w:sz w:val="16"/>
-              </w:rPr>
-              <w:t>)</w:t>
+              <w:t>Tipo (tamanho)</w:t>
             </w:r>
           </w:p>
         </w:tc>
@@ -4806,7 +4104,6 @@
                 <w:rFonts w:ascii="Arial" w:hAnsi="Arial" w:cs="Arial"/>
               </w:rPr>
             </w:pPr>
-            <w:proofErr w:type="spellStart"/>
             <w:r>
               <w:rPr>
                 <w:rFonts w:ascii="Arial" w:hAnsi="Arial" w:cs="Arial"/>
@@ -4815,7 +4112,6 @@
               </w:rPr>
               <w:t>Descrição</w:t>
             </w:r>
-            <w:proofErr w:type="spellEnd"/>
           </w:p>
         </w:tc>
       </w:tr>
@@ -4841,7 +4137,6 @@
                 <w:rFonts w:ascii="Arial" w:hAnsi="Arial" w:cs="Arial"/>
               </w:rPr>
             </w:pPr>
-            <w:proofErr w:type="spellStart"/>
             <w:r>
               <w:rPr>
                 <w:rFonts w:ascii="Arial" w:hAnsi="Arial" w:cs="Arial"/>
@@ -4849,7 +4144,6 @@
               </w:rPr>
               <w:t>id_aluno</w:t>
             </w:r>
-            <w:proofErr w:type="spellEnd"/>
           </w:p>
         </w:tc>
         <w:tc>
@@ -4958,7 +4252,6 @@
                 <w:rFonts w:ascii="Arial" w:hAnsi="Arial" w:cs="Arial"/>
               </w:rPr>
             </w:pPr>
-            <w:proofErr w:type="spellStart"/>
             <w:r>
               <w:rPr>
                 <w:rFonts w:ascii="Arial" w:hAnsi="Arial" w:cs="Arial"/>
@@ -4966,7 +4259,6 @@
               </w:rPr>
               <w:t>nome</w:t>
             </w:r>
-            <w:proofErr w:type="spellEnd"/>
           </w:p>
         </w:tc>
         <w:tc>
@@ -4987,21 +4279,12 @@
                 <w:rFonts w:ascii="Arial" w:hAnsi="Arial" w:cs="Arial"/>
               </w:rPr>
             </w:pPr>
-            <w:proofErr w:type="gramStart"/>
-            <w:r>
-              <w:rPr>
-                <w:rFonts w:ascii="Arial" w:hAnsi="Arial" w:cs="Arial"/>
-                <w:sz w:val="16"/>
-              </w:rPr>
-              <w:t>VARCHAR(</w:t>
-            </w:r>
-            <w:proofErr w:type="gramEnd"/>
-            <w:r>
-              <w:rPr>
-                <w:rFonts w:ascii="Arial" w:hAnsi="Arial" w:cs="Arial"/>
-                <w:sz w:val="16"/>
-              </w:rPr>
-              <w:t>50)</w:t>
+            <w:r>
+              <w:rPr>
+                <w:rFonts w:ascii="Arial" w:hAnsi="Arial" w:cs="Arial"/>
+                <w:sz w:val="16"/>
+              </w:rPr>
+              <w:t>VARCHAR(50)</w:t>
             </w:r>
           </w:p>
         </w:tc>
@@ -5055,23 +4338,7 @@
                 <w:rFonts w:ascii="Arial" w:hAnsi="Arial" w:cs="Arial"/>
                 <w:sz w:val="16"/>
               </w:rPr>
-              <w:t xml:space="preserve">Nome do </w:t>
-            </w:r>
-            <w:proofErr w:type="spellStart"/>
-            <w:r>
-              <w:rPr>
-                <w:rFonts w:ascii="Arial" w:hAnsi="Arial" w:cs="Arial"/>
-                <w:sz w:val="16"/>
-              </w:rPr>
-              <w:t>aluno</w:t>
-            </w:r>
-            <w:proofErr w:type="spellEnd"/>
-            <w:r>
-              <w:rPr>
-                <w:rFonts w:ascii="Arial" w:hAnsi="Arial" w:cs="Arial"/>
-                <w:sz w:val="16"/>
-              </w:rPr>
-              <w:t>.</w:t>
+              <w:t>Nome do aluno.</w:t>
             </w:r>
           </w:p>
         </w:tc>
@@ -5098,7 +4365,6 @@
                 <w:rFonts w:ascii="Arial" w:hAnsi="Arial" w:cs="Arial"/>
               </w:rPr>
             </w:pPr>
-            <w:proofErr w:type="spellStart"/>
             <w:r>
               <w:rPr>
                 <w:rFonts w:ascii="Arial" w:hAnsi="Arial" w:cs="Arial"/>
@@ -5106,7 +4372,6 @@
               </w:rPr>
               <w:t>cpf</w:t>
             </w:r>
-            <w:proofErr w:type="spellEnd"/>
           </w:p>
         </w:tc>
         <w:tc>
@@ -5127,21 +4392,12 @@
                 <w:rFonts w:ascii="Arial" w:hAnsi="Arial" w:cs="Arial"/>
               </w:rPr>
             </w:pPr>
-            <w:proofErr w:type="gramStart"/>
-            <w:r>
-              <w:rPr>
-                <w:rFonts w:ascii="Arial" w:hAnsi="Arial" w:cs="Arial"/>
-                <w:sz w:val="16"/>
-              </w:rPr>
-              <w:t>VARCHAR(</w:t>
-            </w:r>
-            <w:proofErr w:type="gramEnd"/>
-            <w:r>
-              <w:rPr>
-                <w:rFonts w:ascii="Arial" w:hAnsi="Arial" w:cs="Arial"/>
-                <w:sz w:val="16"/>
-              </w:rPr>
-              <w:t>11)</w:t>
+            <w:r>
+              <w:rPr>
+                <w:rFonts w:ascii="Arial" w:hAnsi="Arial" w:cs="Arial"/>
+                <w:sz w:val="16"/>
+              </w:rPr>
+              <w:t>VARCHAR(11)</w:t>
             </w:r>
           </w:p>
         </w:tc>
@@ -5224,7 +4480,6 @@
                 <w:rFonts w:ascii="Arial" w:hAnsi="Arial" w:cs="Arial"/>
               </w:rPr>
             </w:pPr>
-            <w:proofErr w:type="spellStart"/>
             <w:r>
               <w:rPr>
                 <w:rFonts w:ascii="Arial" w:hAnsi="Arial" w:cs="Arial"/>
@@ -5232,7 +4487,6 @@
               </w:rPr>
               <w:t>dt_nascimento</w:t>
             </w:r>
-            <w:proofErr w:type="spellEnd"/>
           </w:p>
         </w:tc>
         <w:tc>
@@ -5341,7 +4595,6 @@
                 <w:rFonts w:ascii="Arial" w:hAnsi="Arial" w:cs="Arial"/>
               </w:rPr>
             </w:pPr>
-            <w:proofErr w:type="spellStart"/>
             <w:r>
               <w:rPr>
                 <w:rFonts w:ascii="Arial" w:hAnsi="Arial" w:cs="Arial"/>
@@ -5349,7 +4602,6 @@
               </w:rPr>
               <w:t>telefone</w:t>
             </w:r>
-            <w:proofErr w:type="spellEnd"/>
           </w:p>
         </w:tc>
         <w:tc>
@@ -5370,21 +4622,12 @@
                 <w:rFonts w:ascii="Arial" w:hAnsi="Arial" w:cs="Arial"/>
               </w:rPr>
             </w:pPr>
-            <w:proofErr w:type="gramStart"/>
-            <w:r>
-              <w:rPr>
-                <w:rFonts w:ascii="Arial" w:hAnsi="Arial" w:cs="Arial"/>
-                <w:sz w:val="16"/>
-              </w:rPr>
-              <w:t>VARCHAR(</w:t>
-            </w:r>
-            <w:proofErr w:type="gramEnd"/>
-            <w:r>
-              <w:rPr>
-                <w:rFonts w:ascii="Arial" w:hAnsi="Arial" w:cs="Arial"/>
-                <w:sz w:val="16"/>
-              </w:rPr>
-              <w:t>11)</w:t>
+            <w:r>
+              <w:rPr>
+                <w:rFonts w:ascii="Arial" w:hAnsi="Arial" w:cs="Arial"/>
+                <w:sz w:val="16"/>
+              </w:rPr>
+              <w:t>VARCHAR(11)</w:t>
             </w:r>
           </w:p>
         </w:tc>
@@ -5494,21 +4737,12 @@
                 <w:rFonts w:ascii="Arial" w:hAnsi="Arial" w:cs="Arial"/>
               </w:rPr>
             </w:pPr>
-            <w:proofErr w:type="gramStart"/>
-            <w:r>
-              <w:rPr>
-                <w:rFonts w:ascii="Arial" w:hAnsi="Arial" w:cs="Arial"/>
-                <w:sz w:val="16"/>
-              </w:rPr>
-              <w:t>VARCHAR(</w:t>
-            </w:r>
-            <w:proofErr w:type="gramEnd"/>
-            <w:r>
-              <w:rPr>
-                <w:rFonts w:ascii="Arial" w:hAnsi="Arial" w:cs="Arial"/>
-                <w:sz w:val="16"/>
-              </w:rPr>
-              <w:t>30)</w:t>
+            <w:r>
+              <w:rPr>
+                <w:rFonts w:ascii="Arial" w:hAnsi="Arial" w:cs="Arial"/>
+                <w:sz w:val="16"/>
+              </w:rPr>
+              <w:t>VARCHAR(30)</w:t>
             </w:r>
           </w:p>
         </w:tc>
@@ -5591,7 +4825,6 @@
                 <w:rFonts w:ascii="Arial" w:hAnsi="Arial" w:cs="Arial"/>
               </w:rPr>
             </w:pPr>
-            <w:proofErr w:type="spellStart"/>
             <w:r>
               <w:rPr>
                 <w:rFonts w:ascii="Arial" w:hAnsi="Arial" w:cs="Arial"/>
@@ -5599,7 +4832,6 @@
               </w:rPr>
               <w:t>dt_matricula</w:t>
             </w:r>
-            <w:proofErr w:type="spellEnd"/>
           </w:p>
         </w:tc>
         <w:tc>
@@ -5708,15 +4940,14 @@
                 <w:rFonts w:ascii="Arial" w:hAnsi="Arial" w:cs="Arial"/>
               </w:rPr>
             </w:pPr>
-            <w:proofErr w:type="spellStart"/>
-            <w:r>
-              <w:rPr>
-                <w:rFonts w:ascii="Arial" w:hAnsi="Arial" w:cs="Arial"/>
-                <w:sz w:val="16"/>
-              </w:rPr>
+            <w:r>
+              <w:rPr>
+                <w:rFonts w:ascii="Arial" w:hAnsi="Arial" w:cs="Arial"/>
+                <w:sz w:val="16"/>
+              </w:rPr>
+              <w:lastRenderedPageBreak/>
               <w:t>codigo_plano</w:t>
             </w:r>
-            <w:proofErr w:type="spellEnd"/>
           </w:p>
         </w:tc>
         <w:tc>
@@ -5769,23 +5000,7 @@
                 <w:rFonts w:ascii="Arial" w:hAnsi="Arial" w:cs="Arial"/>
                 <w:sz w:val="16"/>
               </w:rPr>
-              <w:t>FK → Plano(</w:t>
-            </w:r>
-            <w:proofErr w:type="spellStart"/>
-            <w:r>
-              <w:rPr>
-                <w:rFonts w:ascii="Arial" w:hAnsi="Arial" w:cs="Arial"/>
-                <w:sz w:val="16"/>
-              </w:rPr>
-              <w:t>id_plano</w:t>
-            </w:r>
-            <w:proofErr w:type="spellEnd"/>
-            <w:r>
-              <w:rPr>
-                <w:rFonts w:ascii="Arial" w:hAnsi="Arial" w:cs="Arial"/>
-                <w:sz w:val="16"/>
-              </w:rPr>
-              <w:t>)</w:t>
+              <w:t>FK → Plano(id_plano)</w:t>
             </w:r>
           </w:p>
         </w:tc>
@@ -5841,18 +5056,8 @@
           <w:b/>
           <w:sz w:val="24"/>
         </w:rPr>
-        <w:t xml:space="preserve">Tabela E: </w:t>
-      </w:r>
-      <w:proofErr w:type="spellStart"/>
-      <w:r>
-        <w:rPr>
-          <w:rFonts w:ascii="Arial" w:hAnsi="Arial" w:cs="Arial"/>
-          <w:b/>
-          <w:sz w:val="24"/>
-        </w:rPr>
-        <w:t>Frequencia</w:t>
-      </w:r>
-      <w:proofErr w:type="spellEnd"/>
+        <w:t>Tabela E: Frequencia</w:t>
+      </w:r>
     </w:p>
     <w:p>
       <w:pPr>
@@ -5903,7 +5108,6 @@
                 <w:rFonts w:ascii="Arial" w:hAnsi="Arial" w:cs="Arial"/>
               </w:rPr>
             </w:pPr>
-            <w:proofErr w:type="spellStart"/>
             <w:r>
               <w:rPr>
                 <w:rFonts w:ascii="Arial" w:hAnsi="Arial" w:cs="Arial"/>
@@ -5912,7 +5116,6 @@
               </w:rPr>
               <w:t>Coluna</w:t>
             </w:r>
-            <w:proofErr w:type="spellEnd"/>
           </w:p>
         </w:tc>
         <w:tc>
@@ -5939,25 +5142,7 @@
                 <w:b/>
                 <w:sz w:val="16"/>
               </w:rPr>
-              <w:t>Tipo (</w:t>
-            </w:r>
-            <w:proofErr w:type="spellStart"/>
-            <w:r>
-              <w:rPr>
-                <w:rFonts w:ascii="Arial" w:hAnsi="Arial" w:cs="Arial"/>
-                <w:b/>
-                <w:sz w:val="16"/>
-              </w:rPr>
-              <w:t>tamanho</w:t>
-            </w:r>
-            <w:proofErr w:type="spellEnd"/>
-            <w:r>
-              <w:rPr>
-                <w:rFonts w:ascii="Arial" w:hAnsi="Arial" w:cs="Arial"/>
-                <w:b/>
-                <w:sz w:val="16"/>
-              </w:rPr>
-              <w:t>)</w:t>
+              <w:t>Tipo (tamanho)</w:t>
             </w:r>
           </w:p>
         </w:tc>
@@ -6007,7 +5192,6 @@
                 <w:rFonts w:ascii="Arial" w:hAnsi="Arial" w:cs="Arial"/>
               </w:rPr>
             </w:pPr>
-            <w:proofErr w:type="spellStart"/>
             <w:r>
               <w:rPr>
                 <w:rFonts w:ascii="Arial" w:hAnsi="Arial" w:cs="Arial"/>
@@ -6016,7 +5200,6 @@
               </w:rPr>
               <w:t>Descrição</w:t>
             </w:r>
-            <w:proofErr w:type="spellEnd"/>
           </w:p>
         </w:tc>
       </w:tr>
@@ -6042,7 +5225,6 @@
                 <w:rFonts w:ascii="Arial" w:hAnsi="Arial" w:cs="Arial"/>
               </w:rPr>
             </w:pPr>
-            <w:proofErr w:type="spellStart"/>
             <w:r>
               <w:rPr>
                 <w:rFonts w:ascii="Arial" w:hAnsi="Arial" w:cs="Arial"/>
@@ -6050,7 +5232,6 @@
               </w:rPr>
               <w:t>id_frequencia</w:t>
             </w:r>
-            <w:proofErr w:type="spellEnd"/>
           </w:p>
         </w:tc>
         <w:tc>
@@ -6159,7 +5340,6 @@
                 <w:rFonts w:ascii="Arial" w:hAnsi="Arial" w:cs="Arial"/>
               </w:rPr>
             </w:pPr>
-            <w:proofErr w:type="spellStart"/>
             <w:r>
               <w:rPr>
                 <w:rFonts w:ascii="Arial" w:hAnsi="Arial" w:cs="Arial"/>
@@ -6167,7 +5347,6 @@
               </w:rPr>
               <w:t>data_entrada</w:t>
             </w:r>
-            <w:proofErr w:type="spellEnd"/>
           </w:p>
         </w:tc>
         <w:tc>
@@ -6247,23 +5426,7 @@
                 <w:rFonts w:ascii="Arial" w:hAnsi="Arial" w:cs="Arial"/>
                 <w:sz w:val="16"/>
               </w:rPr>
-              <w:t xml:space="preserve">Data da entrada </w:t>
-            </w:r>
-            <w:proofErr w:type="spellStart"/>
-            <w:r>
-              <w:rPr>
-                <w:rFonts w:ascii="Arial" w:hAnsi="Arial" w:cs="Arial"/>
-                <w:sz w:val="16"/>
-              </w:rPr>
-              <w:t>registrada</w:t>
-            </w:r>
-            <w:proofErr w:type="spellEnd"/>
-            <w:r>
-              <w:rPr>
-                <w:rFonts w:ascii="Arial" w:hAnsi="Arial" w:cs="Arial"/>
-                <w:sz w:val="16"/>
-              </w:rPr>
-              <w:t>.</w:t>
+              <w:t>Data da entrada registrada.</w:t>
             </w:r>
           </w:p>
         </w:tc>
@@ -6290,7 +5453,6 @@
                 <w:rFonts w:ascii="Arial" w:hAnsi="Arial" w:cs="Arial"/>
               </w:rPr>
             </w:pPr>
-            <w:proofErr w:type="spellStart"/>
             <w:r>
               <w:rPr>
                 <w:rFonts w:ascii="Arial" w:hAnsi="Arial" w:cs="Arial"/>
@@ -6298,7 +5460,6 @@
               </w:rPr>
               <w:t>hora_entrada</w:t>
             </w:r>
-            <w:proofErr w:type="spellEnd"/>
           </w:p>
         </w:tc>
         <w:tc>
@@ -6373,37 +5534,12 @@
                 <w:rFonts w:ascii="Arial" w:hAnsi="Arial" w:cs="Arial"/>
               </w:rPr>
             </w:pPr>
-            <w:proofErr w:type="spellStart"/>
-            <w:r>
-              <w:rPr>
-                <w:rFonts w:ascii="Arial" w:hAnsi="Arial" w:cs="Arial"/>
-                <w:sz w:val="16"/>
-              </w:rPr>
-              <w:t>Horário</w:t>
-            </w:r>
-            <w:proofErr w:type="spellEnd"/>
-            <w:r>
-              <w:rPr>
-                <w:rFonts w:ascii="Arial" w:hAnsi="Arial" w:cs="Arial"/>
-                <w:sz w:val="16"/>
-              </w:rPr>
-              <w:t xml:space="preserve"> da entrada </w:t>
-            </w:r>
-            <w:proofErr w:type="spellStart"/>
-            <w:r>
-              <w:rPr>
-                <w:rFonts w:ascii="Arial" w:hAnsi="Arial" w:cs="Arial"/>
-                <w:sz w:val="16"/>
-              </w:rPr>
-              <w:t>registrada</w:t>
-            </w:r>
-            <w:proofErr w:type="spellEnd"/>
-            <w:r>
-              <w:rPr>
-                <w:rFonts w:ascii="Arial" w:hAnsi="Arial" w:cs="Arial"/>
-                <w:sz w:val="16"/>
-              </w:rPr>
-              <w:t>.</w:t>
+            <w:r>
+              <w:rPr>
+                <w:rFonts w:ascii="Arial" w:hAnsi="Arial" w:cs="Arial"/>
+                <w:sz w:val="16"/>
+              </w:rPr>
+              <w:t>Horário da entrada registrada.</w:t>
             </w:r>
           </w:p>
         </w:tc>
@@ -6430,7 +5566,6 @@
                 <w:rFonts w:ascii="Arial" w:hAnsi="Arial" w:cs="Arial"/>
               </w:rPr>
             </w:pPr>
-            <w:proofErr w:type="spellStart"/>
             <w:r>
               <w:rPr>
                 <w:rFonts w:ascii="Arial" w:hAnsi="Arial" w:cs="Arial"/>
@@ -6438,7 +5573,6 @@
               </w:rPr>
               <w:t>codigo_aluno</w:t>
             </w:r>
-            <w:proofErr w:type="spellEnd"/>
           </w:p>
         </w:tc>
         <w:tc>
@@ -6491,39 +5625,7 @@
                 <w:rFonts w:ascii="Arial" w:hAnsi="Arial" w:cs="Arial"/>
                 <w:sz w:val="16"/>
               </w:rPr>
-              <w:t xml:space="preserve">NOT NULL; FK → </w:t>
-            </w:r>
-            <w:proofErr w:type="spellStart"/>
-            <w:r>
-              <w:rPr>
-                <w:rFonts w:ascii="Arial" w:hAnsi="Arial" w:cs="Arial"/>
-                <w:sz w:val="16"/>
-              </w:rPr>
-              <w:t>Aluno</w:t>
-            </w:r>
-            <w:proofErr w:type="spellEnd"/>
-            <w:r>
-              <w:rPr>
-                <w:rFonts w:ascii="Arial" w:hAnsi="Arial" w:cs="Arial"/>
-                <w:sz w:val="16"/>
-              </w:rPr>
-              <w:t>(</w:t>
-            </w:r>
-            <w:proofErr w:type="spellStart"/>
-            <w:r>
-              <w:rPr>
-                <w:rFonts w:ascii="Arial" w:hAnsi="Arial" w:cs="Arial"/>
-                <w:sz w:val="16"/>
-              </w:rPr>
-              <w:t>id_aluno</w:t>
-            </w:r>
-            <w:proofErr w:type="spellEnd"/>
-            <w:r>
-              <w:rPr>
-                <w:rFonts w:ascii="Arial" w:hAnsi="Arial" w:cs="Arial"/>
-                <w:sz w:val="16"/>
-              </w:rPr>
-              <w:t>)</w:t>
+              <w:t>NOT NULL; FK → Aluno(id_aluno)</w:t>
             </w:r>
           </w:p>
         </w:tc>
@@ -6650,7 +5752,6 @@
                 <w:rFonts w:ascii="Arial" w:hAnsi="Arial" w:cs="Arial"/>
               </w:rPr>
             </w:pPr>
-            <w:proofErr w:type="spellStart"/>
             <w:r>
               <w:rPr>
                 <w:rFonts w:ascii="Arial" w:hAnsi="Arial" w:cs="Arial"/>
@@ -6659,7 +5760,6 @@
               </w:rPr>
               <w:t>Coluna</w:t>
             </w:r>
-            <w:proofErr w:type="spellEnd"/>
           </w:p>
         </w:tc>
         <w:tc>
@@ -6686,25 +5786,7 @@
                 <w:b/>
                 <w:sz w:val="16"/>
               </w:rPr>
-              <w:t>Tipo (</w:t>
-            </w:r>
-            <w:proofErr w:type="spellStart"/>
-            <w:r>
-              <w:rPr>
-                <w:rFonts w:ascii="Arial" w:hAnsi="Arial" w:cs="Arial"/>
-                <w:b/>
-                <w:sz w:val="16"/>
-              </w:rPr>
-              <w:t>tamanho</w:t>
-            </w:r>
-            <w:proofErr w:type="spellEnd"/>
-            <w:r>
-              <w:rPr>
-                <w:rFonts w:ascii="Arial" w:hAnsi="Arial" w:cs="Arial"/>
-                <w:b/>
-                <w:sz w:val="16"/>
-              </w:rPr>
-              <w:t>)</w:t>
+              <w:t>Tipo (tamanho)</w:t>
             </w:r>
           </w:p>
         </w:tc>
@@ -6754,7 +5836,6 @@
                 <w:rFonts w:ascii="Arial" w:hAnsi="Arial" w:cs="Arial"/>
               </w:rPr>
             </w:pPr>
-            <w:proofErr w:type="spellStart"/>
             <w:r>
               <w:rPr>
                 <w:rFonts w:ascii="Arial" w:hAnsi="Arial" w:cs="Arial"/>
@@ -6763,7 +5844,6 @@
               </w:rPr>
               <w:t>Descrição</w:t>
             </w:r>
-            <w:proofErr w:type="spellEnd"/>
           </w:p>
         </w:tc>
       </w:tr>
@@ -6789,7 +5869,6 @@
                 <w:rFonts w:ascii="Arial" w:hAnsi="Arial" w:cs="Arial"/>
               </w:rPr>
             </w:pPr>
-            <w:proofErr w:type="spellStart"/>
             <w:r>
               <w:rPr>
                 <w:rFonts w:ascii="Arial" w:hAnsi="Arial" w:cs="Arial"/>
@@ -6797,7 +5876,6 @@
               </w:rPr>
               <w:t>id_inscreve</w:t>
             </w:r>
-            <w:proofErr w:type="spellEnd"/>
           </w:p>
         </w:tc>
         <w:tc>
@@ -6872,53 +5950,12 @@
                 <w:rFonts w:ascii="Arial" w:hAnsi="Arial" w:cs="Arial"/>
               </w:rPr>
             </w:pPr>
-            <w:proofErr w:type="spellStart"/>
-            <w:r>
-              <w:rPr>
-                <w:rFonts w:ascii="Arial" w:hAnsi="Arial" w:cs="Arial"/>
-                <w:sz w:val="16"/>
-              </w:rPr>
-              <w:t>Identificador</w:t>
-            </w:r>
-            <w:proofErr w:type="spellEnd"/>
-            <w:r>
-              <w:rPr>
-                <w:rFonts w:ascii="Arial" w:hAnsi="Arial" w:cs="Arial"/>
-                <w:sz w:val="16"/>
-              </w:rPr>
-              <w:t xml:space="preserve"> </w:t>
-            </w:r>
-            <w:proofErr w:type="spellStart"/>
-            <w:r>
-              <w:rPr>
-                <w:rFonts w:ascii="Arial" w:hAnsi="Arial" w:cs="Arial"/>
-                <w:sz w:val="16"/>
-              </w:rPr>
-              <w:t>único</w:t>
-            </w:r>
-            <w:proofErr w:type="spellEnd"/>
-            <w:r>
-              <w:rPr>
-                <w:rFonts w:ascii="Arial" w:hAnsi="Arial" w:cs="Arial"/>
-                <w:sz w:val="16"/>
-              </w:rPr>
-              <w:t xml:space="preserve"> da </w:t>
-            </w:r>
-            <w:proofErr w:type="spellStart"/>
-            <w:r>
-              <w:rPr>
-                <w:rFonts w:ascii="Arial" w:hAnsi="Arial" w:cs="Arial"/>
-                <w:sz w:val="16"/>
-              </w:rPr>
-              <w:t>inscrição</w:t>
-            </w:r>
-            <w:proofErr w:type="spellEnd"/>
-            <w:r>
-              <w:rPr>
-                <w:rFonts w:ascii="Arial" w:hAnsi="Arial" w:cs="Arial"/>
-                <w:sz w:val="16"/>
-              </w:rPr>
-              <w:t>.</w:t>
+            <w:r>
+              <w:rPr>
+                <w:rFonts w:ascii="Arial" w:hAnsi="Arial" w:cs="Arial"/>
+                <w:sz w:val="16"/>
+              </w:rPr>
+              <w:t>Identificador único da inscrição.</w:t>
             </w:r>
           </w:p>
         </w:tc>
@@ -6945,7 +5982,6 @@
                 <w:rFonts w:ascii="Arial" w:hAnsi="Arial" w:cs="Arial"/>
               </w:rPr>
             </w:pPr>
-            <w:proofErr w:type="spellStart"/>
             <w:r>
               <w:rPr>
                 <w:rFonts w:ascii="Arial" w:hAnsi="Arial" w:cs="Arial"/>
@@ -6953,7 +5989,6 @@
               </w:rPr>
               <w:t>codigo_aluno</w:t>
             </w:r>
-            <w:proofErr w:type="spellEnd"/>
           </w:p>
         </w:tc>
         <w:tc>
@@ -7006,39 +6041,7 @@
                 <w:rFonts w:ascii="Arial" w:hAnsi="Arial" w:cs="Arial"/>
                 <w:sz w:val="16"/>
               </w:rPr>
-              <w:t xml:space="preserve">NOT NULL; FK → </w:t>
-            </w:r>
-            <w:proofErr w:type="spellStart"/>
-            <w:r>
-              <w:rPr>
-                <w:rFonts w:ascii="Arial" w:hAnsi="Arial" w:cs="Arial"/>
-                <w:sz w:val="16"/>
-              </w:rPr>
-              <w:t>Aluno</w:t>
-            </w:r>
-            <w:proofErr w:type="spellEnd"/>
-            <w:r>
-              <w:rPr>
-                <w:rFonts w:ascii="Arial" w:hAnsi="Arial" w:cs="Arial"/>
-                <w:sz w:val="16"/>
-              </w:rPr>
-              <w:t>(</w:t>
-            </w:r>
-            <w:proofErr w:type="spellStart"/>
-            <w:r>
-              <w:rPr>
-                <w:rFonts w:ascii="Arial" w:hAnsi="Arial" w:cs="Arial"/>
-                <w:sz w:val="16"/>
-              </w:rPr>
-              <w:t>id_aluno</w:t>
-            </w:r>
-            <w:proofErr w:type="spellEnd"/>
-            <w:r>
-              <w:rPr>
-                <w:rFonts w:ascii="Arial" w:hAnsi="Arial" w:cs="Arial"/>
-                <w:sz w:val="16"/>
-              </w:rPr>
-              <w:t>)</w:t>
+              <w:t>NOT NULL; FK → Aluno(id_aluno)</w:t>
             </w:r>
           </w:p>
         </w:tc>
@@ -7060,53 +6063,12 @@
                 <w:rFonts w:ascii="Arial" w:hAnsi="Arial" w:cs="Arial"/>
               </w:rPr>
             </w:pPr>
-            <w:proofErr w:type="spellStart"/>
-            <w:r>
-              <w:rPr>
-                <w:rFonts w:ascii="Arial" w:hAnsi="Arial" w:cs="Arial"/>
-                <w:sz w:val="16"/>
-              </w:rPr>
-              <w:t>Identifica</w:t>
-            </w:r>
-            <w:proofErr w:type="spellEnd"/>
-            <w:r>
-              <w:rPr>
-                <w:rFonts w:ascii="Arial" w:hAnsi="Arial" w:cs="Arial"/>
-                <w:sz w:val="16"/>
-              </w:rPr>
-              <w:t xml:space="preserve"> o </w:t>
-            </w:r>
-            <w:proofErr w:type="spellStart"/>
-            <w:r>
-              <w:rPr>
-                <w:rFonts w:ascii="Arial" w:hAnsi="Arial" w:cs="Arial"/>
-                <w:sz w:val="16"/>
-              </w:rPr>
-              <w:t>aluno</w:t>
-            </w:r>
-            <w:proofErr w:type="spellEnd"/>
-            <w:r>
-              <w:rPr>
-                <w:rFonts w:ascii="Arial" w:hAnsi="Arial" w:cs="Arial"/>
-                <w:sz w:val="16"/>
-              </w:rPr>
-              <w:t xml:space="preserve"> </w:t>
-            </w:r>
-            <w:proofErr w:type="spellStart"/>
-            <w:r>
-              <w:rPr>
-                <w:rFonts w:ascii="Arial" w:hAnsi="Arial" w:cs="Arial"/>
-                <w:sz w:val="16"/>
-              </w:rPr>
-              <w:t>inscrito</w:t>
-            </w:r>
-            <w:proofErr w:type="spellEnd"/>
-            <w:r>
-              <w:rPr>
-                <w:rFonts w:ascii="Arial" w:hAnsi="Arial" w:cs="Arial"/>
-                <w:sz w:val="16"/>
-              </w:rPr>
-              <w:t>.</w:t>
+            <w:r>
+              <w:rPr>
+                <w:rFonts w:ascii="Arial" w:hAnsi="Arial" w:cs="Arial"/>
+                <w:sz w:val="16"/>
+              </w:rPr>
+              <w:t>Identifica o aluno inscrito.</w:t>
             </w:r>
           </w:p>
         </w:tc>
@@ -7133,7 +6095,6 @@
                 <w:rFonts w:ascii="Arial" w:hAnsi="Arial" w:cs="Arial"/>
               </w:rPr>
             </w:pPr>
-            <w:proofErr w:type="spellStart"/>
             <w:r>
               <w:rPr>
                 <w:rFonts w:ascii="Arial" w:hAnsi="Arial" w:cs="Arial"/>
@@ -7141,7 +6102,6 @@
               </w:rPr>
               <w:t>codigo_aula</w:t>
             </w:r>
-            <w:proofErr w:type="spellEnd"/>
           </w:p>
         </w:tc>
         <w:tc>
@@ -7194,23 +6154,7 @@
                 <w:rFonts w:ascii="Arial" w:hAnsi="Arial" w:cs="Arial"/>
                 <w:sz w:val="16"/>
               </w:rPr>
-              <w:t>NOT NULL; FK → Aula(</w:t>
-            </w:r>
-            <w:proofErr w:type="spellStart"/>
-            <w:r>
-              <w:rPr>
-                <w:rFonts w:ascii="Arial" w:hAnsi="Arial" w:cs="Arial"/>
-                <w:sz w:val="16"/>
-              </w:rPr>
-              <w:t>id_aula</w:t>
-            </w:r>
-            <w:proofErr w:type="spellEnd"/>
-            <w:r>
-              <w:rPr>
-                <w:rFonts w:ascii="Arial" w:hAnsi="Arial" w:cs="Arial"/>
-                <w:sz w:val="16"/>
-              </w:rPr>
-              <w:t>)</w:t>
+              <w:t>NOT NULL; FK → Aula(id_aula)</w:t>
             </w:r>
           </w:p>
         </w:tc>
@@ -7262,21 +6206,7 @@
         <w:rPr>
           <w:rFonts w:ascii="Arial" w:hAnsi="Arial" w:cs="Arial"/>
         </w:rPr>
-        <w:t xml:space="preserve">Nota: “—” indica ausência de restrição adicional explícita no CREATE TABLE. Os tipos e as </w:t>
-      </w:r>
-      <w:proofErr w:type="spellStart"/>
-      <w:r>
-        <w:rPr>
-          <w:rFonts w:ascii="Arial" w:hAnsi="Arial" w:cs="Arial"/>
-        </w:rPr>
-        <w:t>constraints</w:t>
-      </w:r>
-      <w:proofErr w:type="spellEnd"/>
-      <w:r>
-        <w:rPr>
-          <w:rFonts w:ascii="Arial" w:hAnsi="Arial" w:cs="Arial"/>
-        </w:rPr>
-        <w:t xml:space="preserve"> foram transcritos dos scripts SQL fornecidos; confira sua correspondência com o dicionário de dados previamente aprovado pelo grupo.</w:t>
+        <w:t>Nota: “—” indica ausência de restrição adicional explícita no CREATE TABLE. Os tipos e as constraints foram transcritos dos scripts SQL fornecidos; confira sua correspondência com o dicionário de dados previamente aprovado pelo grupo.</w:t>
       </w:r>
     </w:p>
     <w:p/>
@@ -7290,13 +6220,8 @@
       </w:pPr>
       <w:bookmarkStart w:id="3" w:name="_heading=h.winjknv49ub7" w:colFirst="0" w:colLast="0"/>
       <w:bookmarkEnd w:id="3"/>
-      <w:proofErr w:type="spellStart"/>
-      <w:r>
-        <w:t>Sequences</w:t>
-      </w:r>
-      <w:proofErr w:type="spellEnd"/>
-      <w:r>
-        <w:t xml:space="preserve"> e Triggers </w:t>
+      <w:r>
+        <w:t xml:space="preserve">Sequences e Triggers </w:t>
       </w:r>
     </w:p>
     <w:p>
@@ -7465,14 +6390,12 @@
                 <w:rFonts w:ascii="Arial" w:eastAsia="Arial" w:hAnsi="Arial" w:cs="Arial"/>
               </w:rPr>
             </w:pPr>
-            <w:proofErr w:type="spellStart"/>
             <w:r>
               <w:rPr>
                 <w:rFonts w:ascii="Arial" w:eastAsia="Arial" w:hAnsi="Arial" w:cs="Arial"/>
               </w:rPr>
               <w:t>Seq_tabA</w:t>
             </w:r>
-            <w:proofErr w:type="spellEnd"/>
           </w:p>
         </w:tc>
         <w:tc>
@@ -7492,14 +6415,12 @@
                 <w:rFonts w:ascii="Arial" w:eastAsia="Arial" w:hAnsi="Arial" w:cs="Arial"/>
               </w:rPr>
             </w:pPr>
-            <w:proofErr w:type="spellStart"/>
             <w:r>
               <w:rPr>
                 <w:rFonts w:ascii="Arial" w:eastAsia="Arial" w:hAnsi="Arial" w:cs="Arial"/>
               </w:rPr>
               <w:t>Tg_seq_tabA</w:t>
             </w:r>
-            <w:proofErr w:type="spellEnd"/>
           </w:p>
         </w:tc>
       </w:tr>
@@ -7546,14 +6467,12 @@
                 <w:rFonts w:ascii="Arial" w:eastAsia="Arial" w:hAnsi="Arial" w:cs="Arial"/>
               </w:rPr>
             </w:pPr>
-            <w:proofErr w:type="spellStart"/>
             <w:r>
               <w:rPr>
                 <w:rFonts w:ascii="Arial" w:eastAsia="Arial" w:hAnsi="Arial" w:cs="Arial"/>
               </w:rPr>
               <w:t>Seq_tabB</w:t>
             </w:r>
-            <w:proofErr w:type="spellEnd"/>
           </w:p>
         </w:tc>
         <w:tc>
@@ -7573,14 +6492,12 @@
                 <w:rFonts w:ascii="Arial" w:eastAsia="Arial" w:hAnsi="Arial" w:cs="Arial"/>
               </w:rPr>
             </w:pPr>
-            <w:proofErr w:type="spellStart"/>
             <w:r>
               <w:rPr>
                 <w:rFonts w:ascii="Arial" w:eastAsia="Arial" w:hAnsi="Arial" w:cs="Arial"/>
               </w:rPr>
               <w:t>Tg_seq_tabB</w:t>
             </w:r>
-            <w:proofErr w:type="spellEnd"/>
           </w:p>
         </w:tc>
       </w:tr>
@@ -7627,14 +6544,12 @@
                 <w:rFonts w:ascii="Arial" w:eastAsia="Arial" w:hAnsi="Arial" w:cs="Arial"/>
               </w:rPr>
             </w:pPr>
-            <w:proofErr w:type="spellStart"/>
             <w:r>
               <w:rPr>
                 <w:rFonts w:ascii="Arial" w:eastAsia="Arial" w:hAnsi="Arial" w:cs="Arial"/>
               </w:rPr>
               <w:t>Seq_tabC</w:t>
             </w:r>
-            <w:proofErr w:type="spellEnd"/>
           </w:p>
         </w:tc>
         <w:tc>
@@ -7654,14 +6569,12 @@
                 <w:rFonts w:ascii="Arial" w:eastAsia="Arial" w:hAnsi="Arial" w:cs="Arial"/>
               </w:rPr>
             </w:pPr>
-            <w:proofErr w:type="spellStart"/>
             <w:r>
               <w:rPr>
                 <w:rFonts w:ascii="Arial" w:eastAsia="Arial" w:hAnsi="Arial" w:cs="Arial"/>
               </w:rPr>
               <w:t>Tg_seq_tabC</w:t>
             </w:r>
-            <w:proofErr w:type="spellEnd"/>
           </w:p>
         </w:tc>
       </w:tr>
@@ -7708,14 +6621,12 @@
                 <w:rFonts w:ascii="Arial" w:eastAsia="Arial" w:hAnsi="Arial" w:cs="Arial"/>
               </w:rPr>
             </w:pPr>
-            <w:proofErr w:type="spellStart"/>
             <w:r>
               <w:rPr>
                 <w:rFonts w:ascii="Arial" w:eastAsia="Arial" w:hAnsi="Arial" w:cs="Arial"/>
               </w:rPr>
               <w:t>Seq_tabD</w:t>
             </w:r>
-            <w:proofErr w:type="spellEnd"/>
           </w:p>
         </w:tc>
         <w:tc>
@@ -7735,14 +6646,12 @@
                 <w:rFonts w:ascii="Arial" w:eastAsia="Arial" w:hAnsi="Arial" w:cs="Arial"/>
               </w:rPr>
             </w:pPr>
-            <w:proofErr w:type="spellStart"/>
             <w:r>
               <w:rPr>
                 <w:rFonts w:ascii="Arial" w:eastAsia="Arial" w:hAnsi="Arial" w:cs="Arial"/>
               </w:rPr>
               <w:t>Tg_seq_tabD</w:t>
             </w:r>
-            <w:proofErr w:type="spellEnd"/>
           </w:p>
         </w:tc>
       </w:tr>
@@ -7768,6 +6677,7 @@
               <w:rPr>
                 <w:rFonts w:ascii="Arial" w:eastAsia="Arial" w:hAnsi="Arial" w:cs="Arial"/>
               </w:rPr>
+              <w:lastRenderedPageBreak/>
               <w:t>Tabela E</w:t>
             </w:r>
           </w:p>
@@ -7789,14 +6699,12 @@
                 <w:rFonts w:ascii="Arial" w:eastAsia="Arial" w:hAnsi="Arial" w:cs="Arial"/>
               </w:rPr>
             </w:pPr>
-            <w:proofErr w:type="spellStart"/>
             <w:r>
               <w:rPr>
                 <w:rFonts w:ascii="Arial" w:eastAsia="Arial" w:hAnsi="Arial" w:cs="Arial"/>
               </w:rPr>
               <w:t>Seq_tabE</w:t>
             </w:r>
-            <w:proofErr w:type="spellEnd"/>
           </w:p>
         </w:tc>
         <w:tc>
@@ -7816,14 +6724,12 @@
                 <w:rFonts w:ascii="Arial" w:eastAsia="Arial" w:hAnsi="Arial" w:cs="Arial"/>
               </w:rPr>
             </w:pPr>
-            <w:proofErr w:type="spellStart"/>
             <w:r>
               <w:rPr>
                 <w:rFonts w:ascii="Arial" w:eastAsia="Arial" w:hAnsi="Arial" w:cs="Arial"/>
               </w:rPr>
               <w:t>Tg_seq_tabE</w:t>
             </w:r>
-            <w:proofErr w:type="spellEnd"/>
           </w:p>
         </w:tc>
       </w:tr>
@@ -7870,14 +6776,12 @@
                 <w:rFonts w:ascii="Arial" w:eastAsia="Arial" w:hAnsi="Arial" w:cs="Arial"/>
               </w:rPr>
             </w:pPr>
-            <w:proofErr w:type="spellStart"/>
             <w:r>
               <w:rPr>
                 <w:rFonts w:ascii="Arial" w:eastAsia="Arial" w:hAnsi="Arial" w:cs="Arial"/>
               </w:rPr>
               <w:t>Seq_tabF</w:t>
             </w:r>
-            <w:proofErr w:type="spellEnd"/>
           </w:p>
         </w:tc>
         <w:tc>
@@ -7897,14 +6801,12 @@
                 <w:rFonts w:ascii="Arial" w:eastAsia="Arial" w:hAnsi="Arial" w:cs="Arial"/>
               </w:rPr>
             </w:pPr>
-            <w:proofErr w:type="spellStart"/>
             <w:r>
               <w:rPr>
                 <w:rFonts w:ascii="Arial" w:eastAsia="Arial" w:hAnsi="Arial" w:cs="Arial"/>
               </w:rPr>
               <w:t>Tg_seq_tabF</w:t>
             </w:r>
-            <w:proofErr w:type="spellEnd"/>
           </w:p>
         </w:tc>
       </w:tr>
@@ -7951,14 +6853,12 @@
                 <w:rFonts w:ascii="Arial" w:eastAsia="Arial" w:hAnsi="Arial" w:cs="Arial"/>
               </w:rPr>
             </w:pPr>
-            <w:proofErr w:type="spellStart"/>
             <w:r>
               <w:rPr>
                 <w:rFonts w:ascii="Arial" w:eastAsia="Arial" w:hAnsi="Arial" w:cs="Arial"/>
               </w:rPr>
               <w:t>Seq_tabG</w:t>
             </w:r>
-            <w:proofErr w:type="spellEnd"/>
           </w:p>
         </w:tc>
         <w:tc>
@@ -7978,14 +6878,12 @@
                 <w:rFonts w:ascii="Arial" w:eastAsia="Arial" w:hAnsi="Arial" w:cs="Arial"/>
               </w:rPr>
             </w:pPr>
-            <w:proofErr w:type="spellStart"/>
             <w:r>
               <w:rPr>
                 <w:rFonts w:ascii="Arial" w:eastAsia="Arial" w:hAnsi="Arial" w:cs="Arial"/>
               </w:rPr>
               <w:t>Tg_seq_tabG</w:t>
             </w:r>
-            <w:proofErr w:type="spellEnd"/>
           </w:p>
         </w:tc>
       </w:tr>
@@ -8033,15 +6931,7 @@
       <w:bookmarkStart w:id="5" w:name="_heading=h.8p2prbopty5g" w:colFirst="0" w:colLast="0"/>
       <w:bookmarkEnd w:id="5"/>
       <w:r>
-        <w:t xml:space="preserve">Modelo Relacional para Tabela de </w:t>
-      </w:r>
-      <w:proofErr w:type="spellStart"/>
-      <w:r>
-        <w:t>Historiamento</w:t>
-      </w:r>
-      <w:proofErr w:type="spellEnd"/>
-      <w:r>
-        <w:t xml:space="preserve"> </w:t>
+        <w:t xml:space="preserve">Modelo Relacional para Tabela de Historiamento </w:t>
       </w:r>
     </w:p>
     <w:p>
@@ -8081,16 +6971,8 @@
         <w:rPr>
           <w:lang w:val="en-US"/>
         </w:rPr>
-        <w:t xml:space="preserve">Triggers, Stored Procedures e Functions de </w:t>
-      </w:r>
-      <w:proofErr w:type="spellStart"/>
-      <w:r>
-        <w:rPr>
-          <w:lang w:val="en-US"/>
-        </w:rPr>
-        <w:t>Historimanto</w:t>
-      </w:r>
-      <w:proofErr w:type="spellEnd"/>
+        <w:t>Triggers, Stored Procedures e Functions de Historimanto</w:t>
+      </w:r>
     </w:p>
     <w:p>
       <w:pPr>
@@ -8233,13 +7115,8 @@
       <w:bookmarkEnd w:id="10"/>
       <w:r>
         <w:lastRenderedPageBreak/>
-        <w:t xml:space="preserve">Tabela </w:t>
-      </w:r>
-      <w:proofErr w:type="spellStart"/>
-      <w:r>
-        <w:t>Stage</w:t>
-      </w:r>
-      <w:proofErr w:type="spellEnd"/>
+        <w:t>Tabela Stage</w:t>
+      </w:r>
     </w:p>
     <w:p>
       <w:pPr>
@@ -8252,95 +7129,20 @@
       <w:bookmarkStart w:id="11" w:name="_heading=h.cfdafxd7e2wh" w:colFirst="0" w:colLast="0"/>
       <w:bookmarkEnd w:id="11"/>
       <w:r>
-        <w:t xml:space="preserve">Tabela </w:t>
-      </w:r>
-      <w:proofErr w:type="spellStart"/>
-      <w:r>
-        <w:t>Stage</w:t>
-      </w:r>
-      <w:proofErr w:type="spellEnd"/>
-    </w:p>
-    <w:p>
-      <w:pPr>
-        <w:rPr>
-          <w:rFonts w:ascii="Arial" w:eastAsia="Arial" w:hAnsi="Arial" w:cs="Arial"/>
-        </w:rPr>
-      </w:pPr>
-      <w:r>
-        <w:rPr>
-          <w:rFonts w:ascii="Arial" w:eastAsia="Arial" w:hAnsi="Arial" w:cs="Arial"/>
-        </w:rPr>
-        <w:t xml:space="preserve">&lt;&lt;Nesta seção, inserir a especificação da tabela </w:t>
-      </w:r>
-      <w:proofErr w:type="spellStart"/>
-      <w:r>
-        <w:rPr>
-          <w:rFonts w:ascii="Arial" w:eastAsia="Arial" w:hAnsi="Arial" w:cs="Arial"/>
-        </w:rPr>
-        <w:t>stage</w:t>
-      </w:r>
-      <w:proofErr w:type="spellEnd"/>
-      <w:r>
-        <w:rPr>
-          <w:rFonts w:ascii="Arial" w:eastAsia="Arial" w:hAnsi="Arial" w:cs="Arial"/>
-        </w:rPr>
-        <w:t xml:space="preserve"> de seu projeto. A </w:t>
-      </w:r>
-      <w:proofErr w:type="spellStart"/>
-      <w:r>
-        <w:rPr>
-          <w:rFonts w:ascii="Arial" w:eastAsia="Arial" w:hAnsi="Arial" w:cs="Arial"/>
-        </w:rPr>
-        <w:t>stage</w:t>
-      </w:r>
-      <w:proofErr w:type="spellEnd"/>
-      <w:r>
-        <w:rPr>
-          <w:rFonts w:ascii="Arial" w:eastAsia="Arial" w:hAnsi="Arial" w:cs="Arial"/>
-        </w:rPr>
-        <w:t xml:space="preserve"> é uma tabela intermediária entre o mundo transacional e o banco de data </w:t>
-      </w:r>
-      <w:proofErr w:type="spellStart"/>
-      <w:r>
-        <w:rPr>
-          <w:rFonts w:ascii="Arial" w:eastAsia="Arial" w:hAnsi="Arial" w:cs="Arial"/>
-        </w:rPr>
-        <w:t>warehouse</w:t>
-      </w:r>
-      <w:proofErr w:type="spellEnd"/>
-      <w:r>
-        <w:rPr>
-          <w:rFonts w:ascii="Arial" w:eastAsia="Arial" w:hAnsi="Arial" w:cs="Arial"/>
-        </w:rPr>
-        <w:t xml:space="preserve">. Este tópico deve conter uma tabela semelhante ao dicionário de dados, com a especificação de cada campo da tabela de </w:t>
-      </w:r>
-      <w:proofErr w:type="spellStart"/>
-      <w:r>
-        <w:rPr>
-          <w:rFonts w:ascii="Arial" w:eastAsia="Arial" w:hAnsi="Arial" w:cs="Arial"/>
-        </w:rPr>
-        <w:t>stage</w:t>
-      </w:r>
-      <w:proofErr w:type="spellEnd"/>
-      <w:r>
-        <w:rPr>
-          <w:rFonts w:ascii="Arial" w:eastAsia="Arial" w:hAnsi="Arial" w:cs="Arial"/>
-        </w:rPr>
-        <w:t xml:space="preserve"> e, quando aplicável, deve ser especificada a transformação que foi feita nos dados de origem antes de persistir o dado na </w:t>
-      </w:r>
-      <w:proofErr w:type="spellStart"/>
-      <w:r>
-        <w:rPr>
-          <w:rFonts w:ascii="Arial" w:eastAsia="Arial" w:hAnsi="Arial" w:cs="Arial"/>
-        </w:rPr>
-        <w:t>stage</w:t>
-      </w:r>
-      <w:proofErr w:type="spellEnd"/>
-      <w:r>
-        <w:rPr>
-          <w:rFonts w:ascii="Arial" w:eastAsia="Arial" w:hAnsi="Arial" w:cs="Arial"/>
-        </w:rPr>
-        <w:t>.&gt;&gt;</w:t>
+        <w:t>Tabela Stage</w:t>
+      </w:r>
+    </w:p>
+    <w:p>
+      <w:pPr>
+        <w:rPr>
+          <w:rFonts w:ascii="Arial" w:eastAsia="Arial" w:hAnsi="Arial" w:cs="Arial"/>
+        </w:rPr>
+      </w:pPr>
+      <w:r>
+        <w:rPr>
+          <w:rFonts w:ascii="Arial" w:eastAsia="Arial" w:hAnsi="Arial" w:cs="Arial"/>
+        </w:rPr>
+        <w:t>&lt;&lt;Nesta seção, inserir a especificação da tabela stage de seu projeto. A stage é uma tabela intermediária entre o mundo transacional e o banco de data warehouse. Este tópico deve conter uma tabela semelhante ao dicionário de dados, com a especificação de cada campo da tabela de stage e, quando aplicável, deve ser especificada a transformação que foi feita nos dados de origem antes de persistir o dado na stage.&gt;&gt;</w:t>
       </w:r>
     </w:p>
     <w:p>
@@ -8359,27 +7161,7 @@
           <w:bCs/>
           <w:u w:val="single"/>
         </w:rPr>
-        <w:t xml:space="preserve">Tabela </w:t>
-      </w:r>
-      <w:proofErr w:type="spellStart"/>
-      <w:r>
-        <w:rPr>
-          <w:rFonts w:ascii="Arial" w:eastAsia="Arial" w:hAnsi="Arial" w:cs="Arial"/>
-          <w:b/>
-          <w:bCs/>
-          <w:u w:val="single"/>
-        </w:rPr>
-        <w:t>Stage</w:t>
-      </w:r>
-      <w:proofErr w:type="spellEnd"/>
-      <w:r>
-        <w:rPr>
-          <w:rFonts w:ascii="Arial" w:eastAsia="Arial" w:hAnsi="Arial" w:cs="Arial"/>
-          <w:b/>
-          <w:bCs/>
-          <w:u w:val="single"/>
-        </w:rPr>
-        <w:t>:</w:t>
+        <w:t>Tabela Stage:</w:t>
       </w:r>
     </w:p>
     <w:p>
@@ -8497,7 +7279,6 @@
                 <w:bCs/>
               </w:rPr>
             </w:pPr>
-            <w:proofErr w:type="spellStart"/>
             <w:r>
               <w:rPr>
                 <w:rFonts w:ascii="Arial" w:eastAsia="Arial" w:hAnsi="Arial" w:cs="Arial"/>
@@ -8506,7 +7287,6 @@
               </w:rPr>
               <w:t>Constraints</w:t>
             </w:r>
-            <w:proofErr w:type="spellEnd"/>
           </w:p>
         </w:tc>
         <w:tc>
@@ -8644,21 +7424,7 @@
               <w:rPr>
                 <w:rFonts w:ascii="Arial" w:eastAsia="Arial" w:hAnsi="Arial" w:cs="Arial"/>
               </w:rPr>
-              <w:t>Tipo (</w:t>
-            </w:r>
-            <w:proofErr w:type="spellStart"/>
-            <w:r>
-              <w:rPr>
-                <w:rFonts w:ascii="Arial" w:eastAsia="Arial" w:hAnsi="Arial" w:cs="Arial"/>
-              </w:rPr>
-              <w:t>tam</w:t>
-            </w:r>
-            <w:proofErr w:type="spellEnd"/>
-            <w:r>
-              <w:rPr>
-                <w:rFonts w:ascii="Arial" w:eastAsia="Arial" w:hAnsi="Arial" w:cs="Arial"/>
-              </w:rPr>
-              <w:t>)</w:t>
+              <w:t>Tipo (tam)</w:t>
             </w:r>
           </w:p>
         </w:tc>
@@ -8683,44 +7449,8 @@
               <w:rPr>
                 <w:rFonts w:ascii="Arial" w:eastAsia="Arial" w:hAnsi="Arial" w:cs="Arial"/>
               </w:rPr>
-              <w:t xml:space="preserve">PK, FK referenciando </w:t>
-            </w:r>
-            <w:proofErr w:type="spellStart"/>
-            <w:r>
-              <w:rPr>
-                <w:rFonts w:ascii="Arial" w:eastAsia="Arial" w:hAnsi="Arial" w:cs="Arial"/>
-              </w:rPr>
-              <w:t>Tabn</w:t>
-            </w:r>
-            <w:proofErr w:type="spellEnd"/>
-            <w:r>
-              <w:rPr>
-                <w:rFonts w:ascii="Arial" w:eastAsia="Arial" w:hAnsi="Arial" w:cs="Arial"/>
-              </w:rPr>
-              <w:t>(</w:t>
-            </w:r>
-            <w:proofErr w:type="spellStart"/>
-            <w:r>
-              <w:rPr>
-                <w:rFonts w:ascii="Arial" w:eastAsia="Arial" w:hAnsi="Arial" w:cs="Arial"/>
-              </w:rPr>
-              <w:t>coln</w:t>
-            </w:r>
-            <w:proofErr w:type="spellEnd"/>
-            <w:r>
-              <w:rPr>
-                <w:rFonts w:ascii="Arial" w:eastAsia="Arial" w:hAnsi="Arial" w:cs="Arial"/>
-              </w:rPr>
-              <w:t xml:space="preserve">), </w:t>
-            </w:r>
-            <w:proofErr w:type="spellStart"/>
-            <w:r>
-              <w:rPr>
-                <w:rFonts w:ascii="Arial" w:eastAsia="Arial" w:hAnsi="Arial" w:cs="Arial"/>
-              </w:rPr>
-              <w:t>etc</w:t>
-            </w:r>
-            <w:proofErr w:type="spellEnd"/>
+              <w:t>PK, FK referenciando Tabn(coln), etc</w:t>
+            </w:r>
           </w:p>
         </w:tc>
         <w:tc>
@@ -8744,21 +7474,7 @@
               <w:rPr>
                 <w:rFonts w:ascii="Arial" w:eastAsia="Arial" w:hAnsi="Arial" w:cs="Arial"/>
               </w:rPr>
-              <w:t xml:space="preserve">Esta coluna é a </w:t>
-            </w:r>
-            <w:proofErr w:type="spellStart"/>
-            <w:r>
-              <w:rPr>
-                <w:rFonts w:ascii="Arial" w:eastAsia="Arial" w:hAnsi="Arial" w:cs="Arial"/>
-              </w:rPr>
-              <w:t>pk</w:t>
-            </w:r>
-            <w:proofErr w:type="spellEnd"/>
-            <w:r>
-              <w:rPr>
-                <w:rFonts w:ascii="Arial" w:eastAsia="Arial" w:hAnsi="Arial" w:cs="Arial"/>
-              </w:rPr>
-              <w:t xml:space="preserve"> da relação</w:t>
+              <w:t>Esta coluna é a pk da relação</w:t>
             </w:r>
           </w:p>
         </w:tc>
@@ -8848,21 +7564,7 @@
               <w:rPr>
                 <w:rFonts w:ascii="Arial" w:eastAsia="Arial" w:hAnsi="Arial" w:cs="Arial"/>
               </w:rPr>
-              <w:t>Tipo (</w:t>
-            </w:r>
-            <w:proofErr w:type="spellStart"/>
-            <w:r>
-              <w:rPr>
-                <w:rFonts w:ascii="Arial" w:eastAsia="Arial" w:hAnsi="Arial" w:cs="Arial"/>
-              </w:rPr>
-              <w:t>tam</w:t>
-            </w:r>
-            <w:proofErr w:type="spellEnd"/>
-            <w:r>
-              <w:rPr>
-                <w:rFonts w:ascii="Arial" w:eastAsia="Arial" w:hAnsi="Arial" w:cs="Arial"/>
-              </w:rPr>
-              <w:t>)</w:t>
+              <w:t>Tipo (tam)</w:t>
             </w:r>
           </w:p>
         </w:tc>
@@ -8887,44 +7589,8 @@
               <w:rPr>
                 <w:rFonts w:ascii="Arial" w:eastAsia="Arial" w:hAnsi="Arial" w:cs="Arial"/>
               </w:rPr>
-              <w:t xml:space="preserve">PK, FK referenciando </w:t>
-            </w:r>
-            <w:proofErr w:type="spellStart"/>
-            <w:r>
-              <w:rPr>
-                <w:rFonts w:ascii="Arial" w:eastAsia="Arial" w:hAnsi="Arial" w:cs="Arial"/>
-              </w:rPr>
-              <w:t>Tabn</w:t>
-            </w:r>
-            <w:proofErr w:type="spellEnd"/>
-            <w:r>
-              <w:rPr>
-                <w:rFonts w:ascii="Arial" w:eastAsia="Arial" w:hAnsi="Arial" w:cs="Arial"/>
-              </w:rPr>
-              <w:t>(</w:t>
-            </w:r>
-            <w:proofErr w:type="spellStart"/>
-            <w:r>
-              <w:rPr>
-                <w:rFonts w:ascii="Arial" w:eastAsia="Arial" w:hAnsi="Arial" w:cs="Arial"/>
-              </w:rPr>
-              <w:t>coln</w:t>
-            </w:r>
-            <w:proofErr w:type="spellEnd"/>
-            <w:r>
-              <w:rPr>
-                <w:rFonts w:ascii="Arial" w:eastAsia="Arial" w:hAnsi="Arial" w:cs="Arial"/>
-              </w:rPr>
-              <w:t xml:space="preserve">), </w:t>
-            </w:r>
-            <w:proofErr w:type="spellStart"/>
-            <w:r>
-              <w:rPr>
-                <w:rFonts w:ascii="Arial" w:eastAsia="Arial" w:hAnsi="Arial" w:cs="Arial"/>
-              </w:rPr>
-              <w:t>etc</w:t>
-            </w:r>
-            <w:proofErr w:type="spellEnd"/>
+              <w:t>PK, FK referenciando Tabn(coln), etc</w:t>
+            </w:r>
           </w:p>
         </w:tc>
         <w:tc>
@@ -8948,16 +7614,8 @@
               <w:rPr>
                 <w:rFonts w:ascii="Arial" w:eastAsia="Arial" w:hAnsi="Arial" w:cs="Arial"/>
               </w:rPr>
-              <w:t xml:space="preserve">Esta coluna armazena o dado x de </w:t>
-            </w:r>
-            <w:proofErr w:type="spellStart"/>
-            <w:r>
-              <w:rPr>
-                <w:rFonts w:ascii="Arial" w:eastAsia="Arial" w:hAnsi="Arial" w:cs="Arial"/>
-              </w:rPr>
-              <w:t>lalala</w:t>
-            </w:r>
-            <w:proofErr w:type="spellEnd"/>
+              <w:t>Esta coluna armazena o dado x de lalala</w:t>
+            </w:r>
           </w:p>
         </w:tc>
         <w:tc>
@@ -9046,21 +7704,7 @@
               <w:rPr>
                 <w:rFonts w:ascii="Arial" w:eastAsia="Arial" w:hAnsi="Arial" w:cs="Arial"/>
               </w:rPr>
-              <w:t>Tipo (</w:t>
-            </w:r>
-            <w:proofErr w:type="spellStart"/>
-            <w:r>
-              <w:rPr>
-                <w:rFonts w:ascii="Arial" w:eastAsia="Arial" w:hAnsi="Arial" w:cs="Arial"/>
-              </w:rPr>
-              <w:t>tam</w:t>
-            </w:r>
-            <w:proofErr w:type="spellEnd"/>
-            <w:r>
-              <w:rPr>
-                <w:rFonts w:ascii="Arial" w:eastAsia="Arial" w:hAnsi="Arial" w:cs="Arial"/>
-              </w:rPr>
-              <w:t>)</w:t>
+              <w:t>Tipo (tam)</w:t>
             </w:r>
           </w:p>
         </w:tc>
@@ -9085,44 +7729,8 @@
               <w:rPr>
                 <w:rFonts w:ascii="Arial" w:eastAsia="Arial" w:hAnsi="Arial" w:cs="Arial"/>
               </w:rPr>
-              <w:t xml:space="preserve">PK, FK referenciando </w:t>
-            </w:r>
-            <w:proofErr w:type="spellStart"/>
-            <w:r>
-              <w:rPr>
-                <w:rFonts w:ascii="Arial" w:eastAsia="Arial" w:hAnsi="Arial" w:cs="Arial"/>
-              </w:rPr>
-              <w:t>Tabn</w:t>
-            </w:r>
-            <w:proofErr w:type="spellEnd"/>
-            <w:r>
-              <w:rPr>
-                <w:rFonts w:ascii="Arial" w:eastAsia="Arial" w:hAnsi="Arial" w:cs="Arial"/>
-              </w:rPr>
-              <w:t>(</w:t>
-            </w:r>
-            <w:proofErr w:type="spellStart"/>
-            <w:r>
-              <w:rPr>
-                <w:rFonts w:ascii="Arial" w:eastAsia="Arial" w:hAnsi="Arial" w:cs="Arial"/>
-              </w:rPr>
-              <w:t>coln</w:t>
-            </w:r>
-            <w:proofErr w:type="spellEnd"/>
-            <w:r>
-              <w:rPr>
-                <w:rFonts w:ascii="Arial" w:eastAsia="Arial" w:hAnsi="Arial" w:cs="Arial"/>
-              </w:rPr>
-              <w:t xml:space="preserve">), </w:t>
-            </w:r>
-            <w:proofErr w:type="spellStart"/>
-            <w:r>
-              <w:rPr>
-                <w:rFonts w:ascii="Arial" w:eastAsia="Arial" w:hAnsi="Arial" w:cs="Arial"/>
-              </w:rPr>
-              <w:t>etc</w:t>
-            </w:r>
-            <w:proofErr w:type="spellEnd"/>
+              <w:t>PK, FK referenciando Tabn(coln), etc</w:t>
+            </w:r>
           </w:p>
         </w:tc>
         <w:tc>
@@ -9146,16 +7754,8 @@
               <w:rPr>
                 <w:rFonts w:ascii="Arial" w:eastAsia="Arial" w:hAnsi="Arial" w:cs="Arial"/>
               </w:rPr>
-              <w:t xml:space="preserve">Esta coluna armazena o dado y de </w:t>
-            </w:r>
-            <w:proofErr w:type="spellStart"/>
-            <w:r>
-              <w:rPr>
-                <w:rFonts w:ascii="Arial" w:eastAsia="Arial" w:hAnsi="Arial" w:cs="Arial"/>
-              </w:rPr>
-              <w:t>lalala</w:t>
-            </w:r>
-            <w:proofErr w:type="spellEnd"/>
+              <w:t>Esta coluna armazena o dado y de lalala</w:t>
+            </w:r>
           </w:p>
         </w:tc>
         <w:tc>
@@ -9216,39 +7816,20 @@
       <w:bookmarkStart w:id="12" w:name="_heading=h.d33mny1ddu7u" w:colFirst="0" w:colLast="0"/>
       <w:bookmarkEnd w:id="12"/>
       <w:r>
-        <w:t xml:space="preserve">Rotina para Armazenamento de Dados na </w:t>
-      </w:r>
-      <w:proofErr w:type="spellStart"/>
-      <w:r>
-        <w:t>Stage</w:t>
-      </w:r>
-      <w:proofErr w:type="spellEnd"/>
-    </w:p>
-    <w:p>
-      <w:pPr>
-        <w:rPr>
-          <w:rFonts w:ascii="Arial" w:eastAsia="Arial" w:hAnsi="Arial" w:cs="Arial"/>
-        </w:rPr>
-      </w:pPr>
-      <w:r>
-        <w:rPr>
-          <w:rFonts w:ascii="Arial" w:eastAsia="Arial" w:hAnsi="Arial" w:cs="Arial"/>
-        </w:rPr>
-        <w:t xml:space="preserve">&lt;&lt;Nesta seção, deve ser colocado o código SQL da rotina criada para alimentar a tabela de </w:t>
-      </w:r>
-      <w:proofErr w:type="spellStart"/>
-      <w:r>
-        <w:rPr>
-          <w:rFonts w:ascii="Arial" w:eastAsia="Arial" w:hAnsi="Arial" w:cs="Arial"/>
-        </w:rPr>
-        <w:t>stage</w:t>
-      </w:r>
-      <w:proofErr w:type="spellEnd"/>
-      <w:r>
-        <w:rPr>
-          <w:rFonts w:ascii="Arial" w:eastAsia="Arial" w:hAnsi="Arial" w:cs="Arial"/>
-        </w:rPr>
-        <w:t xml:space="preserve"> do sistema.&gt;&gt;</w:t>
+        <w:t>Rotina para Armazenamento de Dados na Stage</w:t>
+      </w:r>
+    </w:p>
+    <w:p>
+      <w:pPr>
+        <w:rPr>
+          <w:rFonts w:ascii="Arial" w:eastAsia="Arial" w:hAnsi="Arial" w:cs="Arial"/>
+        </w:rPr>
+      </w:pPr>
+      <w:r>
+        <w:rPr>
+          <w:rFonts w:ascii="Arial" w:eastAsia="Arial" w:hAnsi="Arial" w:cs="Arial"/>
+        </w:rPr>
+        <w:t>&lt;&lt;Nesta seção, deve ser colocado o código SQL da rotina criada para alimentar a tabela de stage do sistema.&gt;&gt;</w:t>
       </w:r>
     </w:p>
     <w:p>

</xml_diff>